<commit_message>
Trang Meet the Founders: 6 thành viên với tên và ảnh của nhóm
Ảnh được cắt cùng khung, lưu trong magazine/assets/team. Ô ảnh của Nguyễn Minh
Triết và vai trò từng người còn để trống chờ nhóm gửi. Mã QR phỏng vấn
chuyển xuống cuối trang; bìa sau ghi tên đủ 6 người.

Co-Authored-By: Claude Opus 5.5 <noreply@anthropic.com>
Claude-Session: https://claude.ai/code/session_01Hmv4YstQBq6NRkZ7ExoLKC
</commit_message>
<xml_diff>
--- a/output/Aurora_Haven_Magazine_text.docx
+++ b/output/Aurora_Haven_Magazine_text.docx
@@ -1668,6 +1668,166 @@
       </w:r>
       <w:r>
         <w:rPr>
+          <w:b/>
+          <w:i w:val="0"/>
+        </w:rPr>
+        <w:t>Nguyễn Đông Bảo</w:t>
+      </w:r>
+    </w:p>
+    <w:p>
+      <w:r>
+        <w:rPr>
+          <w:b/>
+          <w:color w:val="4A7FC1"/>
+        </w:rPr>
+        <w:t xml:space="preserve">#5  </w:t>
+      </w:r>
+      <w:r>
+        <w:rPr>
+          <w:b/>
+          <w:i w:val="0"/>
+        </w:rPr>
+        <w:t>[Role]</w:t>
+      </w:r>
+    </w:p>
+    <w:p>
+      <w:r>
+        <w:rPr>
+          <w:b/>
+          <w:color w:val="4A7FC1"/>
+        </w:rPr>
+        <w:t xml:space="preserve">#6  </w:t>
+      </w:r>
+      <w:r>
+        <w:rPr>
+          <w:b/>
+          <w:i w:val="0"/>
+        </w:rPr>
+        <w:t>Nguyễn Bá Hiếu Thiện</w:t>
+      </w:r>
+    </w:p>
+    <w:p>
+      <w:r>
+        <w:rPr>
+          <w:b/>
+          <w:color w:val="4A7FC1"/>
+        </w:rPr>
+        <w:t xml:space="preserve">#7  </w:t>
+      </w:r>
+      <w:r>
+        <w:rPr>
+          <w:b/>
+          <w:i w:val="0"/>
+        </w:rPr>
+        <w:t>[Role]</w:t>
+      </w:r>
+    </w:p>
+    <w:p>
+      <w:r>
+        <w:rPr>
+          <w:b/>
+          <w:color w:val="4A7FC1"/>
+        </w:rPr>
+        <w:t xml:space="preserve">#8  </w:t>
+      </w:r>
+      <w:r>
+        <w:rPr>
+          <w:b/>
+          <w:i w:val="0"/>
+        </w:rPr>
+        <w:t>Phan Minh Khôi</w:t>
+      </w:r>
+    </w:p>
+    <w:p>
+      <w:r>
+        <w:rPr>
+          <w:b/>
+          <w:color w:val="4A7FC1"/>
+        </w:rPr>
+        <w:t xml:space="preserve">#9  </w:t>
+      </w:r>
+      <w:r>
+        <w:rPr>
+          <w:b/>
+          <w:i w:val="0"/>
+        </w:rPr>
+        <w:t>[Role]</w:t>
+      </w:r>
+    </w:p>
+    <w:p>
+      <w:r>
+        <w:rPr>
+          <w:b/>
+          <w:color w:val="4A7FC1"/>
+        </w:rPr>
+        <w:t xml:space="preserve">#10  </w:t>
+      </w:r>
+      <w:r>
+        <w:rPr>
+          <w:b/>
+          <w:i w:val="0"/>
+        </w:rPr>
+        <w:t>Dương Hàng Nguyên</w:t>
+      </w:r>
+    </w:p>
+    <w:p>
+      <w:r>
+        <w:rPr>
+          <w:b/>
+          <w:color w:val="4A7FC1"/>
+        </w:rPr>
+        <w:t xml:space="preserve">#11  </w:t>
+      </w:r>
+      <w:r>
+        <w:rPr>
+          <w:b/>
+          <w:i w:val="0"/>
+        </w:rPr>
+        <w:t>[Role]</w:t>
+      </w:r>
+    </w:p>
+    <w:p>
+      <w:r>
+        <w:rPr>
+          <w:b/>
+          <w:color w:val="4A7FC1"/>
+        </w:rPr>
+        <w:t xml:space="preserve">#12  </w:t>
+      </w:r>
+      <w:r>
+        <w:rPr>
+          <w:b/>
+          <w:i w:val="0"/>
+        </w:rPr>
+        <w:t>Phạm Phước Khoa</w:t>
+      </w:r>
+    </w:p>
+    <w:p>
+      <w:r>
+        <w:rPr>
+          <w:b/>
+          <w:color w:val="4A7FC1"/>
+        </w:rPr>
+        <w:t xml:space="preserve">#13  </w:t>
+      </w:r>
+      <w:r>
+        <w:rPr>
+          <w:b/>
+          <w:i w:val="0"/>
+        </w:rPr>
+        <w:t>[Role]</w:t>
+      </w:r>
+    </w:p>
+    <w:p>
+      <w:r>
+        <w:rPr>
+          <w:b/>
+          <w:color w:val="4A7FC1"/>
+        </w:rPr>
+        <w:t xml:space="preserve">#14  </w:t>
+      </w:r>
+      <w:r>
+        <w:rPr>
           <w:b w:val="0"/>
           <w:i w:val="0"/>
         </w:rPr>
@@ -1680,166 +1840,6 @@
           <w:b/>
           <w:color w:val="4A7FC1"/>
         </w:rPr>
-        <w:t xml:space="preserve">#5  </w:t>
-      </w:r>
-      <w:r>
-        <w:rPr>
-          <w:b/>
-          <w:i w:val="0"/>
-        </w:rPr>
-        <w:t>1</w:t>
-      </w:r>
-    </w:p>
-    <w:p>
-      <w:r>
-        <w:rPr>
-          <w:b/>
-          <w:color w:val="4A7FC1"/>
-        </w:rPr>
-        <w:t xml:space="preserve">#6  </w:t>
-      </w:r>
-      <w:r>
-        <w:rPr>
-          <w:b/>
-          <w:i w:val="0"/>
-        </w:rPr>
-        <w:t>[Member name]</w:t>
-      </w:r>
-    </w:p>
-    <w:p>
-      <w:r>
-        <w:rPr>
-          <w:b/>
-          <w:color w:val="4A7FC1"/>
-        </w:rPr>
-        <w:t xml:space="preserve">#7  </w:t>
-      </w:r>
-      <w:r>
-        <w:rPr>
-          <w:b/>
-          <w:i w:val="0"/>
-        </w:rPr>
-        <w:t>Project lead &amp; editor</w:t>
-      </w:r>
-    </w:p>
-    <w:p>
-      <w:r>
-        <w:rPr>
-          <w:b/>
-          <w:color w:val="4A7FC1"/>
-        </w:rPr>
-        <w:t xml:space="preserve">#8  </w:t>
-      </w:r>
-      <w:r>
-        <w:rPr>
-          <w:b w:val="0"/>
-          <w:i w:val="0"/>
-        </w:rPr>
-        <w:t>[Photo]</w:t>
-      </w:r>
-    </w:p>
-    <w:p>
-      <w:r>
-        <w:rPr>
-          <w:b/>
-          <w:color w:val="4A7FC1"/>
-        </w:rPr>
-        <w:t xml:space="preserve">#9  </w:t>
-      </w:r>
-      <w:r>
-        <w:rPr>
-          <w:b/>
-          <w:i w:val="0"/>
-        </w:rPr>
-        <w:t>2</w:t>
-      </w:r>
-    </w:p>
-    <w:p>
-      <w:r>
-        <w:rPr>
-          <w:b/>
-          <w:color w:val="4A7FC1"/>
-        </w:rPr>
-        <w:t xml:space="preserve">#10  </w:t>
-      </w:r>
-      <w:r>
-        <w:rPr>
-          <w:b/>
-          <w:i w:val="0"/>
-        </w:rPr>
-        <w:t>[Member name]</w:t>
-      </w:r>
-    </w:p>
-    <w:p>
-      <w:r>
-        <w:rPr>
-          <w:b/>
-          <w:color w:val="4A7FC1"/>
-        </w:rPr>
-        <w:t xml:space="preserve">#11  </w:t>
-      </w:r>
-      <w:r>
-        <w:rPr>
-          <w:b/>
-          <w:i w:val="0"/>
-        </w:rPr>
-        <w:t>City planner &amp; 3D builder</w:t>
-      </w:r>
-    </w:p>
-    <w:p>
-      <w:r>
-        <w:rPr>
-          <w:b/>
-          <w:color w:val="4A7FC1"/>
-        </w:rPr>
-        <w:t xml:space="preserve">#12  </w:t>
-      </w:r>
-      <w:r>
-        <w:rPr>
-          <w:b w:val="0"/>
-          <w:i w:val="0"/>
-        </w:rPr>
-        <w:t>[Photo]</w:t>
-      </w:r>
-    </w:p>
-    <w:p>
-      <w:r>
-        <w:rPr>
-          <w:b/>
-          <w:color w:val="4A7FC1"/>
-        </w:rPr>
-        <w:t xml:space="preserve">#13  </w:t>
-      </w:r>
-      <w:r>
-        <w:rPr>
-          <w:b/>
-          <w:i w:val="0"/>
-        </w:rPr>
-        <w:t>3</w:t>
-      </w:r>
-    </w:p>
-    <w:p>
-      <w:r>
-        <w:rPr>
-          <w:b/>
-          <w:color w:val="4A7FC1"/>
-        </w:rPr>
-        <w:t xml:space="preserve">#14  </w:t>
-      </w:r>
-      <w:r>
-        <w:rPr>
-          <w:b/>
-          <w:i w:val="0"/>
-        </w:rPr>
-        <w:t>[Member name]</w:t>
-      </w:r>
-    </w:p>
-    <w:p>
-      <w:r>
-        <w:rPr>
-          <w:b/>
-          <w:color w:val="4A7FC1"/>
-        </w:rPr>
         <w:t xml:space="preserve">#15  </w:t>
       </w:r>
       <w:r>
@@ -1847,7 +1847,7 @@
           <w:b/>
           <w:i w:val="0"/>
         </w:rPr>
-        <w:t>Energy &amp; systems researcher</w:t>
+        <w:t>Nguyễn Minh Triết</w:t>
       </w:r>
     </w:p>
     <w:p>
@@ -1860,10 +1860,10 @@
       </w:r>
       <w:r>
         <w:rPr>
-          <w:b w:val="0"/>
-          <w:i w:val="0"/>
-        </w:rPr>
-        <w:t>[Photo]</w:t>
+          <w:b/>
+          <w:i w:val="0"/>
+        </w:rPr>
+        <w:t>[Role]</w:t>
       </w:r>
     </w:p>
     <w:p>
@@ -1873,118 +1873,6 @@
           <w:color w:val="4A7FC1"/>
         </w:rPr>
         <w:t xml:space="preserve">#17  </w:t>
-      </w:r>
-      <w:r>
-        <w:rPr>
-          <w:b/>
-          <w:i w:val="0"/>
-        </w:rPr>
-        <w:t>4</w:t>
-      </w:r>
-    </w:p>
-    <w:p>
-      <w:r>
-        <w:rPr>
-          <w:b/>
-          <w:color w:val="4A7FC1"/>
-        </w:rPr>
-        <w:t xml:space="preserve">#18  </w:t>
-      </w:r>
-      <w:r>
-        <w:rPr>
-          <w:b/>
-          <w:i w:val="0"/>
-        </w:rPr>
-        <w:t>[Member name]</w:t>
-      </w:r>
-    </w:p>
-    <w:p>
-      <w:r>
-        <w:rPr>
-          <w:b/>
-          <w:color w:val="4A7FC1"/>
-        </w:rPr>
-        <w:t xml:space="preserve">#19  </w:t>
-      </w:r>
-      <w:r>
-        <w:rPr>
-          <w:b/>
-          <w:i w:val="0"/>
-        </w:rPr>
-        <w:t>Writer &amp; fact-checker</w:t>
-      </w:r>
-    </w:p>
-    <w:p>
-      <w:r>
-        <w:rPr>
-          <w:b/>
-          <w:color w:val="4A7FC1"/>
-        </w:rPr>
-        <w:t xml:space="preserve">#20  </w:t>
-      </w:r>
-      <w:r>
-        <w:rPr>
-          <w:b w:val="0"/>
-          <w:i w:val="0"/>
-        </w:rPr>
-        <w:t>[Photo]</w:t>
-      </w:r>
-    </w:p>
-    <w:p>
-      <w:r>
-        <w:rPr>
-          <w:b/>
-          <w:color w:val="4A7FC1"/>
-        </w:rPr>
-        <w:t xml:space="preserve">#21  </w:t>
-      </w:r>
-      <w:r>
-        <w:rPr>
-          <w:b/>
-          <w:i w:val="0"/>
-        </w:rPr>
-        <w:t>5</w:t>
-      </w:r>
-    </w:p>
-    <w:p>
-      <w:r>
-        <w:rPr>
-          <w:b/>
-          <w:color w:val="4A7FC1"/>
-        </w:rPr>
-        <w:t xml:space="preserve">#22  </w:t>
-      </w:r>
-      <w:r>
-        <w:rPr>
-          <w:b/>
-          <w:i w:val="0"/>
-        </w:rPr>
-        <w:t>[Member name]</w:t>
-      </w:r>
-    </w:p>
-    <w:p>
-      <w:r>
-        <w:rPr>
-          <w:b/>
-          <w:color w:val="4A7FC1"/>
-        </w:rPr>
-        <w:t xml:space="preserve">#23  </w:t>
-      </w:r>
-      <w:r>
-        <w:rPr>
-          <w:b/>
-          <w:i w:val="0"/>
-        </w:rPr>
-        <w:t>Interview &amp; video producer</w:t>
-      </w:r>
-    </w:p>
-    <w:p>
-      <w:r>
-        <w:rPr>
-          <w:b/>
-          <w:color w:val="4A7FC1"/>
-        </w:rPr>
-        <w:t xml:space="preserve">#24  </w:t>
       </w:r>
       <w:r>
         <w:rPr>
@@ -13886,7 +13774,7 @@
           <w:b w:val="0"/>
           <w:i w:val="0"/>
         </w:rPr>
-        <w:t>[Member names]</w:t>
+        <w:t>Nguyễn Đông Bảo · Nguyễn Bá Hiếu Thiện · Phan Minh Khôi · Dương Hàng Nguyên · Phạm Phước Khoa · Nguyễn Minh Triết</w:t>
       </w:r>
     </w:p>
     <w:p>

</xml_diff>

<commit_message>
Điền tên, ảnh, vai trò 6 thành viên, lớp, trường và logo trường; bớt mã QR
- Trang 5: đủ ảnh và vai trò của 6 thành viên theo nhóm gửi.
- Trang 4 và bìa sau: lớp 11A4, Lê Quý Đôn High School; bìa sau có logo trường.
- Mã QR phỏng vấn chỉ còn ở trang 5 và bìa sau; trang 35 dùng ảnh sân vận động lớn hơn.

Co-Authored-By: Claude Opus 5.5 <noreply@anthropic.com>
Claude-Session: https://claude.ai/code/session_01Hmv4YstQBq6NRkZ7ExoLKC
</commit_message>
<xml_diff>
--- a/output/Aurora_Haven_Magazine_text.docx
+++ b/output/Aurora_Haven_Magazine_text.docx
@@ -1567,7 +1567,7 @@
           <w:b w:val="0"/>
           <w:i w:val="0"/>
         </w:rPr>
-        <w:t>[Class] · [School] · [Date]</w:t>
+        <w:t>Class 11A4 · Lê Quý Đôn High School · [Date]</w:t>
       </w:r>
     </w:p>
     <w:p>
@@ -1687,7 +1687,7 @@
           <w:b/>
           <w:i w:val="0"/>
         </w:rPr>
-        <w:t>[Role]</w:t>
+        <w:t>Magazine design · 3D city design</w:t>
       </w:r>
     </w:p>
     <w:p>
@@ -1719,7 +1719,7 @@
           <w:b/>
           <w:i w:val="0"/>
         </w:rPr>
-        <w:t>[Role]</w:t>
+        <w:t>Team leader · Research · 3D city design</w:t>
       </w:r>
     </w:p>
     <w:p>
@@ -1751,7 +1751,7 @@
           <w:b/>
           <w:i w:val="0"/>
         </w:rPr>
-        <w:t>[Role]</w:t>
+        <w:t>Research · Fact-checking</w:t>
       </w:r>
     </w:p>
     <w:p>
@@ -1783,7 +1783,7 @@
           <w:b/>
           <w:i w:val="0"/>
         </w:rPr>
-        <w:t>[Role]</w:t>
+        <w:t>Video filming &amp; editing · 3D city design</w:t>
       </w:r>
     </w:p>
     <w:p>
@@ -1815,7 +1815,7 @@
           <w:b/>
           <w:i w:val="0"/>
         </w:rPr>
-        <w:t>[Role]</w:t>
+        <w:t>Video editing · Magazine design</w:t>
       </w:r>
     </w:p>
     <w:p>
@@ -1828,10 +1828,10 @@
       </w:r>
       <w:r>
         <w:rPr>
-          <w:b w:val="0"/>
-          <w:i w:val="0"/>
-        </w:rPr>
-        <w:t>[Photo]</w:t>
+          <w:b/>
+          <w:i w:val="0"/>
+        </w:rPr>
+        <w:t>Nguyễn Minh Triết</w:t>
       </w:r>
     </w:p>
     <w:p>
@@ -1847,7 +1847,7 @@
           <w:b/>
           <w:i w:val="0"/>
         </w:rPr>
-        <w:t>Nguyễn Minh Triết</w:t>
+        <w:t>Magazine design · Report</w:t>
       </w:r>
     </w:p>
     <w:p>
@@ -1857,22 +1857,6 @@
           <w:color w:val="4A7FC1"/>
         </w:rPr>
         <w:t xml:space="preserve">#16  </w:t>
-      </w:r>
-      <w:r>
-        <w:rPr>
-          <w:b/>
-          <w:i w:val="0"/>
-        </w:rPr>
-        <w:t>[Role]</w:t>
-      </w:r>
-    </w:p>
-    <w:p>
-      <w:r>
-        <w:rPr>
-          <w:b/>
-          <w:color w:val="4A7FC1"/>
-        </w:rPr>
-        <w:t xml:space="preserve">#17  </w:t>
       </w:r>
       <w:r>
         <w:rPr>
@@ -10361,49 +10345,6 @@
       </w:r>
     </w:p>
     <w:p>
-      <w:r>
-        <w:rPr>
-          <w:b/>
-          <w:color w:val="4A7FC1"/>
-        </w:rPr>
-        <w:t xml:space="preserve">#29  </w:t>
-      </w:r>
-      <w:r>
-        <w:rPr>
-          <w:b/>
-          <w:i w:val="0"/>
-        </w:rPr>
-        <w:t>SCAN TO WATCH</w:t>
-      </w:r>
-    </w:p>
-    <w:p>
-      <w:r>
-        <w:rPr>
-          <w:b/>
-          <w:i w:val="0"/>
-        </w:rPr>
-        <w:t>Our real-world interview</w:t>
-      </w:r>
-    </w:p>
-    <w:p>
-      <w:r>
-        <w:rPr>
-          <w:b w:val="0"/>
-          <w:i w:val="0"/>
-        </w:rPr>
-        <w:t>Video on YouTube</w:t>
-      </w:r>
-    </w:p>
-    <w:p>
-      <w:r>
-        <w:rPr>
-          <w:b/>
-          <w:i w:val="0"/>
-        </w:rPr>
-        <w:t>youtu.be/QwcP_2Q3Esc</w:t>
-      </w:r>
-    </w:p>
-    <w:p>
       <w:pPr>
         <w:pStyle w:val="Heading1"/>
       </w:pPr>
@@ -13783,7 +13724,7 @@
           <w:b w:val="0"/>
           <w:i w:val="0"/>
         </w:rPr>
-        <w:t>[Class] · [School]</w:t>
+        <w:t>Class 11A4 · Lê Quý Đôn High School</w:t>
       </w:r>
     </w:p>
     <w:p>
@@ -13802,22 +13743,6 @@
           <w:color w:val="4A7FC1"/>
         </w:rPr>
         <w:t xml:space="preserve">#8  </w:t>
-      </w:r>
-      <w:r>
-        <w:rPr>
-          <w:b w:val="0"/>
-          <w:i w:val="0"/>
-        </w:rPr>
-        <w:t>[School or team logo]</w:t>
-      </w:r>
-    </w:p>
-    <w:p>
-      <w:r>
-        <w:rPr>
-          <w:b/>
-          <w:color w:val="4A7FC1"/>
-        </w:rPr>
-        <w:t xml:space="preserve">#9  </w:t>
       </w:r>
       <w:r>
         <w:rPr>

</xml_diff>

<commit_message>
Điền tên nhóm Polar City, bỏ email nhóm, khai báo dùng AI cho hình ảnh
Không còn chỗ trống nào trong tạp chí.

Co-Authored-By: Claude Opus 5.5 <noreply@anthropic.com>
Claude-Session: https://claude.ai/code/session_01Hmv4YstQBq6NRkZ7ExoLKC
</commit_message>
<xml_diff>
--- a/output/Aurora_Haven_Magazine_text.docx
+++ b/output/Aurora_Haven_Magazine_text.docx
@@ -1551,7 +1551,7 @@
           <w:b/>
           <w:i/>
         </w:rPr>
-        <w:t>[Group name]</w:t>
+        <w:t>The Polar City team</w:t>
       </w:r>
     </w:p>
     <w:p>
@@ -1567,7 +1567,7 @@
           <w:b w:val="0"/>
           <w:i w:val="0"/>
         </w:rPr>
-        <w:t>Class 11A4 · Lê Quý Đôn High School · [Date]</w:t>
+        <w:t>Class 11A4 · Lê Quý Đôn High School</w:t>
       </w:r>
     </w:p>
     <w:p>
@@ -9813,7 +9813,7 @@
           <w:b w:val="0"/>
           <w:i w:val="0"/>
         </w:rPr>
-        <w:t>Contact us at [Team email] or visit the Aurora Green Finance Hall in the Financial District.</w:t>
+        <w:t>Visit the Aurora Green Finance Hall in the Financial District, or meet our team on page 5.</w:t>
       </w:r>
     </w:p>
     <w:p>
@@ -13554,7 +13554,7 @@
           <w:b w:val="0"/>
           <w:i w:val="0"/>
         </w:rPr>
-        <w:t>[Describe how your team used AI tools, for example for brainstorming, layout and language checks.]</w:t>
+        <w:t>We used AI tools to help us build the 3D model of the city and make the pictures, plans and diagrams in this magazine.</w:t>
       </w:r>
     </w:p>
     <w:p>
@@ -13706,7 +13706,7 @@
           <w:b/>
           <w:i w:val="0"/>
         </w:rPr>
-        <w:t>[Group name]</w:t>
+        <w:t>Polar City</w:t>
       </w:r>
     </w:p>
     <w:p>
@@ -13725,15 +13725,6 @@
           <w:i w:val="0"/>
         </w:rPr>
         <w:t>Class 11A4 · Lê Quý Đôn High School</w:t>
-      </w:r>
-    </w:p>
-    <w:p>
-      <w:r>
-        <w:rPr>
-          <w:b w:val="0"/>
-          <w:i w:val="0"/>
-        </w:rPr>
-        <w:t>[Team email]</w:t>
       </w:r>
     </w:p>
     <w:p>

</xml_diff>

<commit_message>
Bìa sau: mã QR tới bản tạp chí tương tác trên FlipHTML5
Mã QR phỏng vấn giữ ở trang 5. Thêm output/Aurora_Haven_Magazine_web.pdf
(ảnh 150 dpi, khoảng 5 MB) để đưa lên FlipHTML5.

Co-Authored-By: Claude Opus 5.5 <noreply@anthropic.com>
Claude-Session: https://claude.ai/code/session_01Hmv4YstQBq6NRkZ7ExoLKC
</commit_message>
<xml_diff>
--- a/output/Aurora_Haven_Magazine_text.docx
+++ b/output/Aurora_Haven_Magazine_text.docx
@@ -14252,34 +14252,34 @@
           <w:b/>
           <w:i w:val="0"/>
         </w:rPr>
-        <w:t>SCAN TO WATCH</w:t>
-      </w:r>
-    </w:p>
-    <w:p>
-      <w:r>
-        <w:rPr>
-          <w:b/>
-          <w:i w:val="0"/>
-        </w:rPr>
-        <w:t>Our real-world interview</w:t>
-      </w:r>
-    </w:p>
-    <w:p>
-      <w:r>
-        <w:rPr>
-          <w:b w:val="0"/>
-          <w:i w:val="0"/>
-        </w:rPr>
-        <w:t>Video on YouTube</w:t>
-      </w:r>
-    </w:p>
-    <w:p>
-      <w:r>
-        <w:rPr>
-          <w:b/>
-          <w:i w:val="0"/>
-        </w:rPr>
-        <w:t>youtu.be/QwcP_2Q3Esc</w:t>
+        <w:t>SCAN TO READ</w:t>
+      </w:r>
+    </w:p>
+    <w:p>
+      <w:r>
+        <w:rPr>
+          <w:b/>
+          <w:i w:val="0"/>
+        </w:rPr>
+        <w:t>The interactive edition</w:t>
+      </w:r>
+    </w:p>
+    <w:p>
+      <w:r>
+        <w:rPr>
+          <w:b w:val="0"/>
+          <w:i w:val="0"/>
+        </w:rPr>
+        <w:t>Flip through this magazine online on FlipHTML5</w:t>
+      </w:r>
+    </w:p>
+    <w:p>
+      <w:r>
+        <w:rPr>
+          <w:b/>
+          <w:i w:val="0"/>
+        </w:rPr>
+        <w:t>Open the flipbook</w:t>
       </w:r>
     </w:p>
     <w:sectPr>

</xml_diff>

<commit_message>
Sửa tạp chí theo nhận xét của cô: làm nổi bật đột phá, thêm QR bản đồ 3D, ảnh mô hình thật
- Bỏ trang bảng "Three Breakthroughs, Checked"; nội dung chuyển thành các ô
  "Where the world is today" / "Reality check" đặt trên ảnh từng đột phá
- Trang 19: đột phá là ngọn núi tuyết có cả khu giải trí bên trong
- Trang 16: ô "Why it's green" về độ thân thiện môi trường của nhà máy nhiệt hạch [20]
- Trang 27: năng lượng 3 giai đoạn (khởi động, vận hành, dự phòng)
- Trang 23 "Built by Us": ảnh mô hình Ecopolis, 2 QR (tải file JSON, mở web), hướng dẫn
- Trang 5: thêm phần kết luận phỏng vấn cạnh mã QR
- Trang 37: góc nhìn của một cư dân, ảnh render mới
- Giảm bớt các con số khô khan ở nhiều trang

Co-Authored-By: Claude Opus 5.5 <noreply@anthropic.com>
Claude-Session: https://claude.ai/code/session_01Hmv4YstQBq6NRkZ7ExoLKC
</commit_message>
<xml_diff>
--- a/output/Aurora_Haven_Magazine_text.docx
+++ b/output/Aurora_Haven_Magazine_text.docx
@@ -121,16 +121,16 @@
           <w:b/>
           <w:i w:val="0"/>
         </w:rPr>
-        <w:t>A warm heart</w:t>
-      </w:r>
-    </w:p>
-    <w:p>
-      <w:r>
-        <w:rPr>
-          <w:b/>
-          <w:i w:val="0"/>
-        </w:rPr>
-        <w:t>inside the ice</w:t>
+        <w:t>A snow mountain</w:t>
+      </w:r>
+    </w:p>
+    <w:p>
+      <w:r>
+        <w:rPr>
+          <w:b/>
+          <w:i w:val="0"/>
+        </w:rPr>
+        <w:t>you can walk inside</w:t>
       </w:r>
     </w:p>
     <w:p>
@@ -139,7 +139,7 @@
           <w:b w:val="0"/>
           <w:i w:val="0"/>
         </w:rPr>
-        <w:t>Four geothermal spa levels hidden in a 35-metre snow peak</w:t>
+        <w:t>A whole leisure world inside a 35-metre snow peak</w:t>
       </w:r>
     </w:p>
     <w:p>
@@ -704,7 +704,7 @@
           <w:b/>
           <w:i w:val="0"/>
         </w:rPr>
-        <w:t>A Warm Heart Inside the Ice</w:t>
+        <w:t>A Snow Mountain You Can Walk Inside</w:t>
       </w:r>
     </w:p>
     <w:p>
@@ -720,7 +720,7 @@
           <w:b w:val="0"/>
           <w:i w:val="0"/>
         </w:rPr>
-        <w:t>Breakthrough 3 · Mount Aurora spa resort</w:t>
+        <w:t>Breakthrough 3 · Mount Aurora</w:t>
       </w:r>
     </w:p>
     <w:p>
@@ -752,7 +752,7 @@
           <w:b/>
           <w:i w:val="0"/>
         </w:rPr>
-        <w:t>Three Breakthroughs, Checked</w:t>
+        <w:t>Built by Us</w:t>
       </w:r>
     </w:p>
     <w:p>
@@ -768,7 +768,7 @@
           <w:b w:val="0"/>
           <w:i w:val="0"/>
         </w:rPr>
-        <w:t>Problem, mechanism, novelty, feasibility, impact</w:t>
+        <w:t>Our Eco-Polis model, and how to explore it</w:t>
       </w:r>
     </w:p>
     <w:p>
@@ -1424,7 +1424,7 @@
           <w:b/>
           <w:i w:val="0"/>
         </w:rPr>
-        <w:t>Aurora Haven by the Numbers</w:t>
+        <w:t>Through a Resident’s Eyes</w:t>
       </w:r>
     </w:p>
     <w:p>
@@ -1440,7 +1440,7 @@
           <w:b w:val="0"/>
           <w:i w:val="0"/>
         </w:rPr>
-        <w:t>The key figures in one place</w:t>
+        <w:t>An imagined day in the polar night</w:t>
       </w:r>
     </w:p>
     <w:p>
@@ -1942,6 +1942,38 @@
       </w:r>
     </w:p>
     <w:p>
+      <w:r>
+        <w:rPr>
+          <w:b/>
+          <w:color w:val="4A7FC1"/>
+        </w:rPr>
+        <w:t xml:space="preserve">#17  </w:t>
+      </w:r>
+      <w:r>
+        <w:rPr>
+          <w:b/>
+          <w:i w:val="0"/>
+        </w:rPr>
+        <w:t>INTERVIEW CONCLUSION</w:t>
+      </w:r>
+    </w:p>
+    <w:p>
+      <w:r>
+        <w:rPr>
+          <w:b/>
+          <w:color w:val="4A7FC1"/>
+        </w:rPr>
+        <w:t xml:space="preserve">#18  </w:t>
+      </w:r>
+      <w:r>
+        <w:rPr>
+          <w:b w:val="0"/>
+          <w:i/>
+        </w:rPr>
+        <w:t>Looking back on the interview session, our team not only gathered valuable architectural insights but also learned a great deal about creative thinking and teamwork. Preparing the questions, listening closely, and engaging in direct discussions helped us deeply understand how green technologies can be practically applied to extreme environmental challenges. Overall, this was a truly rewarding experience that broadened our perspectives and allowed us to bring the most inspiring stories to our magazine readers.</w:t>
+      </w:r>
+    </w:p>
+    <w:p>
       <w:pPr>
         <w:pStyle w:val="Heading1"/>
       </w:pPr>
@@ -2557,7 +2589,7 @@
           <w:b/>
           <w:i w:val="0"/>
         </w:rPr>
-        <w:t>WHO IS AFFECTED?</w:t>
+        <w:t>THE PEOPLE AND PLACES AT RISK</w:t>
       </w:r>
     </w:p>
     <w:p>
@@ -3624,7 +3656,7 @@
           <w:b w:val="0"/>
           <w:i/>
         </w:rPr>
-        <w:t>A compact tokamak gives Aurora Haven about 300 MW of electricity and 450 MW of district heat, steady through the polar night, with no CO₂ and no meltdown.</w:t>
+        <w:t>Our big idea: put a fusion reactor inside the city itself, so one machine lights every home, heats every street and melts the snow we drink.</w:t>
       </w:r>
     </w:p>
     <w:p>
@@ -3679,6 +3711,86 @@
       </w:r>
       <w:r>
         <w:rPr>
+          <w:b/>
+          <w:i w:val="0"/>
+        </w:rPr>
+        <w:t>WHERE THE WORLD IS TODAY</w:t>
+      </w:r>
+    </w:p>
+    <w:p>
+      <w:r>
+        <w:rPr>
+          <w:b/>
+          <w:color w:val="4A7FC1"/>
+        </w:rPr>
+        <w:t xml:space="preserve">#2  </w:t>
+      </w:r>
+      <w:r>
+        <w:rPr>
+          <w:b w:val="0"/>
+          <w:i w:val="0"/>
+        </w:rPr>
+        <w:t>Fusion is still being tested. The compact SPARC tokamak aims for its first plasma around 2027 [5], and ITER in France plans to burn deuterium–tritium fuel in 2039 [4]. No fusion plant sells power yet: Aurora Haven is designed for the day one does.</w:t>
+      </w:r>
+    </w:p>
+    <w:p>
+      <w:r>
+        <w:rPr>
+          <w:b/>
+          <w:color w:val="4A7FC1"/>
+        </w:rPr>
+        <w:t xml:space="preserve">#3  </w:t>
+      </w:r>
+      <w:r>
+        <w:rPr>
+          <w:b/>
+          <w:i w:val="0"/>
+        </w:rPr>
+        <w:t>REALITY CHECK</w:t>
+      </w:r>
+    </w:p>
+    <w:p>
+      <w:r>
+        <w:rPr>
+          <w:b/>
+          <w:color w:val="4A7FC1"/>
+        </w:rPr>
+        <w:t xml:space="preserve">#4  </w:t>
+      </w:r>
+      <w:r>
+        <w:rPr>
+          <w:b/>
+          <w:i w:val="0"/>
+        </w:rPr>
+        <w:t>≈ 0.2 kg a day</w:t>
+      </w:r>
+    </w:p>
+    <w:p>
+      <w:r>
+        <w:rPr>
+          <w:b/>
+          <w:color w:val="4A7FC1"/>
+        </w:rPr>
+        <w:t xml:space="preserve">#5  </w:t>
+      </w:r>
+      <w:r>
+        <w:rPr>
+          <w:b w:val="0"/>
+          <w:i w:val="0"/>
+        </w:rPr>
+        <w:t>A day at 800 MW needs about 0.2 kg of fuel, close to our 170 g design. Breeding tritium at scale is unproven [11] and ITER costs €18–22 billion [12], so the city starts on wind, sun and geothermal power (page 27).</w:t>
+      </w:r>
+    </w:p>
+    <w:p>
+      <w:r>
+        <w:rPr>
+          <w:b/>
+          <w:color w:val="4A7FC1"/>
+        </w:rPr>
+        <w:t xml:space="preserve">#6  </w:t>
+      </w:r>
+      <w:r>
+        <w:rPr>
           <w:b w:val="0"/>
           <w:i/>
         </w:rPr>
@@ -3834,7 +3946,7 @@
           <w:b w:val="0"/>
           <w:i w:val="0"/>
         </w:rPr>
-        <w:t>Breeds slightly more tritium than the reactor burns, so none is imported. Recovered helium cools the hospital’s MRI scanners.</w:t>
+        <w:t>Breeds the tritium the reactor burns inside sealed, leak-monitored loops, so none is imported. Recovered helium cools MRI scanners.</w:t>
       </w:r>
     </w:p>
     <w:p>
@@ -3882,7 +3994,7 @@
           <w:b w:val="0"/>
           <w:i w:val="0"/>
         </w:rPr>
-        <w:t>Superconducting magnets hold a 150-million-degree plasma. No CO₂, no long-lived waste, no meltdown.</w:t>
+        <w:t>Superconducting magnets hold a 150-million-degree plasma. If anything fails, the plasma simply goes out: it cannot melt down.</w:t>
       </w:r>
     </w:p>
     <w:p>
@@ -3930,7 +4042,7 @@
           <w:b w:val="0"/>
           <w:i w:val="0"/>
         </w:rPr>
-        <w:t>Supercritical-CO₂ turbines make about 300 MW of electricity and send about 450 MW of heat to the city.</w:t>
+        <w:t>Turbines driven by CO₂ sealed in a closed loop make about 300 MW of electricity and send about 450 MW of heat to the city.</w:t>
       </w:r>
     </w:p>
     <w:p>
@@ -3978,7 +4090,7 @@
           <w:b w:val="0"/>
           <w:i w:val="0"/>
         </w:rPr>
-        <w:t>Torches hotter than 5,000 °C turn about 20 t of rubbish a day into clean gas, metals and paving blocks.</w:t>
+        <w:t>Torches hotter than 5,000 °C turn about 20 t of rubbish a day into hydrogen and CO₂ for the food plant, metals and paving blocks.</w:t>
       </w:r>
     </w:p>
     <w:p>
@@ -4042,7 +4154,7 @@
           <w:b/>
           <w:i w:val="0"/>
         </w:rPr>
-        <w:t>800 MW</w:t>
+        <w:t>WHY IT’S GREEN</w:t>
       </w:r>
     </w:p>
     <w:p>
@@ -4055,138 +4167,81 @@
       </w:r>
       <w:r>
         <w:rPr>
+          <w:b/>
+          <w:i w:val="0"/>
+        </w:rPr>
+        <w:t xml:space="preserve">94% used. </w:t>
+      </w:r>
+      <w:r>
+        <w:rPr>
           <w:b w:val="0"/>
           <w:i w:val="0"/>
         </w:rPr>
-        <w:t>of heat from the plasma</w:t>
-      </w:r>
-    </w:p>
-    <w:p>
-      <w:r>
-        <w:rPr>
-          <w:b/>
-          <w:color w:val="4A7FC1"/>
-        </w:rPr>
-        <w:t xml:space="preserve">#24  </w:t>
-      </w:r>
-      <w:r>
-        <w:rPr>
-          <w:b/>
-          <w:i w:val="0"/>
-        </w:rPr>
-        <w:t>300 MW</w:t>
-      </w:r>
-    </w:p>
-    <w:p>
-      <w:r>
-        <w:rPr>
-          <w:b/>
-          <w:color w:val="4A7FC1"/>
-        </w:rPr>
-        <w:t xml:space="preserve">#25  </w:t>
+        <w:t>Of 800 MW of heat, 300 MW becomes power and 450 MW warms the city.</w:t>
+      </w:r>
+    </w:p>
+    <w:p>
+      <w:r>
+        <w:rPr>
+          <w:b/>
+          <w:i w:val="0"/>
+        </w:rPr>
+        <w:t xml:space="preserve">No CO₂. </w:t>
       </w:r>
       <w:r>
         <w:rPr>
           <w:b w:val="0"/>
           <w:i w:val="0"/>
         </w:rPr>
-        <w:t>of electricity</w:t>
-      </w:r>
-    </w:p>
-    <w:p>
-      <w:r>
-        <w:rPr>
-          <w:b/>
-          <w:color w:val="4A7FC1"/>
-        </w:rPr>
-        <w:t xml:space="preserve">#26  </w:t>
-      </w:r>
-      <w:r>
-        <w:rPr>
-          <w:b/>
-          <w:i w:val="0"/>
-        </w:rPr>
-        <w:t>450 MW</w:t>
-      </w:r>
-    </w:p>
-    <w:p>
-      <w:r>
-        <w:rPr>
-          <w:b/>
-          <w:color w:val="4A7FC1"/>
-        </w:rPr>
-        <w:t xml:space="preserve">#27  </w:t>
+        <w:t>Nothing burns, and the turbines’ CO₂ never leaves its loop.</w:t>
+      </w:r>
+    </w:p>
+    <w:p>
+      <w:r>
+        <w:rPr>
+          <w:b/>
+          <w:i w:val="0"/>
+        </w:rPr>
+        <w:t xml:space="preserve">Fuel from snow. </w:t>
       </w:r>
       <w:r>
         <w:rPr>
           <w:b w:val="0"/>
           <w:i w:val="0"/>
         </w:rPr>
-        <w:t>of district heat for the city</w:t>
-      </w:r>
-    </w:p>
-    <w:p>
-      <w:r>
-        <w:rPr>
-          <w:b/>
-          <w:color w:val="4A7FC1"/>
-        </w:rPr>
-        <w:t xml:space="preserve">#28  </w:t>
-      </w:r>
-      <w:r>
-        <w:rPr>
-          <w:b/>
-          <w:i w:val="0"/>
-        </w:rPr>
-        <w:t>170 g</w:t>
-      </w:r>
-    </w:p>
-    <w:p>
-      <w:r>
-        <w:rPr>
-          <w:b/>
-          <w:color w:val="4A7FC1"/>
-        </w:rPr>
-        <w:t xml:space="preserve">#29  </w:t>
+        <w:t>Deuterium comes from meltwater: no mines, no tankers.</w:t>
+      </w:r>
+    </w:p>
+    <w:p>
+      <w:r>
+        <w:rPr>
+          <w:b/>
+          <w:i w:val="0"/>
+        </w:rPr>
+        <w:t xml:space="preserve">Rubbish reused. </w:t>
       </w:r>
       <w:r>
         <w:rPr>
           <w:b w:val="0"/>
           <w:i w:val="0"/>
         </w:rPr>
-        <w:t>of fuel a day, about 70 g of it deuterium</w:t>
-      </w:r>
-    </w:p>
-    <w:p>
-      <w:r>
-        <w:rPr>
-          <w:b/>
-          <w:color w:val="4A7FC1"/>
-        </w:rPr>
-        <w:t xml:space="preserve">#30  </w:t>
-      </w:r>
-      <w:r>
-        <w:rPr>
-          <w:b/>
-          <w:i w:val="0"/>
-        </w:rPr>
-        <w:t>1 litre</w:t>
-      </w:r>
-    </w:p>
-    <w:p>
-      <w:r>
-        <w:rPr>
-          <w:b/>
-          <w:color w:val="4A7FC1"/>
-        </w:rPr>
-        <w:t xml:space="preserve">#31  </w:t>
+        <w:t>The converter’s hydrogen and CO₂ feed the food plant.</w:t>
+      </w:r>
+    </w:p>
+    <w:p>
+      <w:r>
+        <w:rPr>
+          <w:b/>
+          <w:i w:val="0"/>
+        </w:rPr>
+        <w:t xml:space="preserve">Little waste. </w:t>
       </w:r>
       <w:r>
         <w:rPr>
           <w:b w:val="0"/>
           <w:i w:val="0"/>
         </w:rPr>
-        <w:t>of liquid helium a day for MRI scanners</w:t>
+        <w:t>Its radioactive waste is mostly short-lived, under 100 years, unlike spent fission fuel [20].</w:t>
       </w:r>
     </w:p>
     <w:p>
@@ -4258,7 +4313,7 @@
           <w:b w:val="0"/>
           <w:i/>
         </w:rPr>
-        <w:t>Six stages turn tundra snow and air into all of the city’s drinking water and about half of its protein, with no farmland at all.</w:t>
+        <w:t>Our big idea: a factory that bakes bread and pours drinking water out of snow and air, so a city with no farmland can feed itself.</w:t>
       </w:r>
     </w:p>
     <w:p>
@@ -4666,7 +4721,7 @@
           <w:b/>
           <w:i w:val="0"/>
         </w:rPr>
-        <w:t>3,000 t</w:t>
+        <w:t>WHERE THE WORLD IS TODAY</w:t>
       </w:r>
     </w:p>
     <w:p>
@@ -4682,7 +4737,7 @@
           <w:b w:val="0"/>
           <w:i w:val="0"/>
         </w:rPr>
-        <w:t>of snow melted a day</w:t>
+        <w:t>Each step exists, but apart: Solein protein from Finland [6], starch made from CO₂ in a lab [7] and air capture in Iceland [8]. We link them in one plant.</w:t>
       </w:r>
     </w:p>
     <w:p>
@@ -4698,7 +4753,7 @@
           <w:b/>
           <w:i w:val="0"/>
         </w:rPr>
-        <w:t>2,500 m³</w:t>
+        <w:t>REALITY CHECK</w:t>
       </w:r>
     </w:p>
     <w:p>
@@ -4711,106 +4766,26 @@
       </w:r>
       <w:r>
         <w:rPr>
+          <w:b/>
+          <w:i w:val="0"/>
+        </w:rPr>
+        <w:t>≈ 13 MW</w:t>
+      </w:r>
+    </w:p>
+    <w:p>
+      <w:r>
+        <w:rPr>
+          <w:b/>
+          <w:color w:val="4A7FC1"/>
+        </w:rPr>
+        <w:t xml:space="preserve">#26  </w:t>
+      </w:r>
+      <w:r>
+        <w:rPr>
           <w:b w:val="0"/>
           <w:i w:val="0"/>
         </w:rPr>
-        <w:t>of drinking water a day, all of the city’s tap water</w:t>
-      </w:r>
-    </w:p>
-    <w:p>
-      <w:r>
-        <w:rPr>
-          <w:b/>
-          <w:color w:val="4A7FC1"/>
-        </w:rPr>
-        <w:t xml:space="preserve">#26  </w:t>
-      </w:r>
-      <w:r>
-        <w:rPr>
-          <w:b/>
-          <w:i w:val="0"/>
-        </w:rPr>
-        <w:t>20 t</w:t>
-      </w:r>
-    </w:p>
-    <w:p>
-      <w:r>
-        <w:rPr>
-          <w:b/>
-          <w:color w:val="4A7FC1"/>
-        </w:rPr>
-        <w:t xml:space="preserve">#27  </w:t>
-      </w:r>
-      <w:r>
-        <w:rPr>
-          <w:b w:val="0"/>
-          <w:i w:val="0"/>
-        </w:rPr>
-        <w:t>of CO₂ captured from the air a day</w:t>
-      </w:r>
-    </w:p>
-    <w:p>
-      <w:r>
-        <w:rPr>
-          <w:b/>
-          <w:color w:val="4A7FC1"/>
-        </w:rPr>
-        <w:t xml:space="preserve">#28  </w:t>
-      </w:r>
-      <w:r>
-        <w:rPr>
-          <w:b/>
-          <w:i w:val="0"/>
-        </w:rPr>
-        <w:t>2.5 t</w:t>
-      </w:r>
-    </w:p>
-    <w:p>
-      <w:r>
-        <w:rPr>
-          <w:b/>
-          <w:color w:val="4A7FC1"/>
-        </w:rPr>
-        <w:t xml:space="preserve">#29  </w:t>
-      </w:r>
-      <w:r>
-        <w:rPr>
-          <w:b w:val="0"/>
-          <w:i w:val="0"/>
-        </w:rPr>
-        <w:t>of protein flour a day, as much as 600 hectares of soybeans</w:t>
-      </w:r>
-    </w:p>
-    <w:p>
-      <w:r>
-        <w:rPr>
-          <w:b/>
-          <w:color w:val="4A7FC1"/>
-        </w:rPr>
-        <w:t xml:space="preserve">#30  </w:t>
-      </w:r>
-      <w:r>
-        <w:rPr>
-          <w:b/>
-          <w:i w:val="0"/>
-        </w:rPr>
-        <w:t>30 days</w:t>
-      </w:r>
-    </w:p>
-    <w:p>
-      <w:r>
-        <w:rPr>
-          <w:b/>
-          <w:color w:val="4A7FC1"/>
-        </w:rPr>
-        <w:t xml:space="preserve">#31  </w:t>
-      </w:r>
-      <w:r>
-        <w:rPr>
-          <w:b w:val="0"/>
-          <w:i w:val="0"/>
-        </w:rPr>
-        <w:t>of meals and water for everyone in the Food Reserve Bunker</w:t>
+        <w:t>Melting 3,000 t of snow a day takes about 13 MW, inside the 14 MW of spare fusion heat. Starch from CO₂ is still lab-scale [7].</w:t>
       </w:r>
     </w:p>
     <w:p>
@@ -4850,7 +4825,7 @@
           <w:b/>
           <w:i w:val="0"/>
         </w:rPr>
-        <w:t>SIGNATURE DISTRICT 3 · MOUNT AURORA GEOTHERMAL SPA RESORT</w:t>
+        <w:t>SIGNATURE DISTRICT 3 · MOUNT AURORA</w:t>
       </w:r>
     </w:p>
     <w:p>
@@ -4866,7 +4841,16 @@
           <w:b/>
           <w:i w:val="0"/>
         </w:rPr>
-        <w:t>A Warm Heart Inside the Ice</w:t>
+        <w:t>A Snow Mountain</w:t>
+      </w:r>
+    </w:p>
+    <w:p>
+      <w:r>
+        <w:rPr>
+          <w:b/>
+          <w:i w:val="0"/>
+        </w:rPr>
+        <w:t>You Can Walk Inside</w:t>
       </w:r>
     </w:p>
     <w:p>
@@ -4882,7 +4866,7 @@
           <w:b w:val="0"/>
           <w:i/>
         </w:rPr>
-        <w:t>Inside a 35-metre snow peak shaped like Nepal’s Ama Dablam, four geothermal spa levels stay at 28 °C all winter.</w:t>
+        <w:t>Our big idea: the mountain is the building. Inside a 35-metre snow peak shaped like Nepal’s Ama Dablam, a whole leisure world stays at 28 °C all winter.</w:t>
       </w:r>
     </w:p>
     <w:p>
@@ -5026,7 +5010,7 @@
           <w:b/>
           <w:i w:val="0"/>
         </w:rPr>
-        <w:t>40 °C</w:t>
+        <w:t>WHERE THE WORLD IS TODAY</w:t>
       </w:r>
     </w:p>
     <w:p>
@@ -5042,7 +5026,7 @@
           <w:b w:val="0"/>
           <w:i w:val="0"/>
         </w:rPr>
-        <w:t>Mineral Lake spring</w:t>
+        <w:t>Iceland’s Blue Lagoon bathes visitors in 37–39 °C water from a geothermal power plant [9], and Switzerland’s Therme Vals is cut into a hillside [10]. Mount Aurora goes further: the whole snow peak becomes the building.</w:t>
       </w:r>
     </w:p>
     <w:p>
@@ -5052,6 +5036,54 @@
           <w:color w:val="4A7FC1"/>
         </w:rPr>
         <w:t xml:space="preserve">#3  </w:t>
+      </w:r>
+      <w:r>
+        <w:rPr>
+          <w:b/>
+          <w:i w:val="0"/>
+        </w:rPr>
+        <w:t>REALITY CHECK</w:t>
+      </w:r>
+    </w:p>
+    <w:p>
+      <w:r>
+        <w:rPr>
+          <w:b/>
+          <w:color w:val="4A7FC1"/>
+        </w:rPr>
+        <w:t xml:space="preserve">#4  </w:t>
+      </w:r>
+      <w:r>
+        <w:rPr>
+          <w:b/>
+          <w:i w:val="0"/>
+        </w:rPr>
+        <w:t>73 °C apart</w:t>
+      </w:r>
+    </w:p>
+    <w:p>
+      <w:r>
+        <w:rPr>
+          <w:b/>
+          <w:color w:val="4A7FC1"/>
+        </w:rPr>
+        <w:t xml:space="preserve">#5  </w:t>
+      </w:r>
+      <w:r>
+        <w:rPr>
+          <w:b w:val="0"/>
+          <w:i w:val="0"/>
+        </w:rPr>
+        <w:t>An insulated rock shell holds 28 °C inside at −45 °C outside. It needs a hot spring below, to be confirmed by drilling, and thermosyphons like the Trans-Alaska Pipeline’s [14] keep the ground frozen.</w:t>
+      </w:r>
+    </w:p>
+    <w:p>
+      <w:r>
+        <w:rPr>
+          <w:b/>
+          <w:color w:val="4A7FC1"/>
+        </w:rPr>
+        <w:t xml:space="preserve">#6  </w:t>
       </w:r>
       <w:r>
         <w:rPr>
@@ -5294,7 +5326,14 @@
           <w:b/>
           <w:i w:val="0"/>
         </w:rPr>
-        <w:t>28 °C</w:t>
+        <w:t xml:space="preserve">ALSO A SHELTER  </w:t>
+      </w:r>
+      <w:r>
+        <w:rPr>
+          <w:b w:val="0"/>
+          <w:i w:val="0"/>
+        </w:rPr>
+        <w:t>In a disaster, the mountain becomes a warm refuge for up to 1,000 people: geothermal heat, mineral water and the food reserve keep it running even if the city’s power fails.</w:t>
       </w:r>
     </w:p>
     <w:p>
@@ -5304,182 +5343,6 @@
           <w:color w:val="4A7FC1"/>
         </w:rPr>
         <w:t xml:space="preserve">#13  </w:t>
-      </w:r>
-      <w:r>
-        <w:rPr>
-          <w:b w:val="0"/>
-          <w:i w:val="0"/>
-        </w:rPr>
-        <w:t>inside the spa</w:t>
-      </w:r>
-    </w:p>
-    <w:p>
-      <w:r>
-        <w:rPr>
-          <w:b/>
-          <w:color w:val="4A7FC1"/>
-        </w:rPr>
-        <w:t xml:space="preserve">#14  </w:t>
-      </w:r>
-      <w:r>
-        <w:rPr>
-          <w:b/>
-          <w:i w:val="0"/>
-        </w:rPr>
-        <w:t>40 °C</w:t>
-      </w:r>
-    </w:p>
-    <w:p>
-      <w:r>
-        <w:rPr>
-          <w:b/>
-          <w:color w:val="4A7FC1"/>
-        </w:rPr>
-        <w:t xml:space="preserve">#15  </w:t>
-      </w:r>
-      <w:r>
-        <w:rPr>
-          <w:b w:val="0"/>
-          <w:i w:val="0"/>
-        </w:rPr>
-        <w:t>Mineral Lake spring</w:t>
-      </w:r>
-    </w:p>
-    <w:p>
-      <w:r>
-        <w:rPr>
-          <w:b/>
-          <w:color w:val="4A7FC1"/>
-        </w:rPr>
-        <w:t xml:space="preserve">#16  </w:t>
-      </w:r>
-      <w:r>
-        <w:rPr>
-          <w:b/>
-          <w:i w:val="0"/>
-        </w:rPr>
-        <w:t>39 °C</w:t>
-      </w:r>
-    </w:p>
-    <w:p>
-      <w:r>
-        <w:rPr>
-          <w:b/>
-          <w:color w:val="4A7FC1"/>
-        </w:rPr>
-        <w:t xml:space="preserve">#17  </w:t>
-      </w:r>
-      <w:r>
-        <w:rPr>
-          <w:b w:val="0"/>
-          <w:i w:val="0"/>
-        </w:rPr>
-        <w:t>volcanic mud</w:t>
-      </w:r>
-    </w:p>
-    <w:p>
-      <w:r>
-        <w:rPr>
-          <w:b/>
-          <w:color w:val="4A7FC1"/>
-        </w:rPr>
-        <w:t xml:space="preserve">#18  </w:t>
-      </w:r>
-      <w:r>
-        <w:rPr>
-          <w:b/>
-          <w:i w:val="0"/>
-        </w:rPr>
-        <w:t>75 °C</w:t>
-      </w:r>
-    </w:p>
-    <w:p>
-      <w:r>
-        <w:rPr>
-          <w:b/>
-          <w:color w:val="4A7FC1"/>
-        </w:rPr>
-        <w:t xml:space="preserve">#19  </w:t>
-      </w:r>
-      <w:r>
-        <w:rPr>
-          <w:b w:val="0"/>
-          <w:i w:val="0"/>
-        </w:rPr>
-        <w:t>salt sauna</w:t>
-      </w:r>
-    </w:p>
-    <w:p>
-      <w:r>
-        <w:rPr>
-          <w:b/>
-          <w:color w:val="4A7FC1"/>
-        </w:rPr>
-        <w:t xml:space="preserve">#20  </w:t>
-      </w:r>
-      <w:r>
-        <w:rPr>
-          <w:b/>
-          <w:i w:val="0"/>
-        </w:rPr>
-        <w:t>35 °C</w:t>
-      </w:r>
-    </w:p>
-    <w:p>
-      <w:r>
-        <w:rPr>
-          <w:b/>
-          <w:color w:val="4A7FC1"/>
-        </w:rPr>
-        <w:t xml:space="preserve">#21  </w:t>
-      </w:r>
-      <w:r>
-        <w:rPr>
-          <w:b w:val="0"/>
-          <w:i w:val="0"/>
-        </w:rPr>
-        <w:t>float pool</w:t>
-      </w:r>
-    </w:p>
-    <w:p>
-      <w:r>
-        <w:rPr>
-          <w:b/>
-          <w:color w:val="4A7FC1"/>
-        </w:rPr>
-        <w:t xml:space="preserve">#22  </w:t>
-      </w:r>
-      <w:r>
-        <w:rPr>
-          <w:b/>
-          <w:i w:val="0"/>
-        </w:rPr>
-        <w:t>38 °C</w:t>
-      </w:r>
-    </w:p>
-    <w:p>
-      <w:r>
-        <w:rPr>
-          <w:b/>
-          <w:color w:val="4A7FC1"/>
-        </w:rPr>
-        <w:t xml:space="preserve">#23  </w:t>
-      </w:r>
-      <w:r>
-        <w:rPr>
-          <w:b w:val="0"/>
-          <w:i w:val="0"/>
-        </w:rPr>
-        <w:t>Aurora Lagoon</w:t>
-      </w:r>
-    </w:p>
-    <w:p>
-      <w:r>
-        <w:rPr>
-          <w:b/>
-          <w:color w:val="4A7FC1"/>
-        </w:rPr>
-        <w:t xml:space="preserve">#24  </w:t>
       </w:r>
       <w:r>
         <w:rPr>
@@ -5510,7 +5373,7 @@
           <w:b/>
           <w:i w:val="0"/>
         </w:rPr>
-        <w:t>SIGNATURE INNOVATIONS AT A GLANCE</w:t>
+        <w:t>OUR ECO-POLIS MODEL</w:t>
       </w:r>
     </w:p>
     <w:p>
@@ -5526,7 +5389,7 @@
           <w:b/>
           <w:i w:val="0"/>
         </w:rPr>
-        <w:t>Three Breakthroughs, Checked</w:t>
+        <w:t>Built by Us</w:t>
       </w:r>
     </w:p>
     <w:p>
@@ -5542,7 +5405,7 @@
           <w:b w:val="0"/>
           <w:i/>
         </w:rPr>
-        <w:t>For each idea: the problem it solves, how it works, what is new compared with today’s technology, the science and maths behind it, how realistic it is, and what it changes.</w:t>
+        <w:t>Before any picture in this magazine, we built Aurora Haven ourselves in the Eco-Polis Builder: 241 named places, each with its own purpose and special features.</w:t>
       </w:r>
     </w:p>
     <w:p>
@@ -5555,10 +5418,10 @@
       </w:r>
       <w:r>
         <w:rPr>
-          <w:b/>
-          <w:i w:val="0"/>
-        </w:rPr>
-        <w:t>1 · Fusion Power Station</w:t>
+          <w:b w:val="0"/>
+          <w:i/>
+        </w:rPr>
+        <w:t>The whole city in our Eco-Polis model.</w:t>
       </w:r>
     </w:p>
     <w:p>
@@ -5571,10 +5434,10 @@
       </w:r>
       <w:r>
         <w:rPr>
-          <w:b/>
-          <w:i w:val="0"/>
-        </w:rPr>
-        <w:t>2 · Snow-to-Food &amp; Water Plant</w:t>
+          <w:b w:val="0"/>
+          <w:i/>
+        </w:rPr>
+        <w:t>Fusion Power Station</w:t>
       </w:r>
     </w:p>
     <w:p>
@@ -5587,10 +5450,10 @@
       </w:r>
       <w:r>
         <w:rPr>
-          <w:b/>
-          <w:i w:val="0"/>
-        </w:rPr>
-        <w:t>3 · Mount Aurora Spa</w:t>
+          <w:b w:val="0"/>
+          <w:i/>
+        </w:rPr>
+        <w:t>Snow-to-Food &amp; Water Plant</w:t>
       </w:r>
     </w:p>
     <w:p>
@@ -5603,10 +5466,10 @@
       </w:r>
       <w:r>
         <w:rPr>
-          <w:b/>
-          <w:i w:val="0"/>
-        </w:rPr>
-        <w:t>THE PROBLEM</w:t>
+          <w:b w:val="0"/>
+          <w:i/>
+        </w:rPr>
+        <w:t>Mount Aurora</w:t>
       </w:r>
     </w:p>
     <w:p>
@@ -5620,9 +5483,9 @@
       <w:r>
         <w:rPr>
           <w:b w:val="0"/>
-          <w:i w:val="0"/>
-        </w:rPr>
-        <w:t>Two months without sun and winters of −45 °C. The city needs steady, zero-carbon heat and power every hour of the year.</w:t>
+          <w:i/>
+        </w:rPr>
+        <w:t>Downtown</w:t>
       </w:r>
     </w:p>
     <w:p>
@@ -5635,346 +5498,161 @@
       </w:r>
       <w:r>
         <w:rPr>
+          <w:b/>
+          <w:i w:val="0"/>
+        </w:rPr>
+        <w:t>1 · Download our map</w:t>
+      </w:r>
+    </w:p>
+    <w:p>
+      <w:r>
+        <w:rPr>
+          <w:b/>
+          <w:color w:val="4A7FC1"/>
+        </w:rPr>
+        <w:t xml:space="preserve">#10  </w:t>
+      </w:r>
+      <w:r>
+        <w:rPr>
           <w:b w:val="0"/>
           <w:i w:val="0"/>
         </w:rPr>
-        <w:t>No farmland, and in deep winter supplies can only arrive by air. How do 45,000 people get water and food?</w:t>
-      </w:r>
-    </w:p>
-    <w:p>
-      <w:r>
-        <w:rPr>
-          <w:b/>
-          <w:color w:val="4A7FC1"/>
-        </w:rPr>
-        <w:t xml:space="preserve">#10  </w:t>
+        <w:t>Aurora_Haven.json</w:t>
+      </w:r>
+    </w:p>
+    <w:p>
+      <w:r>
+        <w:rPr>
+          <w:b/>
+          <w:color w:val="4A7FC1"/>
+        </w:rPr>
+        <w:t xml:space="preserve">#11  </w:t>
+      </w:r>
+      <w:r>
+        <w:rPr>
+          <w:b/>
+          <w:i w:val="0"/>
+        </w:rPr>
+        <w:t>2 · Open Eco-Polis</w:t>
+      </w:r>
+    </w:p>
+    <w:p>
+      <w:r>
+        <w:rPr>
+          <w:b/>
+          <w:color w:val="4A7FC1"/>
+        </w:rPr>
+        <w:t xml:space="preserve">#12  </w:t>
       </w:r>
       <w:r>
         <w:rPr>
           <w:b w:val="0"/>
           <w:i w:val="0"/>
         </w:rPr>
-        <w:t>Months of darkness and cold keep people indoors, and a city needs a warm public place to rest, meet and shelter in a disaster.</w:t>
-      </w:r>
-    </w:p>
-    <w:p>
-      <w:r>
-        <w:rPr>
-          <w:b/>
-          <w:color w:val="4A7FC1"/>
-        </w:rPr>
-        <w:t xml:space="preserve">#11  </w:t>
-      </w:r>
-      <w:r>
-        <w:rPr>
-          <w:b/>
-          <w:i w:val="0"/>
-        </w:rPr>
-        <w:t>HOW IT WORKS</w:t>
-      </w:r>
-    </w:p>
-    <w:p>
-      <w:r>
-        <w:rPr>
-          <w:b/>
-          <w:color w:val="4A7FC1"/>
-        </w:rPr>
-        <w:t xml:space="preserve">#12  </w:t>
+        <w:t>ecopolis3d.netlify.app</w:t>
+      </w:r>
+    </w:p>
+    <w:p>
+      <w:r>
+        <w:rPr>
+          <w:b/>
+          <w:color w:val="4A7FC1"/>
+        </w:rPr>
+        <w:t xml:space="preserve">#13  </w:t>
+      </w:r>
+      <w:r>
+        <w:rPr>
+          <w:b/>
+          <w:i w:val="0"/>
+        </w:rPr>
+        <w:t>EXPLORE OUR 3D CITY</w:t>
+      </w:r>
+    </w:p>
+    <w:p>
+      <w:r>
+        <w:rPr>
+          <w:b/>
+          <w:color w:val="4A7FC1"/>
+        </w:rPr>
+        <w:t xml:space="preserve">#14  </w:t>
+      </w:r>
+      <w:r>
+        <w:rPr>
+          <w:b/>
+          <w:i w:val="0"/>
+        </w:rPr>
+        <w:t xml:space="preserve">1. </w:t>
       </w:r>
       <w:r>
         <w:rPr>
           <w:b w:val="0"/>
           <w:i w:val="0"/>
         </w:rPr>
-        <w:t>A compact D-T tokamak: superconducting magnets hold a 150-million-degree plasma. 800 MW of heat becomes 300 MW of electricity and 450 MW of district heat (page 16).</w:t>
-      </w:r>
-    </w:p>
-    <w:p>
-      <w:r>
-        <w:rPr>
-          <w:b/>
-          <w:color w:val="4A7FC1"/>
-        </w:rPr>
-        <w:t xml:space="preserve">#13  </w:t>
+        <w:t>Scan the first code to download our map file.</w:t>
+      </w:r>
+    </w:p>
+    <w:p>
+      <w:r>
+        <w:rPr>
+          <w:b/>
+          <w:i w:val="0"/>
+        </w:rPr>
+        <w:t xml:space="preserve">2. </w:t>
       </w:r>
       <w:r>
         <w:rPr>
           <w:b w:val="0"/>
           <w:i w:val="0"/>
         </w:rPr>
-        <w:t>Spare fusion heat melts 3,000 t of snow a day into drinking water. Electrolysis and air capture make hydrogen, oxygen and CO₂, which become starch, fats and microbial protein (page 18).</w:t>
-      </w:r>
-    </w:p>
-    <w:p>
-      <w:r>
-        <w:rPr>
-          <w:b/>
-          <w:color w:val="4A7FC1"/>
-        </w:rPr>
-        <w:t xml:space="preserve">#14  </w:t>
+        <w:t>Scan the second code to open the Eco-Polis Builder.</w:t>
+      </w:r>
+    </w:p>
+    <w:p>
+      <w:r>
+        <w:rPr>
+          <w:b/>
+          <w:i w:val="0"/>
+        </w:rPr>
+        <w:t xml:space="preserve">3. </w:t>
       </w:r>
       <w:r>
         <w:rPr>
           <w:b w:val="0"/>
           <w:i w:val="0"/>
         </w:rPr>
-        <w:t>A 40 °C geothermal spring fills a 7 × 13 m Mineral Lake inside an insulated rock shell that keeps four spa levels at 28 °C; the overflow feeds the 38 °C lagoon outside (page 22).</w:t>
-      </w:r>
-    </w:p>
-    <w:p>
-      <w:r>
-        <w:rPr>
-          <w:b/>
-          <w:color w:val="4A7FC1"/>
-        </w:rPr>
-        <w:t xml:space="preserve">#15  </w:t>
-      </w:r>
-      <w:r>
-        <w:rPr>
-          <w:b/>
-          <w:i w:val="0"/>
-        </w:rPr>
-        <w:t>WHAT IS NEW</w:t>
-      </w:r>
-    </w:p>
-    <w:p>
-      <w:r>
-        <w:rPr>
-          <w:b/>
-          <w:color w:val="4A7FC1"/>
-        </w:rPr>
-        <w:t xml:space="preserve">#16  </w:t>
+        <w:t>Click the Load button (folder icon) and choose Aurora_Haven.json.</w:t>
+      </w:r>
+    </w:p>
+    <w:p>
+      <w:r>
+        <w:rPr>
+          <w:b/>
+          <w:i w:val="0"/>
+        </w:rPr>
+        <w:t xml:space="preserve">4. </w:t>
       </w:r>
       <w:r>
         <w:rPr>
           <w:b w:val="0"/>
           <w:i w:val="0"/>
         </w:rPr>
-        <w:t>Fusion machines are still experiments: ITER plans its first D-T plasma in 2039 [4], and the compact SPARC tokamak aims for first plasma around 2027 [5]. Our idea: put one inside a city, so its waste heat warms homes and melts snow for food.</w:t>
-      </w:r>
-    </w:p>
-    <w:p>
-      <w:r>
-        <w:rPr>
-          <w:b/>
-          <w:color w:val="4A7FC1"/>
-        </w:rPr>
-        <w:t xml:space="preserve">#17  </w:t>
+        <w:t>Click Lock (View), then Full Screen.</w:t>
+      </w:r>
+    </w:p>
+    <w:p>
+      <w:r>
+        <w:rPr>
+          <w:b/>
+          <w:i w:val="0"/>
+        </w:rPr>
+        <w:t xml:space="preserve">5. </w:t>
       </w:r>
       <w:r>
         <w:rPr>
           <w:b w:val="0"/>
           <w:i w:val="0"/>
         </w:rPr>
-        <w:t>Each step exists alone: Solein protein from hydrogen-eating microbes has been made in Finland since 2024 [6], starch has been made from CO₂ in a lab [7], and direct air capture runs in Iceland [8]. Our idea: link them in one plant, run on heat that would be wasted.</w:t>
-      </w:r>
-    </w:p>
-    <w:p>
-      <w:r>
-        <w:rPr>
-          <w:b/>
-          <w:color w:val="4A7FC1"/>
-        </w:rPr>
-        <w:t xml:space="preserve">#18  </w:t>
-      </w:r>
-      <w:r>
-        <w:rPr>
-          <w:b w:val="0"/>
-          <w:i w:val="0"/>
-        </w:rPr>
-        <w:t>Iceland’s Blue Lagoon bathes visitors in 37–39 °C water from a geothermal power plant [9], and Switzerland’s Therme Vals is built into a hillside [10]. Our idea: a whole spa inside a snow peak that doubles as a warm refuge for 1,000 people.</w:t>
-      </w:r>
-    </w:p>
-    <w:p>
-      <w:r>
-        <w:rPr>
-          <w:b/>
-          <w:color w:val="4A7FC1"/>
-        </w:rPr>
-        <w:t xml:space="preserve">#19  </w:t>
-      </w:r>
-      <w:r>
-        <w:rPr>
-          <w:b/>
-          <w:i w:val="0"/>
-        </w:rPr>
-        <w:t>STEAM CHECK</w:t>
-      </w:r>
-    </w:p>
-    <w:p>
-      <w:r>
-        <w:rPr>
-          <w:b/>
-          <w:color w:val="4A7FC1"/>
-        </w:rPr>
-        <w:t xml:space="preserve">#20  </w:t>
-      </w:r>
-      <w:r>
-        <w:rPr>
-          <w:b w:val="0"/>
-          <w:i w:val="0"/>
-        </w:rPr>
-        <w:t>Maths: 800 MW for a day is 6.9 × 10¹³ J. One kilogram of D-T fuel releases about 3.4 × 10¹⁴ J, so the plasma burns about 0.2 kg a day; heat from the lithium blanket brings this close to our 170 g. Useful energy: (300 + 450) ÷ 800 ≈ 94%.</w:t>
-      </w:r>
-    </w:p>
-    <w:p>
-      <w:r>
-        <w:rPr>
-          <w:b/>
-          <w:color w:val="4A7FC1"/>
-        </w:rPr>
-        <w:t xml:space="preserve">#21  </w:t>
-      </w:r>
-      <w:r>
-        <w:rPr>
-          <w:b w:val="0"/>
-          <w:i w:val="0"/>
-        </w:rPr>
-        <w:t>Physics: melting ice takes 334 kJ/kg, so 3,000 t a day needs about 1.0 × 10¹² J, or 11.6 MW; warming the snow from −20 °C adds about 1.5 MW. Total ≈ 13 MW, inside the 14 MW of spare fusion heat. 2,500 m³ a day is 55 L per person.</w:t>
-      </w:r>
-    </w:p>
-    <w:p>
-      <w:r>
-        <w:rPr>
-          <w:b/>
-          <w:color w:val="4A7FC1"/>
-        </w:rPr>
-        <w:t xml:space="preserve">#22  </w:t>
-      </w:r>
-      <w:r>
-        <w:rPr>
-          <w:b w:val="0"/>
-          <w:i w:val="0"/>
-        </w:rPr>
-        <w:t>Engineering: the shell holds a 73 °C difference, −45 °C outside and 28 °C inside. Science: the water is used twice, 40 °C in the lake, then 38 °C in the lagoon, before it returns to the geothermal loop. Arts: the peak’s shape comes from Nepal’s Ama Dablam.</w:t>
-      </w:r>
-    </w:p>
-    <w:p>
-      <w:r>
-        <w:rPr>
-          <w:b/>
-          <w:color w:val="4A7FC1"/>
-        </w:rPr>
-        <w:t xml:space="preserve">#23  </w:t>
-      </w:r>
-      <w:r>
-        <w:rPr>
-          <w:b/>
-          <w:i w:val="0"/>
-        </w:rPr>
-        <w:t>FEASIBILITY &amp; LIMITS</w:t>
-      </w:r>
-    </w:p>
-    <w:p>
-      <w:r>
-        <w:rPr>
-          <w:b/>
-          <w:color w:val="4A7FC1"/>
-        </w:rPr>
-        <w:t xml:space="preserve">#24  </w:t>
-      </w:r>
-      <w:r>
-        <w:rPr>
-          <w:b w:val="0"/>
-          <w:i w:val="0"/>
-        </w:rPr>
-        <w:t>A future concept: no fusion plant sells power today, and breeding tritium at scale is still unproven [11]. Costs are huge: ITER alone is estimated at €18–22 billion to first plasma [12]. Plan B: the geothermal plant and a 12-hour heat tank.</w:t>
-      </w:r>
-    </w:p>
-    <w:p>
-      <w:r>
-        <w:rPr>
-          <w:b/>
-          <w:color w:val="4A7FC1"/>
-        </w:rPr>
-        <w:t xml:space="preserve">#25  </w:t>
-      </w:r>
-      <w:r>
-        <w:rPr>
-          <w:b w:val="0"/>
-          <w:i w:val="0"/>
-        </w:rPr>
-        <w:t>Possible in parts today, hard at city scale: Solar Foods’ first factory makes up to 160 t a year [6], CO₂-to-starch is still lab-scale, and direct air capture is energy-hungry and costly [13]. New foods need safety approval and people’s trust.</w:t>
-      </w:r>
-    </w:p>
-    <w:p>
-      <w:r>
-        <w:rPr>
-          <w:b/>
-          <w:color w:val="4A7FC1"/>
-        </w:rPr>
-        <w:t xml:space="preserve">#26  </w:t>
-      </w:r>
-      <w:r>
-        <w:rPr>
-          <w:b w:val="0"/>
-          <w:i w:val="0"/>
-        </w:rPr>
-        <w:t>Needs a hot geothermal source under the site, to be confirmed by drilling. Building inside a frozen mountain is costly, and no heat may reach the permafrost: thermosyphons like those on the Trans-Alaska Pipeline [14] keep the ground frozen.</w:t>
-      </w:r>
-    </w:p>
-    <w:p>
-      <w:r>
-        <w:rPr>
-          <w:b/>
-          <w:color w:val="4A7FC1"/>
-        </w:rPr>
-        <w:t xml:space="preserve">#27  </w:t>
-      </w:r>
-      <w:r>
-        <w:rPr>
-          <w:b/>
-          <w:i w:val="0"/>
-        </w:rPr>
-        <w:t>IMPACT</w:t>
-      </w:r>
-    </w:p>
-    <w:p>
-      <w:r>
-        <w:rPr>
-          <w:b/>
-          <w:color w:val="4A7FC1"/>
-        </w:rPr>
-        <w:t xml:space="preserve">#28  </w:t>
-      </w:r>
-      <w:r>
-        <w:rPr>
-          <w:b w:val="0"/>
-          <w:i w:val="0"/>
-        </w:rPr>
-        <w:t>Zero-carbon heat and power for 45,000 people, no fuel deliveries, helium for the hospital’s MRI scanners, and a converter that turns about 20 t of rubbish a day into gas and paving.</w:t>
-      </w:r>
-    </w:p>
-    <w:p>
-      <w:r>
-        <w:rPr>
-          <w:b/>
-          <w:color w:val="4A7FC1"/>
-        </w:rPr>
-        <w:t xml:space="preserve">#29  </w:t>
-      </w:r>
-      <w:r>
-        <w:rPr>
-          <w:b w:val="0"/>
-          <w:i w:val="0"/>
-        </w:rPr>
-        <w:t>All tap water and about half of the protein made locally, about 20 t of CO₂ taken from the air every day, fewer cargo flights, and a 30-day food reserve.</w:t>
-      </w:r>
-    </w:p>
-    <w:p>
-      <w:r>
-        <w:rPr>
-          <w:b/>
-          <w:color w:val="4A7FC1"/>
-        </w:rPr>
-        <w:t xml:space="preserve">#30  </w:t>
-      </w:r>
-      <w:r>
-        <w:rPr>
-          <w:b w:val="0"/>
-          <w:i w:val="0"/>
-        </w:rPr>
-        <w:t>Rest and health through the polar night, tourism and jobs, cafés serving food from the plant, and shelter for up to 1,000 people in an emergency.</w:t>
+        <w:t>Drag to turn, scroll to zoom, and click a building to read about it.</w:t>
       </w:r>
     </w:p>
     <w:p>
@@ -6735,7 +6413,7 @@
           <w:b/>
           <w:i w:val="0"/>
         </w:rPr>
-        <w:t>900</w:t>
+        <w:t>5,000</w:t>
       </w:r>
     </w:p>
     <w:p>
@@ -6751,71 +6429,7 @@
           <w:b w:val="0"/>
           <w:i w:val="0"/>
         </w:rPr>
-        <w:t>pupils at Northern Lights School</w:t>
-      </w:r>
-    </w:p>
-    <w:p>
-      <w:r>
-        <w:rPr>
-          <w:b/>
-          <w:color w:val="4A7FC1"/>
-        </w:rPr>
-        <w:t xml:space="preserve">#19  </w:t>
-      </w:r>
-      <w:r>
-        <w:rPr>
-          <w:b/>
-          <w:i w:val="0"/>
-        </w:rPr>
-        <w:t>5,000</w:t>
-      </w:r>
-    </w:p>
-    <w:p>
-      <w:r>
-        <w:rPr>
-          <w:b/>
-          <w:color w:val="4A7FC1"/>
-        </w:rPr>
-        <w:t xml:space="preserve">#20  </w:t>
-      </w:r>
-      <w:r>
-        <w:rPr>
-          <w:b w:val="0"/>
-          <w:i w:val="0"/>
-        </w:rPr>
         <w:t>students at Arctic University</w:t>
-      </w:r>
-    </w:p>
-    <w:p>
-      <w:r>
-        <w:rPr>
-          <w:b/>
-          <w:color w:val="4A7FC1"/>
-        </w:rPr>
-        <w:t xml:space="preserve">#21  </w:t>
-      </w:r>
-      <w:r>
-        <w:rPr>
-          <w:b/>
-          <w:i w:val="0"/>
-        </w:rPr>
-        <w:t>8,000</w:t>
-      </w:r>
-    </w:p>
-    <w:p>
-      <w:r>
-        <w:rPr>
-          <w:b/>
-          <w:color w:val="4A7FC1"/>
-        </w:rPr>
-        <w:t xml:space="preserve">#22  </w:t>
-      </w:r>
-      <w:r>
-        <w:rPr>
-          <w:b w:val="0"/>
-          <w:i w:val="0"/>
-        </w:rPr>
-        <w:t>seats in the Snow Stadium</w:t>
       </w:r>
     </w:p>
     <w:p>
@@ -7359,7 +6973,7 @@
           <w:b w:val="0"/>
           <w:i/>
         </w:rPr>
-        <w:t>The sun disappears for two months, so the city uses sources that cover for each other.</w:t>
+        <w:t>Wind and sun start the city’s own sun. Once fusion is running, they step back and stand guard.</w:t>
       </w:r>
     </w:p>
     <w:p>
@@ -7375,7 +6989,7 @@
           <w:b/>
           <w:i w:val="0"/>
         </w:rPr>
-        <w:t>Steady</w:t>
+        <w:t>1 · START-UP</w:t>
       </w:r>
     </w:p>
     <w:p>
@@ -7391,7 +7005,7 @@
           <w:b/>
           <w:i w:val="0"/>
         </w:rPr>
-        <w:t>Fusion</w:t>
+        <w:t>200 MWh</w:t>
       </w:r>
     </w:p>
     <w:p>
@@ -7407,7 +7021,7 @@
           <w:b w:val="0"/>
           <w:i w:val="0"/>
         </w:rPr>
-        <w:t>Steady power and heat all year, even in total darkness.</w:t>
+        <w:t>The Ice-Proof Wind Farm (60 MW) and the Bifacial Solar Farm fill the battery bank, which gives the big burst of power that starts the reactor’s magnets and heaters. The panels also catch light off the snow: tests in snowy Canada found about +19% [17].</w:t>
       </w:r>
     </w:p>
     <w:p>
@@ -7423,7 +7037,7 @@
           <w:b/>
           <w:i w:val="0"/>
         </w:rPr>
-        <w:t>60 MW</w:t>
+        <w:t>2 · RUNNING</w:t>
       </w:r>
     </w:p>
     <w:p>
@@ -7439,7 +7053,7 @@
           <w:b/>
           <w:i w:val="0"/>
         </w:rPr>
-        <w:t>Ice-proof wind farm</w:t>
+        <w:t>300 + 450 MW</w:t>
       </w:r>
     </w:p>
     <w:p>
@@ -7455,7 +7069,7 @@
           <w:b w:val="0"/>
           <w:i w:val="0"/>
         </w:rPr>
-        <w:t>Heated blades keep turning in freezing fog; most power comes in stormy winter.</w:t>
+        <w:t>Once the plasma burns, the fusion station keeps itself going and gives the whole city electricity and heat, day and polar night.</w:t>
       </w:r>
     </w:p>
     <w:p>
@@ -7471,7 +7085,7 @@
           <w:b/>
           <w:i w:val="0"/>
         </w:rPr>
-        <w:t>+25%</w:t>
+        <w:t>3 · BACKUP</w:t>
       </w:r>
     </w:p>
     <w:p>
@@ -7487,7 +7101,7 @@
           <w:b/>
           <w:i w:val="0"/>
         </w:rPr>
-        <w:t>Bifacial solar farm</w:t>
+        <w:t>12 h</w:t>
       </w:r>
     </w:p>
     <w:p>
@@ -7503,151 +7117,7 @@
           <w:b w:val="0"/>
           <w:i w:val="0"/>
         </w:rPr>
-        <w:t>Snow reflects light onto the panel backs. We plan for +25%; tests in snowy Canada measured about +19% [17].</w:t>
-      </w:r>
-    </w:p>
-    <w:p>
-      <w:r>
-        <w:rPr>
-          <w:b/>
-          <w:color w:val="4A7FC1"/>
-        </w:rPr>
-        <w:t xml:space="preserve">#14  </w:t>
-      </w:r>
-      <w:r>
-        <w:rPr>
-          <w:b/>
-          <w:i w:val="0"/>
-        </w:rPr>
-        <w:t>24/7</w:t>
-      </w:r>
-    </w:p>
-    <w:p>
-      <w:r>
-        <w:rPr>
-          <w:b/>
-          <w:color w:val="4A7FC1"/>
-        </w:rPr>
-        <w:t xml:space="preserve">#15  </w:t>
-      </w:r>
-      <w:r>
-        <w:rPr>
-          <w:b/>
-          <w:i w:val="0"/>
-        </w:rPr>
-        <w:t>Geothermal plant</w:t>
-      </w:r>
-    </w:p>
-    <w:p>
-      <w:r>
-        <w:rPr>
-          <w:b/>
-          <w:color w:val="4A7FC1"/>
-        </w:rPr>
-        <w:t xml:space="preserve">#16  </w:t>
-      </w:r>
-      <w:r>
-        <w:rPr>
-          <w:b w:val="0"/>
-          <w:i w:val="0"/>
-        </w:rPr>
-        <w:t>Clean electricity and hot water around the clock, and the second heat source.</w:t>
-      </w:r>
-    </w:p>
-    <w:p>
-      <w:r>
-        <w:rPr>
-          <w:b/>
-          <w:color w:val="4A7FC1"/>
-        </w:rPr>
-        <w:t xml:space="preserve">#17  </w:t>
-      </w:r>
-      <w:r>
-        <w:rPr>
-          <w:b/>
-          <w:i w:val="0"/>
-        </w:rPr>
-        <w:t>200 MWh</w:t>
-      </w:r>
-    </w:p>
-    <w:p>
-      <w:r>
-        <w:rPr>
-          <w:b/>
-          <w:color w:val="4A7FC1"/>
-        </w:rPr>
-        <w:t xml:space="preserve">#18  </w:t>
-      </w:r>
-      <w:r>
-        <w:rPr>
-          <w:b/>
-          <w:i w:val="0"/>
-        </w:rPr>
-        <w:t>Battery bank</w:t>
-      </w:r>
-    </w:p>
-    <w:p>
-      <w:r>
-        <w:rPr>
-          <w:b/>
-          <w:color w:val="4A7FC1"/>
-        </w:rPr>
-        <w:t xml:space="preserve">#19  </w:t>
-      </w:r>
-      <w:r>
-        <w:rPr>
-          <w:b w:val="0"/>
-          <w:i w:val="0"/>
-        </w:rPr>
-        <w:t>Recycled car batteries store spare wind and solar power for calm, dark days.</w:t>
-      </w:r>
-    </w:p>
-    <w:p>
-      <w:r>
-        <w:rPr>
-          <w:b/>
-          <w:color w:val="4A7FC1"/>
-        </w:rPr>
-        <w:t xml:space="preserve">#20  </w:t>
-      </w:r>
-      <w:r>
-        <w:rPr>
-          <w:b/>
-          <w:i w:val="0"/>
-        </w:rPr>
-        <w:t>12 h</w:t>
-      </w:r>
-    </w:p>
-    <w:p>
-      <w:r>
-        <w:rPr>
-          <w:b/>
-          <w:color w:val="4A7FC1"/>
-        </w:rPr>
-        <w:t xml:space="preserve">#21  </w:t>
-      </w:r>
-      <w:r>
-        <w:rPr>
-          <w:b/>
-          <w:i w:val="0"/>
-        </w:rPr>
-        <w:t>Heat storage tank</w:t>
-      </w:r>
-    </w:p>
-    <w:p>
-      <w:r>
-        <w:rPr>
-          <w:b/>
-          <w:color w:val="4A7FC1"/>
-        </w:rPr>
-        <w:t xml:space="preserve">#22  </w:t>
-      </w:r>
-      <w:r>
-        <w:rPr>
-          <w:b w:val="0"/>
-          <w:i w:val="0"/>
-        </w:rPr>
-        <w:t>Keeps homes warm if a heat source stops, losing less than 1% of its heat a day.</w:t>
+        <w:t>If the reactor stops for repair, wind, sun, the batteries, the 24-hour geothermal plant and the 12-hour heat tank take over, so no home goes cold.</w:t>
       </w:r>
     </w:p>
     <w:p>
@@ -8530,7 +8000,7 @@
           <w:b/>
           <w:i w:val="0"/>
         </w:rPr>
-        <w:t>Users</w:t>
+        <w:t>Who rides</w:t>
       </w:r>
     </w:p>
     <w:p>
@@ -8562,7 +8032,7 @@
           <w:b/>
           <w:i w:val="0"/>
         </w:rPr>
-        <w:t>Capacity</w:t>
+        <w:t>How many</w:t>
       </w:r>
     </w:p>
     <w:p>
@@ -8594,7 +8064,7 @@
           <w:b/>
           <w:i w:val="0"/>
         </w:rPr>
-        <w:t>Safety</w:t>
+        <w:t>Safe in a storm</w:t>
       </w:r>
     </w:p>
     <w:p>
@@ -8626,7 +8096,7 @@
           <w:b/>
           <w:i w:val="0"/>
         </w:rPr>
-        <w:t>Energy</w:t>
+        <w:t>Powered by</w:t>
       </w:r>
     </w:p>
     <w:p>
@@ -8674,7 +8144,7 @@
           <w:b w:val="0"/>
           <w:i w:val="0"/>
         </w:rPr>
-        <w:t>Aurora Line trains at rush hour</w:t>
+        <w:t>between trains at rush hour</w:t>
       </w:r>
     </w:p>
     <w:p>
@@ -8690,7 +8160,7 @@
           <w:b/>
           <w:i w:val="0"/>
         </w:rPr>
-        <w:t>90 s</w:t>
+        <w:t>30%</w:t>
       </w:r>
     </w:p>
     <w:p>
@@ -8706,7 +8176,7 @@
           <w:b w:val="0"/>
           <w:i w:val="0"/>
         </w:rPr>
-        <w:t>Glacier Line after big stadium events</w:t>
+        <w:t>of train energy returned by braking</w:t>
       </w:r>
     </w:p>
     <w:p>
@@ -8722,7 +8192,7 @@
           <w:b/>
           <w:i w:val="0"/>
         </w:rPr>
-        <w:t>30%</w:t>
+        <w:t>2,800 m</w:t>
       </w:r>
     </w:p>
     <w:p>
@@ -8738,71 +8208,7 @@
           <w:b w:val="0"/>
           <w:i w:val="0"/>
         </w:rPr>
-        <w:t>of train energy returned by braking</w:t>
-      </w:r>
-    </w:p>
-    <w:p>
-      <w:r>
-        <w:rPr>
-          <w:b/>
-          <w:color w:val="4A7FC1"/>
-        </w:rPr>
-        <w:t xml:space="preserve">#22  </w:t>
-      </w:r>
-      <w:r>
-        <w:rPr>
-          <w:b/>
-          <w:i w:val="0"/>
-        </w:rPr>
-        <w:t>2,800 m</w:t>
-      </w:r>
-    </w:p>
-    <w:p>
-      <w:r>
-        <w:rPr>
-          <w:b/>
-          <w:color w:val="4A7FC1"/>
-        </w:rPr>
-        <w:t xml:space="preserve">#23  </w:t>
-      </w:r>
-      <w:r>
-        <w:rPr>
-          <w:b w:val="0"/>
-          <w:i w:val="0"/>
-        </w:rPr>
         <w:t>heated airport runway</w:t>
-      </w:r>
-    </w:p>
-    <w:p>
-      <w:r>
-        <w:rPr>
-          <w:b/>
-          <w:color w:val="4A7FC1"/>
-        </w:rPr>
-        <w:t xml:space="preserve">#24  </w:t>
-      </w:r>
-      <w:r>
-        <w:rPr>
-          <w:b/>
-          <w:i w:val="0"/>
-        </w:rPr>
-        <w:t>20 km/h</w:t>
-      </w:r>
-    </w:p>
-    <w:p>
-      <w:r>
-        <w:rPr>
-          <w:b/>
-          <w:color w:val="4A7FC1"/>
-        </w:rPr>
-        <w:t xml:space="preserve">#25  </w:t>
-      </w:r>
-      <w:r>
-        <w:rPr>
-          <w:b w:val="0"/>
-          <w:i w:val="0"/>
-        </w:rPr>
-        <w:t>downtown speed limit</w:t>
       </w:r>
     </w:p>
     <w:p>
@@ -9108,7 +8514,7 @@
           <w:b/>
           <w:i w:val="0"/>
         </w:rPr>
-        <w:t>4 min</w:t>
+        <w:t>30 days</w:t>
       </w:r>
     </w:p>
     <w:p>
@@ -9124,7 +8530,7 @@
           <w:b w:val="0"/>
           <w:i w:val="0"/>
         </w:rPr>
-        <w:t>to any downtown address</w:t>
+        <w:t>of supplies for every resident</w:t>
       </w:r>
     </w:p>
     <w:p>
@@ -9140,7 +8546,7 @@
           <w:b/>
           <w:i w:val="0"/>
         </w:rPr>
-        <w:t>10 min</w:t>
+        <w:t>48 h</w:t>
       </w:r>
     </w:p>
     <w:p>
@@ -9150,102 +8556,6 @@
           <w:color w:val="4A7FC1"/>
         </w:rPr>
         <w:t xml:space="preserve">#11  </w:t>
-      </w:r>
-      <w:r>
-        <w:rPr>
-          <w:b w:val="0"/>
-          <w:i w:val="0"/>
-        </w:rPr>
-        <w:t>for the rescue helicopter to be airborne</w:t>
-      </w:r>
-    </w:p>
-    <w:p>
-      <w:r>
-        <w:rPr>
-          <w:b/>
-          <w:color w:val="4A7FC1"/>
-        </w:rPr>
-        <w:t xml:space="preserve">#12  </w:t>
-      </w:r>
-      <w:r>
-        <w:rPr>
-          <w:b/>
-          <w:i w:val="0"/>
-        </w:rPr>
-        <w:t>4</w:t>
-      </w:r>
-    </w:p>
-    <w:p>
-      <w:r>
-        <w:rPr>
-          <w:b/>
-          <w:color w:val="4A7FC1"/>
-        </w:rPr>
-        <w:t xml:space="preserve">#13  </w:t>
-      </w:r>
-      <w:r>
-        <w:rPr>
-          <w:b w:val="0"/>
-          <w:i w:val="0"/>
-        </w:rPr>
-        <w:t>underground shelters</w:t>
-      </w:r>
-    </w:p>
-    <w:p>
-      <w:r>
-        <w:rPr>
-          <w:b/>
-          <w:color w:val="4A7FC1"/>
-        </w:rPr>
-        <w:t xml:space="preserve">#14  </w:t>
-      </w:r>
-      <w:r>
-        <w:rPr>
-          <w:b/>
-          <w:i w:val="0"/>
-        </w:rPr>
-        <w:t>30 days</w:t>
-      </w:r>
-    </w:p>
-    <w:p>
-      <w:r>
-        <w:rPr>
-          <w:b/>
-          <w:color w:val="4A7FC1"/>
-        </w:rPr>
-        <w:t xml:space="preserve">#15  </w:t>
-      </w:r>
-      <w:r>
-        <w:rPr>
-          <w:b w:val="0"/>
-          <w:i w:val="0"/>
-        </w:rPr>
-        <w:t>of supplies for every resident</w:t>
-      </w:r>
-    </w:p>
-    <w:p>
-      <w:r>
-        <w:rPr>
-          <w:b/>
-          <w:color w:val="4A7FC1"/>
-        </w:rPr>
-        <w:t xml:space="preserve">#16  </w:t>
-      </w:r>
-      <w:r>
-        <w:rPr>
-          <w:b/>
-          <w:i w:val="0"/>
-        </w:rPr>
-        <w:t>48 h</w:t>
-      </w:r>
-    </w:p>
-    <w:p>
-      <w:r>
-        <w:rPr>
-          <w:b/>
-          <w:color w:val="4A7FC1"/>
-        </w:rPr>
-        <w:t xml:space="preserve">#17  </w:t>
       </w:r>
       <w:r>
         <w:rPr>
@@ -12613,7 +11923,7 @@
           <w:b/>
           <w:i w:val="0"/>
         </w:rPr>
-        <w:t>KEY FIGURES</w:t>
+        <w:t>A DAY IN AURORA HAVEN · AN IMAGINED STORY</w:t>
       </w:r>
     </w:p>
     <w:p>
@@ -12629,7 +11939,7 @@
           <w:b/>
           <w:i w:val="0"/>
         </w:rPr>
-        <w:t>Aurora Haven by the Numbers</w:t>
+        <w:t>Through a Resident’s Eyes</w:t>
       </w:r>
     </w:p>
     <w:p>
@@ -12639,909 +11949,132 @@
           <w:color w:val="4A7FC1"/>
         </w:rPr>
         <w:t xml:space="preserve">#3  </w:t>
-      </w:r>
-      <w:r>
-        <w:rPr>
-          <w:b/>
-          <w:i w:val="0"/>
-        </w:rPr>
-        <w:t>THE CITY</w:t>
-      </w:r>
-    </w:p>
-    <w:p>
-      <w:r>
-        <w:rPr>
-          <w:b/>
-          <w:color w:val="4A7FC1"/>
-        </w:rPr>
-        <w:t xml:space="preserve">#4  </w:t>
-      </w:r>
-      <w:r>
-        <w:rPr>
-          <w:b/>
-          <w:i w:val="0"/>
-        </w:rPr>
-        <w:t>45,000</w:t>
-      </w:r>
-    </w:p>
-    <w:p>
-      <w:r>
-        <w:rPr>
-          <w:b/>
-          <w:color w:val="4A7FC1"/>
-        </w:rPr>
-        <w:t xml:space="preserve">#5  </w:t>
-      </w:r>
-      <w:r>
-        <w:rPr>
-          <w:b w:val="0"/>
-          <w:i w:val="0"/>
-        </w:rPr>
-        <w:t>residents</w:t>
-      </w:r>
-    </w:p>
-    <w:p>
-      <w:r>
-        <w:rPr>
-          <w:b/>
-          <w:color w:val="4A7FC1"/>
-        </w:rPr>
-        <w:t xml:space="preserve">#6  </w:t>
-      </w:r>
-      <w:r>
-        <w:rPr>
-          <w:b/>
-          <w:i w:val="0"/>
-        </w:rPr>
-        <w:t>9</w:t>
-      </w:r>
-    </w:p>
-    <w:p>
-      <w:r>
-        <w:rPr>
-          <w:b/>
-          <w:color w:val="4A7FC1"/>
-        </w:rPr>
-        <w:t xml:space="preserve">#7  </w:t>
-      </w:r>
-      <w:r>
-        <w:rPr>
-          <w:b w:val="0"/>
-          <w:i w:val="0"/>
-        </w:rPr>
-        <w:t>downtown blocks</w:t>
-      </w:r>
-    </w:p>
-    <w:p>
-      <w:r>
-        <w:rPr>
-          <w:b/>
-          <w:color w:val="4A7FC1"/>
-        </w:rPr>
-        <w:t xml:space="preserve">#8  </w:t>
-      </w:r>
-      <w:r>
-        <w:rPr>
-          <w:b/>
-          <w:i w:val="0"/>
-        </w:rPr>
-        <w:t>35</w:t>
-      </w:r>
-    </w:p>
-    <w:p>
-      <w:r>
-        <w:rPr>
-          <w:b/>
-          <w:color w:val="4A7FC1"/>
-        </w:rPr>
-        <w:t xml:space="preserve">#9  </w:t>
-      </w:r>
-      <w:r>
-        <w:rPr>
-          <w:b w:val="0"/>
-          <w:i w:val="0"/>
-        </w:rPr>
-        <w:t>key places</w:t>
-      </w:r>
-    </w:p>
-    <w:p>
-      <w:r>
-        <w:rPr>
-          <w:b/>
-          <w:color w:val="4A7FC1"/>
-        </w:rPr>
-        <w:t xml:space="preserve">#10  </w:t>
-      </w:r>
-      <w:r>
-        <w:rPr>
-          <w:b/>
-          <w:i w:val="0"/>
-        </w:rPr>
-        <w:t>CLIMATE</w:t>
-      </w:r>
-    </w:p>
-    <w:p>
-      <w:r>
-        <w:rPr>
-          <w:b/>
-          <w:color w:val="4A7FC1"/>
-        </w:rPr>
-        <w:t xml:space="preserve">#11  </w:t>
-      </w:r>
-      <w:r>
-        <w:rPr>
-          <w:b/>
-          <w:i w:val="0"/>
-        </w:rPr>
-        <w:t>−45 °C</w:t>
-      </w:r>
-    </w:p>
-    <w:p>
-      <w:r>
-        <w:rPr>
-          <w:b/>
-          <w:color w:val="4A7FC1"/>
-        </w:rPr>
-        <w:t xml:space="preserve">#12  </w:t>
-      </w:r>
-      <w:r>
-        <w:rPr>
-          <w:b w:val="0"/>
-          <w:i w:val="0"/>
-        </w:rPr>
-        <w:t>winter lows</w:t>
-      </w:r>
-    </w:p>
-    <w:p>
-      <w:r>
-        <w:rPr>
-          <w:b/>
-          <w:color w:val="4A7FC1"/>
-        </w:rPr>
-        <w:t xml:space="preserve">#13  </w:t>
-      </w:r>
-      <w:r>
-        <w:rPr>
-          <w:b/>
-          <w:i w:val="0"/>
-        </w:rPr>
-        <w:t>2 months</w:t>
-      </w:r>
-    </w:p>
-    <w:p>
-      <w:r>
-        <w:rPr>
-          <w:b/>
-          <w:color w:val="4A7FC1"/>
-        </w:rPr>
-        <w:t xml:space="preserve">#14  </w:t>
-      </w:r>
-      <w:r>
-        <w:rPr>
-          <w:b w:val="0"/>
-          <w:i w:val="0"/>
-        </w:rPr>
-        <w:t>of polar night</w:t>
-      </w:r>
-    </w:p>
-    <w:p>
-      <w:r>
-        <w:rPr>
-          <w:b/>
-          <w:color w:val="4A7FC1"/>
-        </w:rPr>
-        <w:t xml:space="preserve">#15  </w:t>
-      </w:r>
-      <w:r>
-        <w:rPr>
-          <w:b/>
-          <w:i w:val="0"/>
-        </w:rPr>
-        <w:t>120 km/h</w:t>
-      </w:r>
-    </w:p>
-    <w:p>
-      <w:r>
-        <w:rPr>
-          <w:b/>
-          <w:color w:val="4A7FC1"/>
-        </w:rPr>
-        <w:t xml:space="preserve">#16  </w:t>
-      </w:r>
-      <w:r>
-        <w:rPr>
-          <w:b w:val="0"/>
-          <w:i w:val="0"/>
-        </w:rPr>
-        <w:t>blizzards</w:t>
-      </w:r>
-    </w:p>
-    <w:p>
-      <w:r>
-        <w:rPr>
-          <w:b/>
-          <w:color w:val="4A7FC1"/>
-        </w:rPr>
-        <w:t xml:space="preserve">#17  </w:t>
-      </w:r>
-      <w:r>
-        <w:rPr>
-          <w:b/>
-          <w:i w:val="0"/>
-        </w:rPr>
-        <w:t>FUSION POWER STATION</w:t>
-      </w:r>
-    </w:p>
-    <w:p>
-      <w:r>
-        <w:rPr>
-          <w:b/>
-          <w:color w:val="4A7FC1"/>
-        </w:rPr>
-        <w:t xml:space="preserve">#18  </w:t>
-      </w:r>
-      <w:r>
-        <w:rPr>
-          <w:b/>
-          <w:i w:val="0"/>
-        </w:rPr>
-        <w:t>300 MW</w:t>
-      </w:r>
-    </w:p>
-    <w:p>
-      <w:r>
-        <w:rPr>
-          <w:b/>
-          <w:color w:val="4A7FC1"/>
-        </w:rPr>
-        <w:t xml:space="preserve">#19  </w:t>
-      </w:r>
-      <w:r>
-        <w:rPr>
-          <w:b w:val="0"/>
-          <w:i w:val="0"/>
-        </w:rPr>
-        <w:t>electricity</w:t>
-      </w:r>
-    </w:p>
-    <w:p>
-      <w:r>
-        <w:rPr>
-          <w:b/>
-          <w:color w:val="4A7FC1"/>
-        </w:rPr>
-        <w:t xml:space="preserve">#20  </w:t>
-      </w:r>
-      <w:r>
-        <w:rPr>
-          <w:b/>
-          <w:i w:val="0"/>
-        </w:rPr>
-        <w:t>450 MW</w:t>
-      </w:r>
-    </w:p>
-    <w:p>
-      <w:r>
-        <w:rPr>
-          <w:b/>
-          <w:color w:val="4A7FC1"/>
-        </w:rPr>
-        <w:t xml:space="preserve">#21  </w:t>
-      </w:r>
-      <w:r>
-        <w:rPr>
-          <w:b w:val="0"/>
-          <w:i w:val="0"/>
-        </w:rPr>
-        <w:t>district heat</w:t>
-      </w:r>
-    </w:p>
-    <w:p>
-      <w:r>
-        <w:rPr>
-          <w:b/>
-          <w:color w:val="4A7FC1"/>
-        </w:rPr>
-        <w:t xml:space="preserve">#22  </w:t>
-      </w:r>
-      <w:r>
-        <w:rPr>
-          <w:b/>
-          <w:i w:val="0"/>
-        </w:rPr>
-        <w:t>99.8%</w:t>
-      </w:r>
-    </w:p>
-    <w:p>
-      <w:r>
-        <w:rPr>
-          <w:b/>
-          <w:color w:val="4A7FC1"/>
-        </w:rPr>
-        <w:t xml:space="preserve">#23  </w:t>
-      </w:r>
-      <w:r>
-        <w:rPr>
-          <w:b w:val="0"/>
-          <w:i w:val="0"/>
-        </w:rPr>
-        <w:t>heavy-water purity</w:t>
-      </w:r>
-    </w:p>
-    <w:p>
-      <w:r>
-        <w:rPr>
-          <w:b/>
-          <w:color w:val="4A7FC1"/>
-        </w:rPr>
-        <w:t xml:space="preserve">#24  </w:t>
-      </w:r>
-      <w:r>
-        <w:rPr>
-          <w:b/>
-          <w:i w:val="0"/>
-        </w:rPr>
-        <w:t>SNOW-TO-FOOD &amp; WATER PLANT</w:t>
-      </w:r>
-    </w:p>
-    <w:p>
-      <w:r>
-        <w:rPr>
-          <w:b/>
-          <w:color w:val="4A7FC1"/>
-        </w:rPr>
-        <w:t xml:space="preserve">#25  </w:t>
-      </w:r>
-      <w:r>
-        <w:rPr>
-          <w:b/>
-          <w:i w:val="0"/>
-        </w:rPr>
-        <w:t>5 t</w:t>
-      </w:r>
-    </w:p>
-    <w:p>
-      <w:r>
-        <w:rPr>
-          <w:b/>
-          <w:color w:val="4A7FC1"/>
-        </w:rPr>
-        <w:t xml:space="preserve">#26  </w:t>
-      </w:r>
-      <w:r>
-        <w:rPr>
-          <w:b w:val="0"/>
-          <w:i w:val="0"/>
-        </w:rPr>
-        <w:t>hydrogen a day</w:t>
-      </w:r>
-    </w:p>
-    <w:p>
-      <w:r>
-        <w:rPr>
-          <w:b/>
-          <w:color w:val="4A7FC1"/>
-        </w:rPr>
-        <w:t xml:space="preserve">#27  </w:t>
-      </w:r>
-      <w:r>
-        <w:rPr>
-          <w:b/>
-          <w:i w:val="0"/>
-        </w:rPr>
-        <w:t>4 t</w:t>
-      </w:r>
-    </w:p>
-    <w:p>
-      <w:r>
-        <w:rPr>
-          <w:b/>
-          <w:color w:val="4A7FC1"/>
-        </w:rPr>
-        <w:t xml:space="preserve">#28  </w:t>
-      </w:r>
-      <w:r>
-        <w:rPr>
-          <w:b w:val="0"/>
-          <w:i w:val="0"/>
-        </w:rPr>
-        <w:t>starch a day</w:t>
-      </w:r>
-    </w:p>
-    <w:p>
-      <w:r>
-        <w:rPr>
-          <w:b/>
-          <w:color w:val="4A7FC1"/>
-        </w:rPr>
-        <w:t xml:space="preserve">#29  </w:t>
-      </w:r>
-      <w:r>
-        <w:rPr>
-          <w:b/>
-          <w:i w:val="0"/>
-        </w:rPr>
-        <w:t>1 t</w:t>
-      </w:r>
-    </w:p>
-    <w:p>
-      <w:r>
-        <w:rPr>
-          <w:b/>
-          <w:color w:val="4A7FC1"/>
-        </w:rPr>
-        <w:t xml:space="preserve">#30  </w:t>
-      </w:r>
-      <w:r>
-        <w:rPr>
-          <w:b w:val="0"/>
-          <w:i w:val="0"/>
-        </w:rPr>
-        <w:t>fat a day</w:t>
-      </w:r>
-    </w:p>
-    <w:p>
-      <w:r>
-        <w:rPr>
-          <w:b/>
-          <w:color w:val="4A7FC1"/>
-        </w:rPr>
-        <w:t xml:space="preserve">#31  </w:t>
-      </w:r>
-      <w:r>
-        <w:rPr>
-          <w:b/>
-          <w:i w:val="0"/>
-        </w:rPr>
-        <w:t>ENERGY AND STORAGE</w:t>
-      </w:r>
-    </w:p>
-    <w:p>
-      <w:r>
-        <w:rPr>
-          <w:b/>
-          <w:color w:val="4A7FC1"/>
-        </w:rPr>
-        <w:t xml:space="preserve">#32  </w:t>
-      </w:r>
-      <w:r>
-        <w:rPr>
-          <w:b/>
-          <w:i w:val="0"/>
-        </w:rPr>
-        <w:t>60 MW</w:t>
-      </w:r>
-    </w:p>
-    <w:p>
-      <w:r>
-        <w:rPr>
-          <w:b/>
-          <w:color w:val="4A7FC1"/>
-        </w:rPr>
-        <w:t xml:space="preserve">#33  </w:t>
-      </w:r>
-      <w:r>
-        <w:rPr>
-          <w:b w:val="0"/>
-          <w:i w:val="0"/>
-        </w:rPr>
-        <w:t>wind farm</w:t>
-      </w:r>
-    </w:p>
-    <w:p>
-      <w:r>
-        <w:rPr>
-          <w:b/>
-          <w:color w:val="4A7FC1"/>
-        </w:rPr>
-        <w:t xml:space="preserve">#34  </w:t>
-      </w:r>
-      <w:r>
-        <w:rPr>
-          <w:b/>
-          <w:i w:val="0"/>
-        </w:rPr>
-        <w:t>200 MWh</w:t>
-      </w:r>
-    </w:p>
-    <w:p>
-      <w:r>
-        <w:rPr>
-          <w:b/>
-          <w:color w:val="4A7FC1"/>
-        </w:rPr>
-        <w:t xml:space="preserve">#35  </w:t>
-      </w:r>
-      <w:r>
-        <w:rPr>
-          <w:b w:val="0"/>
-          <w:i w:val="0"/>
-        </w:rPr>
-        <w:t>battery bank</w:t>
-      </w:r>
-    </w:p>
-    <w:p>
-      <w:r>
-        <w:rPr>
-          <w:b/>
-          <w:color w:val="4A7FC1"/>
-        </w:rPr>
-        <w:t xml:space="preserve">#36  </w:t>
-      </w:r>
-      <w:r>
-        <w:rPr>
-          <w:b/>
-          <w:i w:val="0"/>
-        </w:rPr>
-        <w:t>&lt;1%</w:t>
-      </w:r>
-    </w:p>
-    <w:p>
-      <w:r>
-        <w:rPr>
-          <w:b/>
-          <w:color w:val="4A7FC1"/>
-        </w:rPr>
-        <w:t xml:space="preserve">#37  </w:t>
-      </w:r>
-      <w:r>
-        <w:rPr>
-          <w:b w:val="0"/>
-          <w:i w:val="0"/>
-        </w:rPr>
-        <w:t>heat lost a day by the heat tank</w:t>
-      </w:r>
-    </w:p>
-    <w:p>
-      <w:r>
-        <w:rPr>
-          <w:b/>
-          <w:color w:val="4A7FC1"/>
-        </w:rPr>
-        <w:t xml:space="preserve">#38  </w:t>
-      </w:r>
-      <w:r>
-        <w:rPr>
-          <w:b/>
-          <w:i w:val="0"/>
-        </w:rPr>
-        <w:t>MOUNT AURORA SPA</w:t>
-      </w:r>
-    </w:p>
-    <w:p>
-      <w:r>
-        <w:rPr>
-          <w:b/>
-          <w:color w:val="4A7FC1"/>
-        </w:rPr>
-        <w:t xml:space="preserve">#39  </w:t>
-      </w:r>
-      <w:r>
-        <w:rPr>
-          <w:b/>
-          <w:i w:val="0"/>
-        </w:rPr>
-        <w:t>4</w:t>
-      </w:r>
-    </w:p>
-    <w:p>
-      <w:r>
-        <w:rPr>
-          <w:b/>
-          <w:color w:val="4A7FC1"/>
-        </w:rPr>
-        <w:t xml:space="preserve">#40  </w:t>
-      </w:r>
-      <w:r>
-        <w:rPr>
-          <w:b w:val="0"/>
-          <w:i w:val="0"/>
-        </w:rPr>
-        <w:t>levels, 0 to 13.5 m</w:t>
-      </w:r>
-    </w:p>
-    <w:p>
-      <w:r>
-        <w:rPr>
-          <w:b/>
-          <w:color w:val="4A7FC1"/>
-        </w:rPr>
-        <w:t xml:space="preserve">#41  </w:t>
-      </w:r>
-      <w:r>
-        <w:rPr>
-          <w:b/>
-          <w:i w:val="0"/>
-        </w:rPr>
-        <w:t>28 °C</w:t>
-      </w:r>
-    </w:p>
-    <w:p>
-      <w:r>
-        <w:rPr>
-          <w:b/>
-          <w:color w:val="4A7FC1"/>
-        </w:rPr>
-        <w:t xml:space="preserve">#42  </w:t>
-      </w:r>
-      <w:r>
-        <w:rPr>
-          <w:b w:val="0"/>
-          <w:i w:val="0"/>
-        </w:rPr>
-        <w:t>all winter</w:t>
-      </w:r>
-    </w:p>
-    <w:p>
-      <w:r>
-        <w:rPr>
-          <w:b/>
-          <w:color w:val="4A7FC1"/>
-        </w:rPr>
-        <w:t xml:space="preserve">#43  </w:t>
-      </w:r>
-      <w:r>
-        <w:rPr>
-          <w:b/>
-          <w:i w:val="0"/>
-        </w:rPr>
-        <w:t>1,000</w:t>
-      </w:r>
-    </w:p>
-    <w:p>
-      <w:r>
-        <w:rPr>
-          <w:b/>
-          <w:color w:val="4A7FC1"/>
-        </w:rPr>
-        <w:t xml:space="preserve">#44  </w:t>
-      </w:r>
-      <w:r>
-        <w:rPr>
-          <w:b w:val="0"/>
-          <w:i w:val="0"/>
-        </w:rPr>
-        <w:t>people sheltered in an emergency</w:t>
-      </w:r>
-    </w:p>
-    <w:p>
-      <w:r>
-        <w:rPr>
-          <w:b/>
-          <w:color w:val="4A7FC1"/>
-        </w:rPr>
-        <w:t xml:space="preserve">#45  </w:t>
-      </w:r>
-      <w:r>
-        <w:rPr>
-          <w:b/>
-          <w:i w:val="0"/>
-        </w:rPr>
-        <w:t>LIVABILITY</w:t>
-      </w:r>
-    </w:p>
-    <w:p>
-      <w:r>
-        <w:rPr>
-          <w:b/>
-          <w:color w:val="4A7FC1"/>
-        </w:rPr>
-        <w:t xml:space="preserve">#46  </w:t>
-      </w:r>
-      <w:r>
-        <w:rPr>
-          <w:b/>
-          <w:i w:val="0"/>
-        </w:rPr>
-        <w:t>600</w:t>
-      </w:r>
-    </w:p>
-    <w:p>
-      <w:r>
-        <w:rPr>
-          <w:b/>
-          <w:color w:val="4A7FC1"/>
-        </w:rPr>
-        <w:t xml:space="preserve">#47  </w:t>
-      </w:r>
-      <w:r>
-        <w:rPr>
-          <w:b w:val="0"/>
-          <w:i w:val="0"/>
-        </w:rPr>
-        <w:t>Aurora 81 apartments</w:t>
-      </w:r>
-    </w:p>
-    <w:p>
-      <w:r>
-        <w:rPr>
-          <w:b/>
-          <w:color w:val="4A7FC1"/>
-        </w:rPr>
-        <w:t xml:space="preserve">#48  </w:t>
-      </w:r>
-      <w:r>
-        <w:rPr>
-          <w:b/>
-          <w:i w:val="0"/>
-        </w:rPr>
-        <w:t>450</w:t>
-      </w:r>
-    </w:p>
-    <w:p>
-      <w:r>
-        <w:rPr>
-          <w:b/>
-          <w:color w:val="4A7FC1"/>
-        </w:rPr>
-        <w:t xml:space="preserve">#49  </w:t>
-      </w:r>
-      <w:r>
-        <w:rPr>
-          <w:b w:val="0"/>
-          <w:i w:val="0"/>
-        </w:rPr>
-        <w:t>pupils at Snow Lantern Primary</w:t>
-      </w:r>
-    </w:p>
-    <w:p>
-      <w:r>
-        <w:rPr>
-          <w:b/>
-          <w:color w:val="4A7FC1"/>
-        </w:rPr>
-        <w:t xml:space="preserve">#50  </w:t>
-      </w:r>
-      <w:r>
-        <w:rPr>
-          <w:b/>
-          <w:i w:val="0"/>
-        </w:rPr>
-        <w:t>3</w:t>
-      </w:r>
-    </w:p>
-    <w:p>
-      <w:r>
-        <w:rPr>
-          <w:b/>
-          <w:color w:val="4A7FC1"/>
-        </w:rPr>
-        <w:t xml:space="preserve">#51  </w:t>
-      </w:r>
-      <w:r>
-        <w:rPr>
-          <w:b w:val="0"/>
-          <w:i w:val="0"/>
-        </w:rPr>
-        <w:t>kindergartens</w:t>
-      </w:r>
-    </w:p>
-    <w:p>
-      <w:r>
-        <w:rPr>
-          <w:b/>
-          <w:color w:val="4A7FC1"/>
-        </w:rPr>
-        <w:t xml:space="preserve">#52  </w:t>
-      </w:r>
-      <w:r>
-        <w:rPr>
-          <w:b/>
-          <w:i w:val="0"/>
-        </w:rPr>
-        <w:t>TRANSPORT</w:t>
-      </w:r>
-    </w:p>
-    <w:p>
-      <w:r>
-        <w:rPr>
-          <w:b/>
-          <w:color w:val="4A7FC1"/>
-        </w:rPr>
-        <w:t xml:space="preserve">#53  </w:t>
-      </w:r>
-      <w:r>
-        <w:rPr>
-          <w:b/>
-          <w:i w:val="0"/>
-        </w:rPr>
-        <w:t>2</w:t>
-      </w:r>
-    </w:p>
-    <w:p>
-      <w:r>
-        <w:rPr>
-          <w:b/>
-          <w:color w:val="4A7FC1"/>
-        </w:rPr>
-        <w:t xml:space="preserve">#54  </w:t>
-      </w:r>
-      <w:r>
-        <w:rPr>
-          <w:b w:val="0"/>
-          <w:i w:val="0"/>
-        </w:rPr>
-        <w:t>metro lines</w:t>
-      </w:r>
-    </w:p>
-    <w:p>
-      <w:r>
-        <w:rPr>
-          <w:b/>
-          <w:color w:val="4A7FC1"/>
-        </w:rPr>
-        <w:t xml:space="preserve">#55  </w:t>
-      </w:r>
-      <w:r>
-        <w:rPr>
-          <w:b/>
-          <w:i w:val="0"/>
-        </w:rPr>
-        <w:t>5 min</w:t>
-      </w:r>
-    </w:p>
-    <w:p>
-      <w:r>
-        <w:rPr>
-          <w:b/>
-          <w:color w:val="4A7FC1"/>
-        </w:rPr>
-        <w:t xml:space="preserve">#56  </w:t>
-      </w:r>
-      <w:r>
-        <w:rPr>
-          <w:b w:val="0"/>
-          <w:i w:val="0"/>
-        </w:rPr>
-        <w:t>spa shuttle</w:t>
-      </w:r>
-    </w:p>
-    <w:p>
-      <w:r>
-        <w:rPr>
-          <w:b/>
-          <w:color w:val="4A7FC1"/>
-        </w:rPr>
-        <w:t xml:space="preserve">#57  </w:t>
-      </w:r>
-      <w:r>
-        <w:rPr>
-          <w:b/>
-          <w:i w:val="0"/>
-        </w:rPr>
-        <w:t>20 min</w:t>
-      </w:r>
-    </w:p>
-    <w:p>
-      <w:r>
-        <w:rPr>
-          <w:b/>
-          <w:color w:val="4A7FC1"/>
-        </w:rPr>
-        <w:t xml:space="preserve">#58  </w:t>
-      </w:r>
-      <w:r>
-        <w:rPr>
-          <w:b w:val="0"/>
-          <w:i w:val="0"/>
-        </w:rPr>
-        <w:t>airport shuttle</w:t>
-      </w:r>
-    </w:p>
-    <w:p>
-      <w:r>
-        <w:rPr>
-          <w:b/>
-          <w:color w:val="4A7FC1"/>
-        </w:rPr>
-        <w:t xml:space="preserve">#59  </w:t>
       </w:r>
       <w:r>
         <w:rPr>
           <w:b w:val="0"/>
           <w:i/>
         </w:rPr>
-        <w:t>All figures are design values for the Aurora Haven city project; page 38 explains how to read our numbers.</w:t>
+        <w:t>It is January, and the sun has not risen for six weeks. This is how a winter day could feel for Mai, sixteen, a student at the Northern Lights School.</w:t>
+      </w:r>
+    </w:p>
+    <w:p>
+      <w:r>
+        <w:rPr>
+          <w:b/>
+          <w:color w:val="4A7FC1"/>
+        </w:rPr>
+        <w:t xml:space="preserve">#4  </w:t>
+      </w:r>
+      <w:r>
+        <w:rPr>
+          <w:b/>
+          <w:i w:val="0"/>
+        </w:rPr>
+        <w:t xml:space="preserve">07:30  </w:t>
+      </w:r>
+      <w:r>
+        <w:rPr>
+          <w:b w:val="0"/>
+          <w:i w:val="0"/>
+        </w:rPr>
+        <w:t>Mai’s flat in the Aurora 81 Residences is warm without a single heater: the district-heating loop brings the fusion station’s heat to every room. Breakfast is bread baked with starch made from snow and air.</w:t>
+      </w:r>
+    </w:p>
+    <w:p>
+      <w:r>
+        <w:rPr>
+          <w:b/>
+          <w:i w:val="0"/>
+        </w:rPr>
+        <w:t xml:space="preserve">08:10  </w:t>
+      </w:r>
+      <w:r>
+        <w:rPr>
+          <w:b w:val="0"/>
+          <w:i w:val="0"/>
+        </w:rPr>
+        <w:t>The heated sidewalk outside is dry. She rides the driverless Aurora Line under Liberty Mall, every three minutes, blizzard or not.</w:t>
+      </w:r>
+    </w:p>
+    <w:p>
+      <w:r>
+        <w:rPr>
+          <w:b/>
+          <w:i w:val="0"/>
+        </w:rPr>
+        <w:t xml:space="preserve">12:30  </w:t>
+      </w:r>
+      <w:r>
+        <w:rPr>
+          <w:b w:val="0"/>
+          <w:i w:val="0"/>
+        </w:rPr>
+        <w:t>Lunch is a salad grown under LED light in the Evergreen Greenhouse Dome. After school she borrows a light-therapy lamp from the 24-hour library.</w:t>
+      </w:r>
+    </w:p>
+    <w:p>
+      <w:r>
+        <w:rPr>
+          <w:b/>
+          <w:i w:val="0"/>
+        </w:rPr>
+        <w:t xml:space="preserve">17:00  </w:t>
+      </w:r>
+      <w:r>
+        <w:rPr>
+          <w:b w:val="0"/>
+          <w:i w:val="0"/>
+        </w:rPr>
+        <w:t>Every phone pings a blizzard warning, two days ahead. The football match moves indoors; nobody panics.</w:t>
+      </w:r>
+    </w:p>
+    <w:p>
+      <w:r>
+        <w:rPr>
+          <w:b/>
+          <w:i w:val="0"/>
+        </w:rPr>
+        <w:t xml:space="preserve">20:00  </w:t>
+      </w:r>
+      <w:r>
+        <w:rPr>
+          <w:b w:val="0"/>
+          <w:i w:val="0"/>
+        </w:rPr>
+        <w:t>The spa shuttle takes her to Mount Aurora. She floats in the 38 °C Aurora Lagoon as green curtains of light ripple over the snow peak.</w:t>
+      </w:r>
+    </w:p>
+    <w:p>
+      <w:r>
+        <w:rPr>
+          <w:b/>
+          <w:color w:val="4A7FC1"/>
+        </w:rPr>
+        <w:t xml:space="preserve">#5  </w:t>
+      </w:r>
+      <w:r>
+        <w:rPr>
+          <w:b/>
+          <w:i/>
+        </w:rPr>
+        <w:t>“In the polar night, my city is the warmest place I know.”</w:t>
+      </w:r>
+    </w:p>
+    <w:p>
+      <w:r>
+        <w:rPr>
+          <w:b/>
+          <w:color w:val="4A7FC1"/>
+        </w:rPr>
+        <w:t xml:space="preserve">#6  </w:t>
+      </w:r>
+      <w:r>
+        <w:rPr>
+          <w:b w:val="0"/>
+          <w:i/>
+        </w:rPr>
+        <w:t>Walking home on a heated sidewalk under the northern lights.</w:t>
       </w:r>
     </w:p>
     <w:p>
@@ -13661,7 +12194,7 @@
           <w:b w:val="0"/>
           <w:i w:val="0"/>
         </w:rPr>
-        <w:t>Calculations we made ourselves and marked “our estimate”, such as the metro capacity, or worked out on page 23. They show an idea is reasonable, not exact.</w:t>
+        <w:t>Calculations we made ourselves and marked “our estimate”, such as the metro capacity, or worked out in the Reality check boxes. They show an idea is reasonable, not exact.</w:t>
       </w:r>
     </w:p>
     <w:p>
@@ -14028,6 +12561,22 @@
           <w:i w:val="0"/>
         </w:rPr>
         <w:t>Visit Tromsø. Winter in Tromsø: the polar night. visittromso.no</w:t>
+      </w:r>
+    </w:p>
+    <w:p>
+      <w:r>
+        <w:rPr>
+          <w:b/>
+          <w:i w:val="0"/>
+        </w:rPr>
+        <w:t xml:space="preserve">[20]  </w:t>
+      </w:r>
+      <w:r>
+        <w:rPr>
+          <w:b w:val="0"/>
+          <w:i w:val="0"/>
+        </w:rPr>
+        <w:t>Packer, L. W. et al. (2023). Neutron activation of ITER materials at JET. UKAEA-CCFE-CP(23)34. scientific-publications.ukaea.uk</w:t>
       </w:r>
     </w:p>
     <w:p>

</xml_diff>

<commit_message>
Rà soát bố cục toàn bộ tạp chí: bỏ khoảng trống thừa, viết rõ đơn vị, tên không bị ngắt dòng
- Ghi "tonnes" thay cho "t"; trang 28 chỉ còn 3 con số rõ nghĩa
- Ô "Where the world is today" / "Reality check" tự co theo chữ, không còn khoảng trống
- Trang 13, 27, 32: ảnh lớn hơn, thẻ vừa với chữ, bỏ khoảng trống giữa trang
- Tiêu đề trang 6 và 10 xuống dòng cân đối, không còn một chữ lẻ
- Bỏ vạch màu ngay dưới tiêu đề ở trang 4 và 9; trang 34 thay vạch dọc bằng thẻ
- Trang 35 bỏ con số "1 m" khô khan; trang 40 mỗi tên thành viên một dòng
- Chữ phần kết luận phỏng vấn (trang 5) và các ô bên trang 16, 18 to hơn

Co-Authored-By: Claude Opus 5.5 <noreply@anthropic.com>
Claude-Session: https://claude.ai/code/session_01Hmv4YstQBq6NRkZ7ExoLKC
</commit_message>
<xml_diff>
--- a/output/Aurora_Haven_Magazine_text.docx
+++ b/output/Aurora_Haven_Magazine_text.docx
@@ -2010,7 +2010,16 @@
           <w:b/>
           <w:i w:val="0"/>
         </w:rPr>
-        <w:t>Welcome to Aurora Haven</w:t>
+        <w:t>Welcome to</w:t>
+      </w:r>
+    </w:p>
+    <w:p>
+      <w:r>
+        <w:rPr>
+          <w:b/>
+          <w:i w:val="0"/>
+        </w:rPr>
+        <w:t>Aurora Haven</w:t>
       </w:r>
     </w:p>
     <w:p>
@@ -2968,7 +2977,16 @@
           <w:b/>
           <w:i w:val="0"/>
         </w:rPr>
-        <w:t>Nine Blocks, One Short Walk</w:t>
+        <w:t>Nine Blocks,</w:t>
+      </w:r>
+    </w:p>
+    <w:p>
+      <w:r>
+        <w:rPr>
+          <w:b/>
+          <w:i w:val="0"/>
+        </w:rPr>
+        <w:t>One Short Walk</w:t>
       </w:r>
     </w:p>
     <w:p>
@@ -4090,7 +4108,7 @@
           <w:b w:val="0"/>
           <w:i w:val="0"/>
         </w:rPr>
-        <w:t>Torches hotter than 5,000 °C turn about 20 t of rubbish a day into hydrogen and CO₂ for the food plant, metals and paving blocks.</w:t>
+        <w:t>Torches hotter than 5,000 °C turn about 20 tonnes of rubbish a day into hydrogen and CO₂ for the food plant, metals and paving blocks.</w:t>
       </w:r>
     </w:p>
     <w:p>
@@ -4561,7 +4579,7 @@
           <w:b w:val="0"/>
           <w:i w:val="0"/>
         </w:rPr>
-        <w:t>About 5 t of hydrogen a day; the oxygen goes to the hospital and the waste converter.</w:t>
+        <w:t>About 5 tonnes of hydrogen a day; the oxygen goes to the hospital and the waste converter.</w:t>
       </w:r>
     </w:p>
     <w:p>
@@ -4785,7 +4803,7 @@
           <w:b w:val="0"/>
           <w:i w:val="0"/>
         </w:rPr>
-        <w:t>Melting 3,000 t of snow a day takes about 13 MW, inside the 14 MW of spare fusion heat. Starch from CO₂ is still lab-scale [7].</w:t>
+        <w:t>Melting 3,000 tonnes of snow a day takes about 13 MW, inside the 14 MW of spare fusion heat. Starch from CO₂ is still lab-scale [7].</w:t>
       </w:r>
     </w:p>
     <w:p>
@@ -7463,7 +7481,7 @@
           <w:b w:val="0"/>
           <w:i w:val="0"/>
         </w:rPr>
-        <w:t>of water recycled</w:t>
+        <w:t>of water is used again</w:t>
       </w:r>
     </w:p>
     <w:p>
@@ -7479,7 +7497,7 @@
           <w:b/>
           <w:i w:val="0"/>
         </w:rPr>
-        <w:t>30 t</w:t>
+        <w:t>30 tonnes</w:t>
       </w:r>
     </w:p>
     <w:p>
@@ -7495,7 +7513,7 @@
           <w:b w:val="0"/>
           <w:i w:val="0"/>
         </w:rPr>
-        <w:t>of materials sorted a day</w:t>
+        <w:t>of materials sorted every day</w:t>
       </w:r>
     </w:p>
     <w:p>
@@ -7511,7 +7529,7 @@
           <w:b/>
           <w:i w:val="0"/>
         </w:rPr>
-        <w:t>20 t</w:t>
+        <w:t>0</w:t>
       </w:r>
     </w:p>
     <w:p>
@@ -7527,39 +7545,7 @@
           <w:b w:val="0"/>
           <w:i w:val="0"/>
         </w:rPr>
-        <w:t>of rubbish a day turned into gas and blocks</w:t>
-      </w:r>
-    </w:p>
-    <w:p>
-      <w:r>
-        <w:rPr>
-          <w:b/>
-          <w:color w:val="4A7FC1"/>
-        </w:rPr>
-        <w:t xml:space="preserve">#25  </w:t>
-      </w:r>
-      <w:r>
-        <w:rPr>
-          <w:b/>
-          <w:i w:val="0"/>
-        </w:rPr>
-        <w:t>0</w:t>
-      </w:r>
-    </w:p>
-    <w:p>
-      <w:r>
-        <w:rPr>
-          <w:b/>
-          <w:color w:val="4A7FC1"/>
-        </w:rPr>
-        <w:t xml:space="preserve">#26  </w:t>
-      </w:r>
-      <w:r>
-        <w:rPr>
-          <w:b w:val="0"/>
-          <w:i w:val="0"/>
-        </w:rPr>
-        <w:t>landfill in the permafrost</w:t>
+        <w:t>rubbish sent to landfill</w:t>
       </w:r>
     </w:p>
     <w:p>
@@ -8856,7 +8842,7 @@
           <w:b w:val="0"/>
           <w:i w:val="0"/>
         </w:rPr>
-        <w:t>Building: a fusion plant is one of the most expensive machines ever made: ITER alone is estimated at €18–22 billion to first plasma [12]. Solar Foods’ first protein factory cost about €42 million for up to 160 t a year [6]. Heated streets, insulated tunnels and triple glazing all cost more than ordinary ones.</w:t>
+        <w:t>Building: a fusion plant is one of the most expensive machines ever made: ITER alone is estimated at €18–22 billion to first plasma [12]. Solar Foods’ first protein factory cost about €42 million for up to 160 tonnes a year [6]. Heated streets, insulated tunnels and triple glazing all cost more than ordinary ones.</w:t>
       </w:r>
     </w:p>
     <w:p>
@@ -9477,7 +9463,7 @@
           <w:b w:val="0"/>
           <w:i w:val="0"/>
         </w:rPr>
-        <w:t>The Snow-to-Food &amp; Water Plant, starting small. For scale, Solar Foods’ first protein factory in Finland cost about €42 million for up to 160 t a year [6].</w:t>
+        <w:t>The Snow-to-Food &amp; Water Plant, starting small. For scale, Solar Foods’ first protein factory in Finland cost about €42 million for up to 160 tonnes a year [6].</w:t>
       </w:r>
     </w:p>
     <w:p>
@@ -9896,7 +9882,7 @@
           <w:b w:val="0"/>
           <w:i w:val="0"/>
         </w:rPr>
-        <w:t>Melts about 3,000 t of snow a day with spare fusion heat.</w:t>
+        <w:t>Melts about 3,000 tonnes of snow a day with spare fusion heat.</w:t>
       </w:r>
     </w:p>
     <w:p>
@@ -10132,38 +10118,6 @@
           <w:i w:val="0"/>
         </w:rPr>
         <w:t>downtown blocks around the Aurora Roundabout</w:t>
-      </w:r>
-    </w:p>
-    <w:p>
-      <w:r>
-        <w:rPr>
-          <w:b/>
-          <w:color w:val="4A7FC1"/>
-        </w:rPr>
-        <w:t xml:space="preserve">#27  </w:t>
-      </w:r>
-      <w:r>
-        <w:rPr>
-          <w:b/>
-          <w:i w:val="0"/>
-        </w:rPr>
-        <w:t>1 m</w:t>
-      </w:r>
-    </w:p>
-    <w:p>
-      <w:r>
-        <w:rPr>
-          <w:b/>
-          <w:color w:val="4A7FC1"/>
-        </w:rPr>
-        <w:t xml:space="preserve">#28  </w:t>
-      </w:r>
-      <w:r>
-        <w:rPr>
-          <w:b w:val="0"/>
-          <w:i w:val="0"/>
-        </w:rPr>
-        <w:t>per unit on every plan, drawn from the 3D model</w:t>
       </w:r>
     </w:p>
     <w:p>
@@ -11323,7 +11277,7 @@
           <w:b w:val="0"/>
           <w:i w:val="0"/>
         </w:rPr>
-        <w:t>Turns about 20 t of rubbish a day into clean gas, recovered metals and building blocks.</w:t>
+        <w:t>Turns about 20 tonnes of rubbish a day into clean gas, recovered metals and building blocks.</w:t>
       </w:r>
     </w:p>
     <w:p>
@@ -11371,7 +11325,7 @@
           <w:b w:val="0"/>
           <w:i w:val="0"/>
         </w:rPr>
-        <w:t>Melts about 3,000 t of clean snow a day with spare fusion heat.</w:t>
+        <w:t>Melts about 3,000 tonnes of clean snow a day with spare fusion heat.</w:t>
       </w:r>
     </w:p>
     <w:p>
@@ -11467,7 +11421,7 @@
           <w:b w:val="0"/>
           <w:i w:val="0"/>
         </w:rPr>
-        <w:t>Six silos where microbes make about 2.5 t of protein flour a day.</w:t>
+        <w:t>Six silos where microbes make about 2.5 tonnes of protein flour a day.</w:t>
       </w:r>
     </w:p>
     <w:p>
@@ -11851,7 +11805,7 @@
           <w:b w:val="0"/>
           <w:i w:val="0"/>
         </w:rPr>
-        <w:t>Sorts, repairs and recycles about 30 t of materials a day.</w:t>
+        <w:t>Sorts, repairs and recycles about 30 tonnes of materials a day.</w:t>
       </w:r>
     </w:p>
     <w:p>
@@ -12162,7 +12116,7 @@
           <w:b w:val="0"/>
           <w:i w:val="0"/>
         </w:rPr>
-        <w:t>Figures for our own city plan, such as 300 MW of electricity or 3,000 t of snow a day. They come from our design, not from a real city.</w:t>
+        <w:t>Figures for our own city plan, such as 300 MW of electricity or 3,000 tonnes of snow a day. They come from our design, not from a real city.</w:t>
       </w:r>
     </w:p>
     <w:p>
@@ -12776,7 +12730,52 @@
           <w:b w:val="0"/>
           <w:i w:val="0"/>
         </w:rPr>
-        <w:t>Nguyễn Đông Bảo · Nguyễn Bá Hiếu Thiện · Phan Minh Khôi · Dương Hàng Nguyên · Phạm Phước Khoa · Nguyễn Minh Triết</w:t>
+        <w:t>Nguyễn Đông Bảo</w:t>
+      </w:r>
+    </w:p>
+    <w:p>
+      <w:r>
+        <w:rPr>
+          <w:b w:val="0"/>
+          <w:i w:val="0"/>
+        </w:rPr>
+        <w:t>Nguyễn Bá Hiếu Thiện</w:t>
+      </w:r>
+    </w:p>
+    <w:p>
+      <w:r>
+        <w:rPr>
+          <w:b w:val="0"/>
+          <w:i w:val="0"/>
+        </w:rPr>
+        <w:t>Phan Minh Khôi</w:t>
+      </w:r>
+    </w:p>
+    <w:p>
+      <w:r>
+        <w:rPr>
+          <w:b w:val="0"/>
+          <w:i w:val="0"/>
+        </w:rPr>
+        <w:t>Dương Hàng Nguyên</w:t>
+      </w:r>
+    </w:p>
+    <w:p>
+      <w:r>
+        <w:rPr>
+          <w:b w:val="0"/>
+          <w:i w:val="0"/>
+        </w:rPr>
+        <w:t>Phạm Phước Khoa</w:t>
+      </w:r>
+    </w:p>
+    <w:p>
+      <w:r>
+        <w:rPr>
+          <w:b w:val="0"/>
+          <w:i w:val="0"/>
+        </w:rPr>
+        <w:t>Nguyễn Minh Triết</w:t>
       </w:r>
     </w:p>
     <w:p>

</xml_diff>

<commit_message>
Đánh số trang từ mục lục: bìa không tính, mục lục là trang 1
- Số trang in thành chữ trên từng trang (đặt sau cùng để nằm trên ảnh tràn trang)
- Cập nhật mục lục, số trang trên bìa, mọi chỗ "page …" trong bài và README

Co-Authored-By: Claude Opus 5.5 <noreply@anthropic.com>
Claude-Session: https://claude.ai/code/session_01Hmv4YstQBq6NRkZ7ExoLKC
</commit_message>
<xml_diff>
--- a/output/Aurora_Haven_Magazine_text.docx
+++ b/output/Aurora_Haven_Magazine_text.docx
@@ -105,7 +105,7 @@
           <w:b/>
           <w:i w:val="0"/>
         </w:rPr>
-        <w:t>PAGE 14</w:t>
+        <w:t>PAGE 12</w:t>
       </w:r>
     </w:p>
     <w:p>
@@ -148,7 +148,7 @@
           <w:b/>
           <w:i w:val="0"/>
         </w:rPr>
-        <w:t>PAGE 19</w:t>
+        <w:t>PAGE 17</w:t>
       </w:r>
     </w:p>
     <w:p>
@@ -182,7 +182,7 @@
           <w:b/>
           <w:i w:val="0"/>
         </w:rPr>
-        <w:t>PAGE 17</w:t>
+        <w:t>PAGE 15</w:t>
       </w:r>
     </w:p>
     <w:p>
@@ -216,7 +216,7 @@
           <w:b/>
           <w:i w:val="0"/>
         </w:rPr>
-        <w:t>PAGE 8</w:t>
+        <w:t>PAGE 6</w:t>
       </w:r>
     </w:p>
     <w:p>
@@ -304,6 +304,54 @@
           <w:b/>
           <w:i w:val="0"/>
         </w:rPr>
+        <w:t>2</w:t>
+      </w:r>
+    </w:p>
+    <w:p>
+      <w:r>
+        <w:rPr>
+          <w:b/>
+          <w:color w:val="4A7FC1"/>
+        </w:rPr>
+        <w:t xml:space="preserve">#5  </w:t>
+      </w:r>
+      <w:r>
+        <w:rPr>
+          <w:b/>
+          <w:i w:val="0"/>
+        </w:rPr>
+        <w:t>Letter from the Founders</w:t>
+      </w:r>
+    </w:p>
+    <w:p>
+      <w:r>
+        <w:rPr>
+          <w:b/>
+          <w:color w:val="4A7FC1"/>
+        </w:rPr>
+        <w:t xml:space="preserve">#6  </w:t>
+      </w:r>
+      <w:r>
+        <w:rPr>
+          <w:b w:val="0"/>
+          <w:i w:val="0"/>
+        </w:rPr>
+        <w:t>Who we are, our team and why we built Aurora Haven</w:t>
+      </w:r>
+    </w:p>
+    <w:p>
+      <w:r>
+        <w:rPr>
+          <w:b/>
+          <w:color w:val="4A7FC1"/>
+        </w:rPr>
+        <w:t xml:space="preserve">#7  </w:t>
+      </w:r>
+      <w:r>
+        <w:rPr>
+          <w:b/>
+          <w:i w:val="0"/>
+        </w:rPr>
         <w:t>4</w:t>
       </w:r>
     </w:p>
@@ -313,39 +361,39 @@
           <w:b/>
           <w:color w:val="4A7FC1"/>
         </w:rPr>
-        <w:t xml:space="preserve">#5  </w:t>
-      </w:r>
-      <w:r>
-        <w:rPr>
-          <w:b/>
-          <w:i w:val="0"/>
-        </w:rPr>
-        <w:t>Letter from the Founders</w:t>
-      </w:r>
-    </w:p>
-    <w:p>
-      <w:r>
-        <w:rPr>
-          <w:b/>
-          <w:color w:val="4A7FC1"/>
-        </w:rPr>
-        <w:t xml:space="preserve">#6  </w:t>
+        <w:t xml:space="preserve">#8  </w:t>
+      </w:r>
+      <w:r>
+        <w:rPr>
+          <w:b/>
+          <w:i w:val="0"/>
+        </w:rPr>
+        <w:t>Welcome to Aurora Haven</w:t>
+      </w:r>
+    </w:p>
+    <w:p>
+      <w:r>
+        <w:rPr>
+          <w:b/>
+          <w:color w:val="4A7FC1"/>
+        </w:rPr>
+        <w:t xml:space="preserve">#9  </w:t>
       </w:r>
       <w:r>
         <w:rPr>
           <w:b w:val="0"/>
           <w:i w:val="0"/>
         </w:rPr>
-        <w:t>Who we are, our team and why we built Aurora Haven</w:t>
-      </w:r>
-    </w:p>
-    <w:p>
-      <w:r>
-        <w:rPr>
-          <w:b/>
-          <w:color w:val="4A7FC1"/>
-        </w:rPr>
-        <w:t xml:space="preserve">#7  </w:t>
+        <w:t>A compact city of 45,000 under a snow peak</w:t>
+      </w:r>
+    </w:p>
+    <w:p>
+      <w:r>
+        <w:rPr>
+          <w:b/>
+          <w:color w:val="4A7FC1"/>
+        </w:rPr>
+        <w:t xml:space="preserve">#10  </w:t>
       </w:r>
       <w:r>
         <w:rPr>
@@ -361,39 +409,87 @@
           <w:b/>
           <w:color w:val="4A7FC1"/>
         </w:rPr>
-        <w:t xml:space="preserve">#8  </w:t>
-      </w:r>
-      <w:r>
-        <w:rPr>
-          <w:b/>
-          <w:i w:val="0"/>
-        </w:rPr>
-        <w:t>Welcome to Aurora Haven</w:t>
-      </w:r>
-    </w:p>
-    <w:p>
-      <w:r>
-        <w:rPr>
-          <w:b/>
-          <w:color w:val="4A7FC1"/>
-        </w:rPr>
-        <w:t xml:space="preserve">#9  </w:t>
+        <w:t xml:space="preserve">#11  </w:t>
+      </w:r>
+      <w:r>
+        <w:rPr>
+          <w:b/>
+          <w:i w:val="0"/>
+        </w:rPr>
+        <w:t>The Polar Challenge</w:t>
+      </w:r>
+    </w:p>
+    <w:p>
+      <w:r>
+        <w:rPr>
+          <w:b/>
+          <w:color w:val="4A7FC1"/>
+        </w:rPr>
+        <w:t xml:space="preserve">#12  </w:t>
       </w:r>
       <w:r>
         <w:rPr>
           <w:b w:val="0"/>
           <w:i w:val="0"/>
         </w:rPr>
-        <w:t>A compact city of 45,000 under a snow peak</w:t>
-      </w:r>
-    </w:p>
-    <w:p>
-      <w:r>
-        <w:rPr>
-          <w:b/>
-          <w:color w:val="4A7FC1"/>
-        </w:rPr>
-        <w:t xml:space="preserve">#10  </w:t>
+        <w:t>Cold, darkness, wind and thawing ground</w:t>
+      </w:r>
+    </w:p>
+    <w:p>
+      <w:r>
+        <w:rPr>
+          <w:b/>
+          <w:color w:val="4A7FC1"/>
+        </w:rPr>
+        <w:t xml:space="preserve">#13  </w:t>
+      </w:r>
+      <w:r>
+        <w:rPr>
+          <w:b/>
+          <w:i w:val="0"/>
+        </w:rPr>
+        <w:t>7</w:t>
+      </w:r>
+    </w:p>
+    <w:p>
+      <w:r>
+        <w:rPr>
+          <w:b/>
+          <w:color w:val="4A7FC1"/>
+        </w:rPr>
+        <w:t xml:space="preserve">#14  </w:t>
+      </w:r>
+      <w:r>
+        <w:rPr>
+          <w:b/>
+          <w:i w:val="0"/>
+        </w:rPr>
+        <w:t>Our Vision &amp; Mission</w:t>
+      </w:r>
+    </w:p>
+    <w:p>
+      <w:r>
+        <w:rPr>
+          <w:b/>
+          <w:color w:val="4A7FC1"/>
+        </w:rPr>
+        <w:t xml:space="preserve">#15  </w:t>
+      </w:r>
+      <w:r>
+        <w:rPr>
+          <w:b w:val="0"/>
+          <w:i w:val="0"/>
+        </w:rPr>
+        <w:t>Who is affected, and the five ideas that answer it</w:t>
+      </w:r>
+    </w:p>
+    <w:p>
+      <w:r>
+        <w:rPr>
+          <w:b/>
+          <w:color w:val="4A7FC1"/>
+        </w:rPr>
+        <w:t xml:space="preserve">#16  </w:t>
       </w:r>
       <w:r>
         <w:rPr>
@@ -409,327 +505,327 @@
           <w:b/>
           <w:color w:val="4A7FC1"/>
         </w:rPr>
-        <w:t xml:space="preserve">#11  </w:t>
-      </w:r>
-      <w:r>
-        <w:rPr>
-          <w:b/>
-          <w:i w:val="0"/>
-        </w:rPr>
-        <w:t>The Polar Challenge</w:t>
-      </w:r>
-    </w:p>
-    <w:p>
-      <w:r>
-        <w:rPr>
-          <w:b/>
-          <w:color w:val="4A7FC1"/>
-        </w:rPr>
-        <w:t xml:space="preserve">#12  </w:t>
+        <w:t xml:space="preserve">#17  </w:t>
+      </w:r>
+      <w:r>
+        <w:rPr>
+          <w:b/>
+          <w:i w:val="0"/>
+        </w:rPr>
+        <w:t>Nine Blocks, One Short Walk</w:t>
+      </w:r>
+    </w:p>
+    <w:p>
+      <w:r>
+        <w:rPr>
+          <w:b/>
+          <w:color w:val="4A7FC1"/>
+        </w:rPr>
+        <w:t xml:space="preserve">#18  </w:t>
       </w:r>
       <w:r>
         <w:rPr>
           <w:b w:val="0"/>
           <w:i w:val="0"/>
         </w:rPr>
-        <w:t>Cold, darkness, wind and thawing ground</w:t>
-      </w:r>
-    </w:p>
-    <w:p>
-      <w:r>
-        <w:rPr>
-          <w:b/>
-          <w:color w:val="4A7FC1"/>
-        </w:rPr>
-        <w:t xml:space="preserve">#13  </w:t>
-      </w:r>
-      <w:r>
-        <w:rPr>
-          <w:b/>
-          <w:i w:val="0"/>
-        </w:rPr>
-        <w:t>9</w:t>
-      </w:r>
-    </w:p>
-    <w:p>
-      <w:r>
-        <w:rPr>
-          <w:b/>
-          <w:color w:val="4A7FC1"/>
-        </w:rPr>
-        <w:t xml:space="preserve">#14  </w:t>
-      </w:r>
-      <w:r>
-        <w:rPr>
-          <w:b/>
-          <w:i w:val="0"/>
-        </w:rPr>
-        <w:t>Our Vision &amp; Mission</w:t>
-      </w:r>
-    </w:p>
-    <w:p>
-      <w:r>
-        <w:rPr>
-          <w:b/>
-          <w:color w:val="4A7FC1"/>
-        </w:rPr>
-        <w:t xml:space="preserve">#15  </w:t>
+        <w:t>Downtown around the Aurora Roundabout</w:t>
+      </w:r>
+    </w:p>
+    <w:p>
+      <w:r>
+        <w:rPr>
+          <w:b/>
+          <w:color w:val="4A7FC1"/>
+        </w:rPr>
+        <w:t xml:space="preserve">#19  </w:t>
+      </w:r>
+      <w:r>
+        <w:rPr>
+          <w:b/>
+          <w:i w:val="0"/>
+        </w:rPr>
+        <w:t>10</w:t>
+      </w:r>
+    </w:p>
+    <w:p>
+      <w:r>
+        <w:rPr>
+          <w:b/>
+          <w:color w:val="4A7FC1"/>
+        </w:rPr>
+        <w:t xml:space="preserve">#20  </w:t>
+      </w:r>
+      <w:r>
+        <w:rPr>
+          <w:b/>
+          <w:i w:val="0"/>
+        </w:rPr>
+        <w:t>The Whole City Plan</w:t>
+      </w:r>
+    </w:p>
+    <w:p>
+      <w:r>
+        <w:rPr>
+          <w:b/>
+          <w:color w:val="4A7FC1"/>
+        </w:rPr>
+        <w:t xml:space="preserve">#21  </w:t>
       </w:r>
       <w:r>
         <w:rPr>
           <w:b w:val="0"/>
           <w:i w:val="0"/>
         </w:rPr>
-        <w:t>Who is affected, and the five ideas that answer it</w:t>
-      </w:r>
-    </w:p>
-    <w:p>
-      <w:r>
-        <w:rPr>
-          <w:b/>
-          <w:color w:val="4A7FC1"/>
-        </w:rPr>
-        <w:t xml:space="preserve">#16  </w:t>
-      </w:r>
-      <w:r>
-        <w:rPr>
-          <w:b/>
-          <w:i w:val="0"/>
-        </w:rPr>
-        <w:t>10</w:t>
-      </w:r>
-    </w:p>
-    <w:p>
-      <w:r>
-        <w:rPr>
-          <w:b/>
-          <w:color w:val="4A7FC1"/>
-        </w:rPr>
-        <w:t xml:space="preserve">#17  </w:t>
-      </w:r>
-      <w:r>
-        <w:rPr>
-          <w:b/>
-          <w:i w:val="0"/>
-        </w:rPr>
-        <w:t>Nine Blocks, One Short Walk</w:t>
-      </w:r>
-    </w:p>
-    <w:p>
-      <w:r>
-        <w:rPr>
-          <w:b/>
-          <w:color w:val="4A7FC1"/>
-        </w:rPr>
-        <w:t xml:space="preserve">#18  </w:t>
+        <w:t>From the wind farm to Mount Aurora</w:t>
+      </w:r>
+    </w:p>
+    <w:p>
+      <w:r>
+        <w:rPr>
+          <w:b/>
+          <w:color w:val="4A7FC1"/>
+        </w:rPr>
+        <w:t xml:space="preserve">#22  </w:t>
+      </w:r>
+      <w:r>
+        <w:rPr>
+          <w:b/>
+          <w:i w:val="0"/>
+        </w:rPr>
+        <w:t>12</w:t>
+      </w:r>
+    </w:p>
+    <w:p>
+      <w:r>
+        <w:rPr>
+          <w:b/>
+          <w:color w:val="4A7FC1"/>
+        </w:rPr>
+        <w:t xml:space="preserve">#23  </w:t>
+      </w:r>
+      <w:r>
+        <w:rPr>
+          <w:b/>
+          <w:i w:val="0"/>
+        </w:rPr>
+        <w:t>The City's Own Sun</w:t>
+      </w:r>
+    </w:p>
+    <w:p>
+      <w:r>
+        <w:rPr>
+          <w:b/>
+          <w:color w:val="4A7FC1"/>
+        </w:rPr>
+        <w:t xml:space="preserve">#24  </w:t>
       </w:r>
       <w:r>
         <w:rPr>
           <w:b w:val="0"/>
           <w:i w:val="0"/>
         </w:rPr>
-        <w:t>Downtown around the Aurora Roundabout</w:t>
-      </w:r>
-    </w:p>
-    <w:p>
-      <w:r>
-        <w:rPr>
-          <w:b/>
-          <w:color w:val="4A7FC1"/>
-        </w:rPr>
-        <w:t xml:space="preserve">#19  </w:t>
-      </w:r>
-      <w:r>
-        <w:rPr>
-          <w:b/>
-          <w:i w:val="0"/>
-        </w:rPr>
-        <w:t>12</w:t>
-      </w:r>
-    </w:p>
-    <w:p>
-      <w:r>
-        <w:rPr>
-          <w:b/>
-          <w:color w:val="4A7FC1"/>
-        </w:rPr>
-        <w:t xml:space="preserve">#20  </w:t>
-      </w:r>
-      <w:r>
-        <w:rPr>
-          <w:b/>
-          <w:i w:val="0"/>
-        </w:rPr>
-        <w:t>The Whole City Plan</w:t>
-      </w:r>
-    </w:p>
-    <w:p>
-      <w:r>
-        <w:rPr>
-          <w:b/>
-          <w:color w:val="4A7FC1"/>
-        </w:rPr>
-        <w:t xml:space="preserve">#21  </w:t>
+        <w:t>Breakthrough 1 · Fusion Power Station</w:t>
+      </w:r>
+    </w:p>
+    <w:p>
+      <w:r>
+        <w:rPr>
+          <w:b/>
+          <w:color w:val="4A7FC1"/>
+        </w:rPr>
+        <w:t xml:space="preserve">#25  </w:t>
+      </w:r>
+      <w:r>
+        <w:rPr>
+          <w:b/>
+          <w:i w:val="0"/>
+        </w:rPr>
+        <w:t>15</w:t>
+      </w:r>
+    </w:p>
+    <w:p>
+      <w:r>
+        <w:rPr>
+          <w:b/>
+          <w:color w:val="4A7FC1"/>
+        </w:rPr>
+        <w:t xml:space="preserve">#26  </w:t>
+      </w:r>
+      <w:r>
+        <w:rPr>
+          <w:b/>
+          <w:i w:val="0"/>
+        </w:rPr>
+        <w:t>Bread and Water from Snow and Air</w:t>
+      </w:r>
+    </w:p>
+    <w:p>
+      <w:r>
+        <w:rPr>
+          <w:b/>
+          <w:color w:val="4A7FC1"/>
+        </w:rPr>
+        <w:t xml:space="preserve">#27  </w:t>
       </w:r>
       <w:r>
         <w:rPr>
           <w:b w:val="0"/>
           <w:i w:val="0"/>
         </w:rPr>
-        <w:t>From the wind farm to Mount Aurora</w:t>
-      </w:r>
-    </w:p>
-    <w:p>
-      <w:r>
-        <w:rPr>
-          <w:b/>
-          <w:color w:val="4A7FC1"/>
-        </w:rPr>
-        <w:t xml:space="preserve">#22  </w:t>
-      </w:r>
-      <w:r>
-        <w:rPr>
-          <w:b/>
-          <w:i w:val="0"/>
-        </w:rPr>
-        <w:t>14</w:t>
-      </w:r>
-    </w:p>
-    <w:p>
-      <w:r>
-        <w:rPr>
-          <w:b/>
-          <w:color w:val="4A7FC1"/>
-        </w:rPr>
-        <w:t xml:space="preserve">#23  </w:t>
-      </w:r>
-      <w:r>
-        <w:rPr>
-          <w:b/>
-          <w:i w:val="0"/>
-        </w:rPr>
-        <w:t>The City's Own Sun</w:t>
-      </w:r>
-    </w:p>
-    <w:p>
-      <w:r>
-        <w:rPr>
-          <w:b/>
-          <w:color w:val="4A7FC1"/>
-        </w:rPr>
-        <w:t xml:space="preserve">#24  </w:t>
+        <w:t>Breakthrough 2 · Snow-to-Food &amp; Water Plant</w:t>
+      </w:r>
+    </w:p>
+    <w:p>
+      <w:r>
+        <w:rPr>
+          <w:b/>
+          <w:color w:val="4A7FC1"/>
+        </w:rPr>
+        <w:t xml:space="preserve">#28  </w:t>
+      </w:r>
+      <w:r>
+        <w:rPr>
+          <w:b/>
+          <w:i w:val="0"/>
+        </w:rPr>
+        <w:t>17</w:t>
+      </w:r>
+    </w:p>
+    <w:p>
+      <w:r>
+        <w:rPr>
+          <w:b/>
+          <w:color w:val="4A7FC1"/>
+        </w:rPr>
+        <w:t xml:space="preserve">#29  </w:t>
+      </w:r>
+      <w:r>
+        <w:rPr>
+          <w:b/>
+          <w:i w:val="0"/>
+        </w:rPr>
+        <w:t>A Snow Mountain You Can Walk Inside</w:t>
+      </w:r>
+    </w:p>
+    <w:p>
+      <w:r>
+        <w:rPr>
+          <w:b/>
+          <w:color w:val="4A7FC1"/>
+        </w:rPr>
+        <w:t xml:space="preserve">#30  </w:t>
       </w:r>
       <w:r>
         <w:rPr>
           <w:b w:val="0"/>
           <w:i w:val="0"/>
         </w:rPr>
-        <w:t>Breakthrough 1 · Fusion Power Station</w:t>
-      </w:r>
-    </w:p>
-    <w:p>
-      <w:r>
-        <w:rPr>
-          <w:b/>
-          <w:color w:val="4A7FC1"/>
-        </w:rPr>
-        <w:t xml:space="preserve">#25  </w:t>
-      </w:r>
-      <w:r>
-        <w:rPr>
-          <w:b/>
-          <w:i w:val="0"/>
-        </w:rPr>
-        <w:t>17</w:t>
-      </w:r>
-    </w:p>
-    <w:p>
-      <w:r>
-        <w:rPr>
-          <w:b/>
-          <w:color w:val="4A7FC1"/>
-        </w:rPr>
-        <w:t xml:space="preserve">#26  </w:t>
-      </w:r>
-      <w:r>
-        <w:rPr>
-          <w:b/>
-          <w:i w:val="0"/>
-        </w:rPr>
-        <w:t>Bread and Water from Snow and Air</w:t>
-      </w:r>
-    </w:p>
-    <w:p>
-      <w:r>
-        <w:rPr>
-          <w:b/>
-          <w:color w:val="4A7FC1"/>
-        </w:rPr>
-        <w:t xml:space="preserve">#27  </w:t>
+        <w:t>Breakthrough 3 · Mount Aurora</w:t>
+      </w:r>
+    </w:p>
+    <w:p>
+      <w:r>
+        <w:rPr>
+          <w:b/>
+          <w:color w:val="4A7FC1"/>
+        </w:rPr>
+        <w:t xml:space="preserve">#31  </w:t>
+      </w:r>
+      <w:r>
+        <w:rPr>
+          <w:b/>
+          <w:i w:val="0"/>
+        </w:rPr>
+        <w:t>21</w:t>
+      </w:r>
+    </w:p>
+    <w:p>
+      <w:r>
+        <w:rPr>
+          <w:b/>
+          <w:color w:val="4A7FC1"/>
+        </w:rPr>
+        <w:t xml:space="preserve">#32  </w:t>
+      </w:r>
+      <w:r>
+        <w:rPr>
+          <w:b/>
+          <w:i w:val="0"/>
+        </w:rPr>
+        <w:t>Built by Us</w:t>
+      </w:r>
+    </w:p>
+    <w:p>
+      <w:r>
+        <w:rPr>
+          <w:b/>
+          <w:color w:val="4A7FC1"/>
+        </w:rPr>
+        <w:t xml:space="preserve">#33  </w:t>
       </w:r>
       <w:r>
         <w:rPr>
           <w:b w:val="0"/>
           <w:i w:val="0"/>
         </w:rPr>
-        <w:t>Breakthrough 2 · Snow-to-Food &amp; Water Plant</w:t>
-      </w:r>
-    </w:p>
-    <w:p>
-      <w:r>
-        <w:rPr>
-          <w:b/>
-          <w:color w:val="4A7FC1"/>
-        </w:rPr>
-        <w:t xml:space="preserve">#28  </w:t>
-      </w:r>
-      <w:r>
-        <w:rPr>
-          <w:b/>
-          <w:i w:val="0"/>
-        </w:rPr>
-        <w:t>19</w:t>
-      </w:r>
-    </w:p>
-    <w:p>
-      <w:r>
-        <w:rPr>
-          <w:b/>
-          <w:color w:val="4A7FC1"/>
-        </w:rPr>
-        <w:t xml:space="preserve">#29  </w:t>
-      </w:r>
-      <w:r>
-        <w:rPr>
-          <w:b/>
-          <w:i w:val="0"/>
-        </w:rPr>
-        <w:t>A Snow Mountain You Can Walk Inside</w:t>
-      </w:r>
-    </w:p>
-    <w:p>
-      <w:r>
-        <w:rPr>
-          <w:b/>
-          <w:color w:val="4A7FC1"/>
-        </w:rPr>
-        <w:t xml:space="preserve">#30  </w:t>
+        <w:t>Our Eco-Polis model, and how to explore it</w:t>
+      </w:r>
+    </w:p>
+    <w:p>
+      <w:r>
+        <w:rPr>
+          <w:b/>
+          <w:color w:val="4A7FC1"/>
+        </w:rPr>
+        <w:t xml:space="preserve">#34  </w:t>
+      </w:r>
+      <w:r>
+        <w:rPr>
+          <w:b/>
+          <w:i w:val="0"/>
+        </w:rPr>
+        <w:t>22</w:t>
+      </w:r>
+    </w:p>
+    <w:p>
+      <w:r>
+        <w:rPr>
+          <w:b/>
+          <w:color w:val="4A7FC1"/>
+        </w:rPr>
+        <w:t xml:space="preserve">#35  </w:t>
+      </w:r>
+      <w:r>
+        <w:rPr>
+          <w:b/>
+          <w:i w:val="0"/>
+        </w:rPr>
+        <w:t>Three Districts, One Loop</w:t>
+      </w:r>
+    </w:p>
+    <w:p>
+      <w:r>
+        <w:rPr>
+          <w:b/>
+          <w:color w:val="4A7FC1"/>
+        </w:rPr>
+        <w:t xml:space="preserve">#36  </w:t>
       </w:r>
       <w:r>
         <w:rPr>
           <w:b w:val="0"/>
           <w:i w:val="0"/>
         </w:rPr>
-        <w:t>Breakthrough 3 · Mount Aurora</w:t>
-      </w:r>
-    </w:p>
-    <w:p>
-      <w:r>
-        <w:rPr>
-          <w:b/>
-          <w:color w:val="4A7FC1"/>
-        </w:rPr>
-        <w:t xml:space="preserve">#31  </w:t>
+        <w:t>How heat, water, oxygen and waste go round</w:t>
+      </w:r>
+    </w:p>
+    <w:p>
+      <w:r>
+        <w:rPr>
+          <w:b/>
+          <w:color w:val="4A7FC1"/>
+        </w:rPr>
+        <w:t xml:space="preserve">#37  </w:t>
       </w:r>
       <w:r>
         <w:rPr>
@@ -745,39 +841,39 @@
           <w:b/>
           <w:color w:val="4A7FC1"/>
         </w:rPr>
-        <w:t xml:space="preserve">#32  </w:t>
-      </w:r>
-      <w:r>
-        <w:rPr>
-          <w:b/>
-          <w:i w:val="0"/>
-        </w:rPr>
-        <w:t>Built by Us</w:t>
-      </w:r>
-    </w:p>
-    <w:p>
-      <w:r>
-        <w:rPr>
-          <w:b/>
-          <w:color w:val="4A7FC1"/>
-        </w:rPr>
-        <w:t xml:space="preserve">#33  </w:t>
+        <w:t xml:space="preserve">#38  </w:t>
+      </w:r>
+      <w:r>
+        <w:rPr>
+          <w:b/>
+          <w:i w:val="0"/>
+        </w:rPr>
+        <w:t>A Livable City Every Day</w:t>
+      </w:r>
+    </w:p>
+    <w:p>
+      <w:r>
+        <w:rPr>
+          <w:b/>
+          <w:color w:val="4A7FC1"/>
+        </w:rPr>
+        <w:t xml:space="preserve">#39  </w:t>
       </w:r>
       <w:r>
         <w:rPr>
           <w:b w:val="0"/>
           <w:i w:val="0"/>
         </w:rPr>
-        <w:t>Our Eco-Polis model, and how to explore it</w:t>
-      </w:r>
-    </w:p>
-    <w:p>
-      <w:r>
-        <w:rPr>
-          <w:b/>
-          <w:color w:val="4A7FC1"/>
-        </w:rPr>
-        <w:t xml:space="preserve">#34  </w:t>
+        <w:t>Schools, health, shops and culture</w:t>
+      </w:r>
+    </w:p>
+    <w:p>
+      <w:r>
+        <w:rPr>
+          <w:b/>
+          <w:color w:val="4A7FC1"/>
+        </w:rPr>
+        <w:t xml:space="preserve">#40  </w:t>
       </w:r>
       <w:r>
         <w:rPr>
@@ -793,39 +889,39 @@
           <w:b/>
           <w:color w:val="4A7FC1"/>
         </w:rPr>
-        <w:t xml:space="preserve">#35  </w:t>
-      </w:r>
-      <w:r>
-        <w:rPr>
-          <w:b/>
-          <w:i w:val="0"/>
-        </w:rPr>
-        <w:t>Three Districts, One Loop</w:t>
-      </w:r>
-    </w:p>
-    <w:p>
-      <w:r>
-        <w:rPr>
-          <w:b/>
-          <w:color w:val="4A7FC1"/>
-        </w:rPr>
-        <w:t xml:space="preserve">#36  </w:t>
+        <w:t xml:space="preserve">#41  </w:t>
+      </w:r>
+      <w:r>
+        <w:rPr>
+          <w:b/>
+          <w:i w:val="0"/>
+        </w:rPr>
+        <w:t>Homes for the Polar Night</w:t>
+      </w:r>
+    </w:p>
+    <w:p>
+      <w:r>
+        <w:rPr>
+          <w:b/>
+          <w:color w:val="4A7FC1"/>
+        </w:rPr>
+        <w:t xml:space="preserve">#42  </w:t>
       </w:r>
       <w:r>
         <w:rPr>
           <w:b w:val="0"/>
           <w:i w:val="0"/>
         </w:rPr>
-        <w:t>How heat, water, oxygen and waste go round</w:t>
-      </w:r>
-    </w:p>
-    <w:p>
-      <w:r>
-        <w:rPr>
-          <w:b/>
-          <w:color w:val="4A7FC1"/>
-        </w:rPr>
-        <w:t xml:space="preserve">#37  </w:t>
+        <w:t>Housing for every age, built for −45 °C</w:t>
+      </w:r>
+    </w:p>
+    <w:p>
+      <w:r>
+        <w:rPr>
+          <w:b/>
+          <w:color w:val="4A7FC1"/>
+        </w:rPr>
+        <w:t xml:space="preserve">#43  </w:t>
       </w:r>
       <w:r>
         <w:rPr>
@@ -841,39 +937,39 @@
           <w:b/>
           <w:color w:val="4A7FC1"/>
         </w:rPr>
-        <w:t xml:space="preserve">#38  </w:t>
-      </w:r>
-      <w:r>
-        <w:rPr>
-          <w:b/>
-          <w:i w:val="0"/>
-        </w:rPr>
-        <w:t>A Livable City Every Day</w:t>
-      </w:r>
-    </w:p>
-    <w:p>
-      <w:r>
-        <w:rPr>
-          <w:b/>
-          <w:color w:val="4A7FC1"/>
-        </w:rPr>
-        <w:t xml:space="preserve">#39  </w:t>
+        <w:t xml:space="preserve">#44  </w:t>
+      </w:r>
+      <w:r>
+        <w:rPr>
+          <w:b/>
+          <w:i w:val="0"/>
+        </w:rPr>
+        <w:t>Energy for the Polar Night</w:t>
+      </w:r>
+    </w:p>
+    <w:p>
+      <w:r>
+        <w:rPr>
+          <w:b/>
+          <w:color w:val="4A7FC1"/>
+        </w:rPr>
+        <w:t xml:space="preserve">#45  </w:t>
       </w:r>
       <w:r>
         <w:rPr>
           <w:b w:val="0"/>
           <w:i w:val="0"/>
         </w:rPr>
-        <w:t>Schools, health, shops and culture</w:t>
-      </w:r>
-    </w:p>
-    <w:p>
-      <w:r>
-        <w:rPr>
-          <w:b/>
-          <w:color w:val="4A7FC1"/>
-        </w:rPr>
-        <w:t xml:space="preserve">#40  </w:t>
+        <w:t>Fusion, wind, sun, geothermal and storage</w:t>
+      </w:r>
+    </w:p>
+    <w:p>
+      <w:r>
+        <w:rPr>
+          <w:b/>
+          <w:color w:val="4A7FC1"/>
+        </w:rPr>
+        <w:t xml:space="preserve">#46  </w:t>
       </w:r>
       <w:r>
         <w:rPr>
@@ -889,39 +985,39 @@
           <w:b/>
           <w:color w:val="4A7FC1"/>
         </w:rPr>
-        <w:t xml:space="preserve">#41  </w:t>
-      </w:r>
-      <w:r>
-        <w:rPr>
-          <w:b/>
-          <w:i w:val="0"/>
-        </w:rPr>
-        <w:t>Homes for the Polar Night</w:t>
-      </w:r>
-    </w:p>
-    <w:p>
-      <w:r>
-        <w:rPr>
-          <w:b/>
-          <w:color w:val="4A7FC1"/>
-        </w:rPr>
-        <w:t xml:space="preserve">#42  </w:t>
+        <w:t xml:space="preserve">#47  </w:t>
+      </w:r>
+      <w:r>
+        <w:rPr>
+          <w:b/>
+          <w:i w:val="0"/>
+        </w:rPr>
+        <w:t>Nothing Is Wasted</w:t>
+      </w:r>
+    </w:p>
+    <w:p>
+      <w:r>
+        <w:rPr>
+          <w:b/>
+          <w:color w:val="4A7FC1"/>
+        </w:rPr>
+        <w:t xml:space="preserve">#48  </w:t>
       </w:r>
       <w:r>
         <w:rPr>
           <w:b w:val="0"/>
           <w:i w:val="0"/>
         </w:rPr>
-        <w:t>Housing for every age, built for −45 °C</w:t>
-      </w:r>
-    </w:p>
-    <w:p>
-      <w:r>
-        <w:rPr>
-          <w:b/>
-          <w:color w:val="4A7FC1"/>
-        </w:rPr>
-        <w:t xml:space="preserve">#43  </w:t>
+        <w:t>Water and waste in closed loops</w:t>
+      </w:r>
+    </w:p>
+    <w:p>
+      <w:r>
+        <w:rPr>
+          <w:b/>
+          <w:color w:val="4A7FC1"/>
+        </w:rPr>
+        <w:t xml:space="preserve">#49  </w:t>
       </w:r>
       <w:r>
         <w:rPr>
@@ -937,39 +1033,39 @@
           <w:b/>
           <w:color w:val="4A7FC1"/>
         </w:rPr>
-        <w:t xml:space="preserve">#44  </w:t>
-      </w:r>
-      <w:r>
-        <w:rPr>
-          <w:b/>
-          <w:i w:val="0"/>
-        </w:rPr>
-        <w:t>Energy for the Polar Night</w:t>
-      </w:r>
-    </w:p>
-    <w:p>
-      <w:r>
-        <w:rPr>
-          <w:b/>
-          <w:color w:val="4A7FC1"/>
-        </w:rPr>
-        <w:t xml:space="preserve">#45  </w:t>
+        <w:t xml:space="preserve">#50  </w:t>
+      </w:r>
+      <w:r>
+        <w:rPr>
+          <w:b/>
+          <w:i w:val="0"/>
+        </w:rPr>
+        <w:t>Wild Neighbours</w:t>
+      </w:r>
+    </w:p>
+    <w:p>
+      <w:r>
+        <w:rPr>
+          <w:b/>
+          <w:color w:val="4A7FC1"/>
+        </w:rPr>
+        <w:t xml:space="preserve">#51  </w:t>
       </w:r>
       <w:r>
         <w:rPr>
           <w:b w:val="0"/>
           <w:i w:val="0"/>
         </w:rPr>
-        <w:t>Fusion, wind, sun, geothermal and storage</w:t>
-      </w:r>
-    </w:p>
-    <w:p>
-      <w:r>
-        <w:rPr>
-          <w:b/>
-          <w:color w:val="4A7FC1"/>
-        </w:rPr>
-        <w:t xml:space="preserve">#46  </w:t>
+        <w:t>Our urban eco-system: plants and animals</w:t>
+      </w:r>
+    </w:p>
+    <w:p>
+      <w:r>
+        <w:rPr>
+          <w:b/>
+          <w:color w:val="4A7FC1"/>
+        </w:rPr>
+        <w:t xml:space="preserve">#52  </w:t>
       </w:r>
       <w:r>
         <w:rPr>
@@ -985,39 +1081,39 @@
           <w:b/>
           <w:color w:val="4A7FC1"/>
         </w:rPr>
-        <w:t xml:space="preserve">#47  </w:t>
-      </w:r>
-      <w:r>
-        <w:rPr>
-          <w:b/>
-          <w:i w:val="0"/>
-        </w:rPr>
-        <w:t>Nothing Is Wasted</w:t>
-      </w:r>
-    </w:p>
-    <w:p>
-      <w:r>
-        <w:rPr>
-          <w:b/>
-          <w:color w:val="4A7FC1"/>
-        </w:rPr>
-        <w:t xml:space="preserve">#48  </w:t>
+        <w:t xml:space="preserve">#53  </w:t>
+      </w:r>
+      <w:r>
+        <w:rPr>
+          <w:b/>
+          <w:i w:val="0"/>
+        </w:rPr>
+        <w:t>Getting Around Fossil-Free</w:t>
+      </w:r>
+    </w:p>
+    <w:p>
+      <w:r>
+        <w:rPr>
+          <w:b/>
+          <w:color w:val="4A7FC1"/>
+        </w:rPr>
+        <w:t xml:space="preserve">#54  </w:t>
       </w:r>
       <w:r>
         <w:rPr>
           <w:b w:val="0"/>
           <w:i w:val="0"/>
         </w:rPr>
-        <w:t>Water and waste in closed loops</w:t>
-      </w:r>
-    </w:p>
-    <w:p>
-      <w:r>
-        <w:rPr>
-          <w:b/>
-          <w:color w:val="4A7FC1"/>
-        </w:rPr>
-        <w:t xml:space="preserve">#49  </w:t>
+        <w:t>Routes, users, capacity, safety and energy</w:t>
+      </w:r>
+    </w:p>
+    <w:p>
+      <w:r>
+        <w:rPr>
+          <w:b/>
+          <w:color w:val="4A7FC1"/>
+        </w:rPr>
+        <w:t xml:space="preserve">#55  </w:t>
       </w:r>
       <w:r>
         <w:rPr>
@@ -1033,39 +1129,39 @@
           <w:b/>
           <w:color w:val="4A7FC1"/>
         </w:rPr>
-        <w:t xml:space="preserve">#50  </w:t>
-      </w:r>
-      <w:r>
-        <w:rPr>
-          <w:b/>
-          <w:i w:val="0"/>
-        </w:rPr>
-        <w:t>Wild Neighbours</w:t>
-      </w:r>
-    </w:p>
-    <w:p>
-      <w:r>
-        <w:rPr>
-          <w:b/>
-          <w:color w:val="4A7FC1"/>
-        </w:rPr>
-        <w:t xml:space="preserve">#51  </w:t>
+        <w:t xml:space="preserve">#56  </w:t>
+      </w:r>
+      <w:r>
+        <w:rPr>
+          <w:b/>
+          <w:i w:val="0"/>
+        </w:rPr>
+        <w:t>Salad Under the Northern Lights</w:t>
+      </w:r>
+    </w:p>
+    <w:p>
+      <w:r>
+        <w:rPr>
+          <w:b/>
+          <w:color w:val="4A7FC1"/>
+        </w:rPr>
+        <w:t xml:space="preserve">#57  </w:t>
       </w:r>
       <w:r>
         <w:rPr>
           <w:b w:val="0"/>
           <w:i w:val="0"/>
         </w:rPr>
-        <w:t>Our urban eco-system: plants and animals</w:t>
-      </w:r>
-    </w:p>
-    <w:p>
-      <w:r>
-        <w:rPr>
-          <w:b/>
-          <w:color w:val="4A7FC1"/>
-        </w:rPr>
-        <w:t xml:space="preserve">#52  </w:t>
+        <w:t>Inside the Evergreen Greenhouse Dome</w:t>
+      </w:r>
+    </w:p>
+    <w:p>
+      <w:r>
+        <w:rPr>
+          <w:b/>
+          <w:color w:val="4A7FC1"/>
+        </w:rPr>
+        <w:t xml:space="preserve">#58  </w:t>
       </w:r>
       <w:r>
         <w:rPr>
@@ -1081,39 +1177,39 @@
           <w:b/>
           <w:color w:val="4A7FC1"/>
         </w:rPr>
-        <w:t xml:space="preserve">#53  </w:t>
-      </w:r>
-      <w:r>
-        <w:rPr>
-          <w:b/>
-          <w:i w:val="0"/>
-        </w:rPr>
-        <w:t>Getting Around Fossil-Free</w:t>
-      </w:r>
-    </w:p>
-    <w:p>
-      <w:r>
-        <w:rPr>
-          <w:b/>
-          <w:color w:val="4A7FC1"/>
-        </w:rPr>
-        <w:t xml:space="preserve">#54  </w:t>
+        <w:t xml:space="preserve">#59  </w:t>
+      </w:r>
+      <w:r>
+        <w:rPr>
+          <w:b/>
+          <w:i w:val="0"/>
+        </w:rPr>
+        <w:t>Safe and Ready for Any Storm</w:t>
+      </w:r>
+    </w:p>
+    <w:p>
+      <w:r>
+        <w:rPr>
+          <w:b/>
+          <w:color w:val="4A7FC1"/>
+        </w:rPr>
+        <w:t xml:space="preserve">#60  </w:t>
       </w:r>
       <w:r>
         <w:rPr>
           <w:b w:val="0"/>
           <w:i w:val="0"/>
         </w:rPr>
-        <w:t>Routes, users, capacity, safety and energy</w:t>
-      </w:r>
-    </w:p>
-    <w:p>
-      <w:r>
-        <w:rPr>
-          <w:b/>
-          <w:color w:val="4A7FC1"/>
-        </w:rPr>
-        <w:t xml:space="preserve">#55  </w:t>
+        <w:t>Rescue, shelters and blizzard forecasts</w:t>
+      </w:r>
+    </w:p>
+    <w:p>
+      <w:r>
+        <w:rPr>
+          <w:b/>
+          <w:color w:val="4A7FC1"/>
+        </w:rPr>
+        <w:t xml:space="preserve">#61  </w:t>
       </w:r>
       <w:r>
         <w:rPr>
@@ -1129,39 +1225,39 @@
           <w:b/>
           <w:color w:val="4A7FC1"/>
         </w:rPr>
-        <w:t xml:space="preserve">#56  </w:t>
-      </w:r>
-      <w:r>
-        <w:rPr>
-          <w:b/>
-          <w:i w:val="0"/>
-        </w:rPr>
-        <w:t>Salad Under the Northern Lights</w:t>
-      </w:r>
-    </w:p>
-    <w:p>
-      <w:r>
-        <w:rPr>
-          <w:b/>
-          <w:color w:val="4A7FC1"/>
-        </w:rPr>
-        <w:t xml:space="preserve">#57  </w:t>
+        <w:t xml:space="preserve">#62  </w:t>
+      </w:r>
+      <w:r>
+        <w:rPr>
+          <w:b/>
+          <w:i w:val="0"/>
+        </w:rPr>
+        <w:t>Pros &amp; Cons</w:t>
+      </w:r>
+    </w:p>
+    <w:p>
+      <w:r>
+        <w:rPr>
+          <w:b/>
+          <w:color w:val="4A7FC1"/>
+        </w:rPr>
+        <w:t xml:space="preserve">#63  </w:t>
       </w:r>
       <w:r>
         <w:rPr>
           <w:b w:val="0"/>
           <w:i w:val="0"/>
         </w:rPr>
-        <w:t>Inside the Evergreen Greenhouse Dome</w:t>
-      </w:r>
-    </w:p>
-    <w:p>
-      <w:r>
-        <w:rPr>
-          <w:b/>
-          <w:color w:val="4A7FC1"/>
-        </w:rPr>
-        <w:t xml:space="preserve">#58  </w:t>
+        <w:t>Advantages, risks, costs and trade-offs</w:t>
+      </w:r>
+    </w:p>
+    <w:p>
+      <w:r>
+        <w:rPr>
+          <w:b/>
+          <w:color w:val="4A7FC1"/>
+        </w:rPr>
+        <w:t xml:space="preserve">#64  </w:t>
       </w:r>
       <w:r>
         <w:rPr>
@@ -1177,39 +1273,39 @@
           <w:b/>
           <w:color w:val="4A7FC1"/>
         </w:rPr>
-        <w:t xml:space="preserve">#59  </w:t>
-      </w:r>
-      <w:r>
-        <w:rPr>
-          <w:b/>
-          <w:i w:val="0"/>
-        </w:rPr>
-        <w:t>Safe and Ready for Any Storm</w:t>
-      </w:r>
-    </w:p>
-    <w:p>
-      <w:r>
-        <w:rPr>
-          <w:b/>
-          <w:color w:val="4A7FC1"/>
-        </w:rPr>
-        <w:t xml:space="preserve">#60  </w:t>
+        <w:t xml:space="preserve">#65  </w:t>
+      </w:r>
+      <w:r>
+        <w:rPr>
+          <w:b/>
+          <w:i w:val="0"/>
+        </w:rPr>
+        <w:t>Invest in Aurora Haven</w:t>
+      </w:r>
+    </w:p>
+    <w:p>
+      <w:r>
+        <w:rPr>
+          <w:b/>
+          <w:color w:val="4A7FC1"/>
+        </w:rPr>
+        <w:t xml:space="preserve">#66  </w:t>
       </w:r>
       <w:r>
         <w:rPr>
           <w:b w:val="0"/>
           <w:i w:val="0"/>
         </w:rPr>
-        <w:t>Rescue, shelters and blizzard forecasts</w:t>
-      </w:r>
-    </w:p>
-    <w:p>
-      <w:r>
-        <w:rPr>
-          <w:b/>
-          <w:color w:val="4A7FC1"/>
-        </w:rPr>
-        <w:t xml:space="preserve">#61  </w:t>
+        <w:t>Three ways to fund the city, stage by stage</w:t>
+      </w:r>
+    </w:p>
+    <w:p>
+      <w:r>
+        <w:rPr>
+          <w:b/>
+          <w:color w:val="4A7FC1"/>
+        </w:rPr>
+        <w:t xml:space="preserve">#67  </w:t>
       </w:r>
       <w:r>
         <w:rPr>
@@ -1225,39 +1321,39 @@
           <w:b/>
           <w:color w:val="4A7FC1"/>
         </w:rPr>
-        <w:t xml:space="preserve">#62  </w:t>
-      </w:r>
-      <w:r>
-        <w:rPr>
-          <w:b/>
-          <w:i w:val="0"/>
-        </w:rPr>
-        <w:t>Pros &amp; Cons</w:t>
-      </w:r>
-    </w:p>
-    <w:p>
-      <w:r>
-        <w:rPr>
-          <w:b/>
-          <w:color w:val="4A7FC1"/>
-        </w:rPr>
-        <w:t xml:space="preserve">#63  </w:t>
+        <w:t xml:space="preserve">#68  </w:t>
+      </w:r>
+      <w:r>
+        <w:rPr>
+          <w:b/>
+          <w:i w:val="0"/>
+        </w:rPr>
+        <w:t>Take the Tour</w:t>
+      </w:r>
+    </w:p>
+    <w:p>
+      <w:r>
+        <w:rPr>
+          <w:b/>
+          <w:color w:val="4A7FC1"/>
+        </w:rPr>
+        <w:t xml:space="preserve">#69  </w:t>
       </w:r>
       <w:r>
         <w:rPr>
           <w:b w:val="0"/>
           <w:i w:val="0"/>
         </w:rPr>
-        <w:t>Advantages, risks, costs and trade-offs</w:t>
-      </w:r>
-    </w:p>
-    <w:p>
-      <w:r>
-        <w:rPr>
-          <w:b/>
-          <w:color w:val="4A7FC1"/>
-        </w:rPr>
-        <w:t xml:space="preserve">#64  </w:t>
+        <w:t>Eight stops around the city</w:t>
+      </w:r>
+    </w:p>
+    <w:p>
+      <w:r>
+        <w:rPr>
+          <w:b/>
+          <w:color w:val="4A7FC1"/>
+        </w:rPr>
+        <w:t xml:space="preserve">#70  </w:t>
       </w:r>
       <w:r>
         <w:rPr>
@@ -1273,39 +1369,39 @@
           <w:b/>
           <w:color w:val="4A7FC1"/>
         </w:rPr>
-        <w:t xml:space="preserve">#65  </w:t>
-      </w:r>
-      <w:r>
-        <w:rPr>
-          <w:b/>
-          <w:i w:val="0"/>
-        </w:rPr>
-        <w:t>Invest in Aurora Haven</w:t>
-      </w:r>
-    </w:p>
-    <w:p>
-      <w:r>
-        <w:rPr>
-          <w:b/>
-          <w:color w:val="4A7FC1"/>
-        </w:rPr>
-        <w:t xml:space="preserve">#66  </w:t>
+        <w:t xml:space="preserve">#71  </w:t>
+      </w:r>
+      <w:r>
+        <w:rPr>
+          <w:b/>
+          <w:i w:val="0"/>
+        </w:rPr>
+        <w:t>Places to Visit</w:t>
+      </w:r>
+    </w:p>
+    <w:p>
+      <w:r>
+        <w:rPr>
+          <w:b/>
+          <w:color w:val="4A7FC1"/>
+        </w:rPr>
+        <w:t xml:space="preserve">#72  </w:t>
       </w:r>
       <w:r>
         <w:rPr>
           <w:b w:val="0"/>
           <w:i w:val="0"/>
         </w:rPr>
-        <w:t>Three ways to fund the city, stage by stage</w:t>
-      </w:r>
-    </w:p>
-    <w:p>
-      <w:r>
-        <w:rPr>
-          <w:b/>
-          <w:color w:val="4A7FC1"/>
-        </w:rPr>
-        <w:t xml:space="preserve">#67  </w:t>
+        <w:t>35 key places and what they do</w:t>
+      </w:r>
+    </w:p>
+    <w:p>
+      <w:r>
+        <w:rPr>
+          <w:b/>
+          <w:color w:val="4A7FC1"/>
+        </w:rPr>
+        <w:t xml:space="preserve">#73  </w:t>
       </w:r>
       <w:r>
         <w:rPr>
@@ -1321,39 +1417,39 @@
           <w:b/>
           <w:color w:val="4A7FC1"/>
         </w:rPr>
-        <w:t xml:space="preserve">#68  </w:t>
-      </w:r>
-      <w:r>
-        <w:rPr>
-          <w:b/>
-          <w:i w:val="0"/>
-        </w:rPr>
-        <w:t>Take the Tour</w:t>
-      </w:r>
-    </w:p>
-    <w:p>
-      <w:r>
-        <w:rPr>
-          <w:b/>
-          <w:color w:val="4A7FC1"/>
-        </w:rPr>
-        <w:t xml:space="preserve">#69  </w:t>
+        <w:t xml:space="preserve">#74  </w:t>
+      </w:r>
+      <w:r>
+        <w:rPr>
+          <w:b/>
+          <w:i w:val="0"/>
+        </w:rPr>
+        <w:t>Through a Resident’s Eyes</w:t>
+      </w:r>
+    </w:p>
+    <w:p>
+      <w:r>
+        <w:rPr>
+          <w:b/>
+          <w:color w:val="4A7FC1"/>
+        </w:rPr>
+        <w:t xml:space="preserve">#75  </w:t>
       </w:r>
       <w:r>
         <w:rPr>
           <w:b w:val="0"/>
           <w:i w:val="0"/>
         </w:rPr>
-        <w:t>Eight stops around the city</w:t>
-      </w:r>
-    </w:p>
-    <w:p>
-      <w:r>
-        <w:rPr>
-          <w:b/>
-          <w:color w:val="4A7FC1"/>
-        </w:rPr>
-        <w:t xml:space="preserve">#70  </w:t>
+        <w:t>An imagined day in the polar night</w:t>
+      </w:r>
+    </w:p>
+    <w:p>
+      <w:r>
+        <w:rPr>
+          <w:b/>
+          <w:color w:val="4A7FC1"/>
+        </w:rPr>
+        <w:t xml:space="preserve">#76  </w:t>
       </w:r>
       <w:r>
         <w:rPr>
@@ -1369,126 +1465,46 @@
           <w:b/>
           <w:color w:val="4A7FC1"/>
         </w:rPr>
-        <w:t xml:space="preserve">#71  </w:t>
-      </w:r>
-      <w:r>
-        <w:rPr>
-          <w:b/>
-          <w:i w:val="0"/>
-        </w:rPr>
-        <w:t>Places to Visit</w:t>
-      </w:r>
-    </w:p>
-    <w:p>
-      <w:r>
-        <w:rPr>
-          <w:b/>
-          <w:color w:val="4A7FC1"/>
-        </w:rPr>
-        <w:t xml:space="preserve">#72  </w:t>
+        <w:t xml:space="preserve">#77  </w:t>
+      </w:r>
+      <w:r>
+        <w:rPr>
+          <w:b/>
+          <w:i w:val="0"/>
+        </w:rPr>
+        <w:t>Sources &amp; Assumptions</w:t>
+      </w:r>
+    </w:p>
+    <w:p>
+      <w:r>
+        <w:rPr>
+          <w:b/>
+          <w:color w:val="4A7FC1"/>
+        </w:rPr>
+        <w:t xml:space="preserve">#78  </w:t>
       </w:r>
       <w:r>
         <w:rPr>
           <w:b w:val="0"/>
           <w:i w:val="0"/>
         </w:rPr>
-        <w:t>35 key places and what they do</w:t>
-      </w:r>
-    </w:p>
-    <w:p>
-      <w:r>
-        <w:rPr>
-          <w:b/>
-          <w:color w:val="4A7FC1"/>
-        </w:rPr>
-        <w:t xml:space="preserve">#73  </w:t>
-      </w:r>
-      <w:r>
-        <w:rPr>
-          <w:b/>
-          <w:i w:val="0"/>
-        </w:rPr>
-        <w:t>37</w:t>
-      </w:r>
-    </w:p>
-    <w:p>
-      <w:r>
-        <w:rPr>
-          <w:b/>
-          <w:color w:val="4A7FC1"/>
-        </w:rPr>
-        <w:t xml:space="preserve">#74  </w:t>
-      </w:r>
-      <w:r>
-        <w:rPr>
-          <w:b/>
-          <w:i w:val="0"/>
-        </w:rPr>
-        <w:t>Through a Resident’s Eyes</w:t>
-      </w:r>
-    </w:p>
-    <w:p>
-      <w:r>
-        <w:rPr>
-          <w:b/>
-          <w:color w:val="4A7FC1"/>
-        </w:rPr>
-        <w:t xml:space="preserve">#75  </w:t>
-      </w:r>
-      <w:r>
-        <w:rPr>
-          <w:b w:val="0"/>
-          <w:i w:val="0"/>
-        </w:rPr>
-        <w:t>An imagined day in the polar night</w:t>
-      </w:r>
-    </w:p>
-    <w:p>
-      <w:r>
-        <w:rPr>
-          <w:b/>
-          <w:color w:val="4A7FC1"/>
-        </w:rPr>
-        <w:t xml:space="preserve">#76  </w:t>
-      </w:r>
-      <w:r>
-        <w:rPr>
-          <w:b/>
-          <w:i w:val="0"/>
-        </w:rPr>
-        <w:t>38</w:t>
-      </w:r>
-    </w:p>
-    <w:p>
-      <w:r>
-        <w:rPr>
-          <w:b/>
-          <w:color w:val="4A7FC1"/>
-        </w:rPr>
-        <w:t xml:space="preserve">#77  </w:t>
-      </w:r>
-      <w:r>
-        <w:rPr>
-          <w:b/>
-          <w:i w:val="0"/>
-        </w:rPr>
-        <w:t>Sources &amp; Assumptions</w:t>
-      </w:r>
-    </w:p>
-    <w:p>
-      <w:r>
-        <w:rPr>
-          <w:b/>
-          <w:color w:val="4A7FC1"/>
-        </w:rPr>
-        <w:t xml:space="preserve">#78  </w:t>
-      </w:r>
-      <w:r>
-        <w:rPr>
-          <w:b w:val="0"/>
-          <w:i w:val="0"/>
-        </w:rPr>
         <w:t>Where our facts come from</w:t>
+      </w:r>
+    </w:p>
+    <w:p>
+      <w:r>
+        <w:rPr>
+          <w:b/>
+          <w:color w:val="4A7FC1"/>
+        </w:rPr>
+        <w:t xml:space="preserve">#79  </w:t>
+      </w:r>
+      <w:r>
+        <w:rPr>
+          <w:b/>
+          <w:i w:val="0"/>
+        </w:rPr>
+        <w:t>1</w:t>
       </w:r>
     </w:p>
     <w:p>
@@ -1651,6 +1667,22 @@
       </w:r>
     </w:p>
     <w:p>
+      <w:r>
+        <w:rPr>
+          <w:b/>
+          <w:color w:val="4A7FC1"/>
+        </w:rPr>
+        <w:t xml:space="preserve">#10  </w:t>
+      </w:r>
+      <w:r>
+        <w:rPr>
+          <w:b/>
+          <w:i w:val="0"/>
+        </w:rPr>
+        <w:t>2</w:t>
+      </w:r>
+    </w:p>
+    <w:p>
       <w:pPr>
         <w:pStyle w:val="Heading1"/>
       </w:pPr>
@@ -1974,6 +2006,22 @@
       </w:r>
     </w:p>
     <w:p>
+      <w:r>
+        <w:rPr>
+          <w:b/>
+          <w:color w:val="4A7FC1"/>
+        </w:rPr>
+        <w:t xml:space="preserve">#19  </w:t>
+      </w:r>
+      <w:r>
+        <w:rPr>
+          <w:b/>
+          <w:i w:val="0"/>
+        </w:rPr>
+        <w:t>3</w:t>
+      </w:r>
+    </w:p>
+    <w:p>
       <w:pPr>
         <w:pStyle w:val="Heading1"/>
       </w:pPr>
@@ -2087,6 +2135,22 @@
       </w:r>
     </w:p>
     <w:p>
+      <w:r>
+        <w:rPr>
+          <w:b/>
+          <w:color w:val="4A7FC1"/>
+        </w:rPr>
+        <w:t xml:space="preserve">#6  </w:t>
+      </w:r>
+      <w:r>
+        <w:rPr>
+          <w:b/>
+          <w:i w:val="0"/>
+        </w:rPr>
+        <w:t>4</w:t>
+      </w:r>
+    </w:p>
+    <w:p>
       <w:pPr>
         <w:pStyle w:val="Heading1"/>
       </w:pPr>
@@ -2264,6 +2328,22 @@
       </w:r>
     </w:p>
     <w:p>
+      <w:r>
+        <w:rPr>
+          <w:b/>
+          <w:color w:val="4A7FC1"/>
+        </w:rPr>
+        <w:t xml:space="preserve">#11  </w:t>
+      </w:r>
+      <w:r>
+        <w:rPr>
+          <w:b/>
+          <w:i w:val="0"/>
+        </w:rPr>
+        <w:t>5</w:t>
+      </w:r>
+    </w:p>
+    <w:p>
       <w:pPr>
         <w:pStyle w:val="Heading1"/>
       </w:pPr>
@@ -2514,6 +2594,22 @@
       </w:r>
     </w:p>
     <w:p>
+      <w:r>
+        <w:rPr>
+          <w:b/>
+          <w:color w:val="4A7FC1"/>
+        </w:rPr>
+        <w:t xml:space="preserve">#15  </w:t>
+      </w:r>
+      <w:r>
+        <w:rPr>
+          <w:b/>
+          <w:i w:val="0"/>
+        </w:rPr>
+        <w:t>6</w:t>
+      </w:r>
+    </w:p>
+    <w:p>
       <w:pPr>
         <w:pStyle w:val="Heading1"/>
       </w:pPr>
@@ -2941,6 +3037,22 @@
       </w:r>
     </w:p>
     <w:p>
+      <w:r>
+        <w:rPr>
+          <w:b/>
+          <w:color w:val="4A7FC1"/>
+        </w:rPr>
+        <w:t xml:space="preserve">#25  </w:t>
+      </w:r>
+      <w:r>
+        <w:rPr>
+          <w:b/>
+          <w:i w:val="0"/>
+        </w:rPr>
+        <w:t>7</w:t>
+      </w:r>
+    </w:p>
+    <w:p>
       <w:pPr>
         <w:pStyle w:val="Heading1"/>
       </w:pPr>
@@ -3022,6 +3134,22 @@
       </w:r>
     </w:p>
     <w:p>
+      <w:r>
+        <w:rPr>
+          <w:b/>
+          <w:color w:val="4A7FC1"/>
+        </w:rPr>
+        <w:t xml:space="preserve">#5  </w:t>
+      </w:r>
+      <w:r>
+        <w:rPr>
+          <w:b/>
+          <w:i w:val="0"/>
+        </w:rPr>
+        <w:t>8</w:t>
+      </w:r>
+    </w:p>
+    <w:p>
       <w:pPr>
         <w:pStyle w:val="Heading1"/>
       </w:pPr>
@@ -3046,6 +3174,22 @@
       </w:r>
     </w:p>
     <w:p>
+      <w:r>
+        <w:rPr>
+          <w:b/>
+          <w:color w:val="4A7FC1"/>
+        </w:rPr>
+        <w:t xml:space="preserve">#2  </w:t>
+      </w:r>
+      <w:r>
+        <w:rPr>
+          <w:b/>
+          <w:i w:val="0"/>
+        </w:rPr>
+        <w:t>9</w:t>
+      </w:r>
+    </w:p>
+    <w:p>
       <w:pPr>
         <w:pStyle w:val="Heading1"/>
       </w:pPr>
@@ -3098,7 +3242,7 @@
           <w:b w:val="0"/>
           <w:i/>
         </w:rPr>
-        <w:t>Aurora Haven – City Master Plan. North is up; one unit is one metre. Drawn from the 3D model; the numbers are the 35 places listed on page 36.</w:t>
+        <w:t>Aurora Haven – City Master Plan. North is up; one unit is one metre. Drawn from the 3D model; the numbers are the 35 places listed on page 34.</w:t>
       </w:r>
     </w:p>
     <w:p>
@@ -3259,6 +3403,22 @@
           <w:i w:val="0"/>
         </w:rPr>
         <w:t>Framed by Liberty Mall, Mount Aurora rises with its geothermal spa resort inside.</w:t>
+      </w:r>
+    </w:p>
+    <w:p>
+      <w:r>
+        <w:rPr>
+          <w:b/>
+          <w:color w:val="4A7FC1"/>
+        </w:rPr>
+        <w:t xml:space="preserve">#14  </w:t>
+      </w:r>
+      <w:r>
+        <w:rPr>
+          <w:b/>
+          <w:i w:val="0"/>
+        </w:rPr>
+        <w:t>10</w:t>
       </w:r>
     </w:p>
     <w:p>
@@ -3606,6 +3766,22 @@
       </w:r>
     </w:p>
     <w:p>
+      <w:r>
+        <w:rPr>
+          <w:b/>
+          <w:color w:val="4A7FC1"/>
+        </w:rPr>
+        <w:t xml:space="preserve">#22  </w:t>
+      </w:r>
+      <w:r>
+        <w:rPr>
+          <w:b/>
+          <w:i w:val="0"/>
+        </w:rPr>
+        <w:t>11</w:t>
+      </w:r>
+    </w:p>
+    <w:p>
       <w:pPr>
         <w:pStyle w:val="Heading1"/>
       </w:pPr>
@@ -3712,6 +3888,22 @@
       </w:r>
     </w:p>
     <w:p>
+      <w:r>
+        <w:rPr>
+          <w:b/>
+          <w:color w:val="4A7FC1"/>
+        </w:rPr>
+        <w:t xml:space="preserve">#6  </w:t>
+      </w:r>
+      <w:r>
+        <w:rPr>
+          <w:b/>
+          <w:i w:val="0"/>
+        </w:rPr>
+        <w:t>12</w:t>
+      </w:r>
+    </w:p>
+    <w:p>
       <w:pPr>
         <w:pStyle w:val="Heading1"/>
       </w:pPr>
@@ -3796,7 +3988,7 @@
           <w:b w:val="0"/>
           <w:i w:val="0"/>
         </w:rPr>
-        <w:t>A day at 800 MW needs about 0.2 kg of fuel, close to our 170 g design. Breeding tritium at scale is unproven [11] and ITER costs €18–22 billion [12], so the city starts on wind, sun and geothermal power (page 27).</w:t>
+        <w:t>A day at 800 MW needs about 0.2 kg of fuel, close to our 170 g design. Breeding tritium at scale is unproven [11] and ITER costs €18–22 billion [12], so the city starts on wind, sun and geothermal power (page 25).</w:t>
       </w:r>
     </w:p>
     <w:p>
@@ -3813,6 +4005,22 @@
           <w:i/>
         </w:rPr>
         <w:t>The Fusion Core, a compact D-T tokamak, glowing violet under the northern lights.</w:t>
+      </w:r>
+    </w:p>
+    <w:p>
+      <w:r>
+        <w:rPr>
+          <w:b/>
+          <w:color w:val="4A7FC1"/>
+        </w:rPr>
+        <w:t xml:space="preserve">#7  </w:t>
+      </w:r>
+      <w:r>
+        <w:rPr>
+          <w:b/>
+          <w:i w:val="0"/>
+        </w:rPr>
+        <w:t>13</w:t>
       </w:r>
     </w:p>
     <w:p>
@@ -4263,6 +4471,22 @@
       </w:r>
     </w:p>
     <w:p>
+      <w:r>
+        <w:rPr>
+          <w:b/>
+          <w:color w:val="4A7FC1"/>
+        </w:rPr>
+        <w:t xml:space="preserve">#24  </w:t>
+      </w:r>
+      <w:r>
+        <w:rPr>
+          <w:b/>
+          <w:i w:val="0"/>
+        </w:rPr>
+        <w:t>14</w:t>
+      </w:r>
+    </w:p>
+    <w:p>
       <w:pPr>
         <w:pStyle w:val="Heading1"/>
       </w:pPr>
@@ -4383,6 +4607,22 @@
       </w:r>
     </w:p>
     <w:p>
+      <w:r>
+        <w:rPr>
+          <w:b/>
+          <w:color w:val="4A7FC1"/>
+        </w:rPr>
+        <w:t xml:space="preserve">#8  </w:t>
+      </w:r>
+      <w:r>
+        <w:rPr>
+          <w:b/>
+          <w:i w:val="0"/>
+        </w:rPr>
+        <w:t>15</w:t>
+      </w:r>
+    </w:p>
+    <w:p>
       <w:pPr>
         <w:pStyle w:val="Heading1"/>
       </w:pPr>
@@ -4807,6 +5047,22 @@
       </w:r>
     </w:p>
     <w:p>
+      <w:r>
+        <w:rPr>
+          <w:b/>
+          <w:color w:val="4A7FC1"/>
+        </w:rPr>
+        <w:t xml:space="preserve">#27  </w:t>
+      </w:r>
+      <w:r>
+        <w:rPr>
+          <w:b/>
+          <w:i w:val="0"/>
+        </w:rPr>
+        <w:t>16</w:t>
+      </w:r>
+    </w:p>
+    <w:p>
       <w:pPr>
         <w:pStyle w:val="Heading1"/>
       </w:pPr>
@@ -4936,6 +5192,22 @@
       </w:r>
     </w:p>
     <w:p>
+      <w:r>
+        <w:rPr>
+          <w:b/>
+          <w:color w:val="4A7FC1"/>
+        </w:rPr>
+        <w:t xml:space="preserve">#8  </w:t>
+      </w:r>
+      <w:r>
+        <w:rPr>
+          <w:b/>
+          <w:i w:val="0"/>
+        </w:rPr>
+        <w:t>17</w:t>
+      </w:r>
+    </w:p>
+    <w:p>
       <w:pPr>
         <w:pStyle w:val="Heading1"/>
       </w:pPr>
@@ -5008,6 +5280,22 @@
       </w:r>
     </w:p>
     <w:p>
+      <w:r>
+        <w:rPr>
+          <w:b/>
+          <w:color w:val="4A7FC1"/>
+        </w:rPr>
+        <w:t xml:space="preserve">#5  </w:t>
+      </w:r>
+      <w:r>
+        <w:rPr>
+          <w:b/>
+          <w:i w:val="0"/>
+        </w:rPr>
+        <w:t>18</w:t>
+      </w:r>
+    </w:p>
+    <w:p>
       <w:pPr>
         <w:pStyle w:val="Heading1"/>
       </w:pPr>
@@ -5112,6 +5400,22 @@
       </w:r>
     </w:p>
     <w:p>
+      <w:r>
+        <w:rPr>
+          <w:b/>
+          <w:color w:val="4A7FC1"/>
+        </w:rPr>
+        <w:t xml:space="preserve">#7  </w:t>
+      </w:r>
+      <w:r>
+        <w:rPr>
+          <w:b/>
+          <w:i w:val="0"/>
+        </w:rPr>
+        <w:t>19</w:t>
+      </w:r>
+    </w:p>
+    <w:p>
       <w:pPr>
         <w:pStyle w:val="Heading1"/>
       </w:pPr>
@@ -5371,6 +5675,22 @@
       </w:r>
     </w:p>
     <w:p>
+      <w:r>
+        <w:rPr>
+          <w:b/>
+          <w:color w:val="4A7FC1"/>
+        </w:rPr>
+        <w:t xml:space="preserve">#14  </w:t>
+      </w:r>
+      <w:r>
+        <w:rPr>
+          <w:b/>
+          <w:i w:val="0"/>
+        </w:rPr>
+        <w:t>20</w:t>
+      </w:r>
+    </w:p>
+    <w:p>
       <w:pPr>
         <w:pStyle w:val="Heading1"/>
       </w:pPr>
@@ -5674,6 +5994,22 @@
       </w:r>
     </w:p>
     <w:p>
+      <w:r>
+        <w:rPr>
+          <w:b/>
+          <w:color w:val="4A7FC1"/>
+        </w:rPr>
+        <w:t xml:space="preserve">#15  </w:t>
+      </w:r>
+      <w:r>
+        <w:rPr>
+          <w:b/>
+          <w:i w:val="0"/>
+        </w:rPr>
+        <w:t>21</w:t>
+      </w:r>
+    </w:p>
+    <w:p>
       <w:pPr>
         <w:pStyle w:val="Heading1"/>
       </w:pPr>
@@ -6155,6 +6491,22 @@
       </w:r>
     </w:p>
     <w:p>
+      <w:r>
+        <w:rPr>
+          <w:b/>
+          <w:color w:val="4A7FC1"/>
+        </w:rPr>
+        <w:t xml:space="preserve">#30  </w:t>
+      </w:r>
+      <w:r>
+        <w:rPr>
+          <w:b/>
+          <w:i w:val="0"/>
+        </w:rPr>
+        <w:t>22</w:t>
+      </w:r>
+    </w:p>
+    <w:p>
       <w:pPr>
         <w:pStyle w:val="Heading1"/>
       </w:pPr>
@@ -6451,6 +6803,22 @@
       </w:r>
     </w:p>
     <w:p>
+      <w:r>
+        <w:rPr>
+          <w:b/>
+          <w:color w:val="4A7FC1"/>
+        </w:rPr>
+        <w:t xml:space="preserve">#19  </w:t>
+      </w:r>
+      <w:r>
+        <w:rPr>
+          <w:b/>
+          <w:i w:val="0"/>
+        </w:rPr>
+        <w:t>23</w:t>
+      </w:r>
+    </w:p>
+    <w:p>
       <w:pPr>
         <w:pStyle w:val="Heading1"/>
       </w:pPr>
@@ -6923,6 +7291,22 @@
       </w:r>
     </w:p>
     <w:p>
+      <w:r>
+        <w:rPr>
+          <w:b/>
+          <w:color w:val="4A7FC1"/>
+        </w:rPr>
+        <w:t xml:space="preserve">#30  </w:t>
+      </w:r>
+      <w:r>
+        <w:rPr>
+          <w:b/>
+          <w:i w:val="0"/>
+        </w:rPr>
+        <w:t>24</w:t>
+      </w:r>
+    </w:p>
+    <w:p>
       <w:pPr>
         <w:pStyle w:val="Heading1"/>
       </w:pPr>
@@ -7139,6 +7523,22 @@
       </w:r>
     </w:p>
     <w:p>
+      <w:r>
+        <w:rPr>
+          <w:b/>
+          <w:color w:val="4A7FC1"/>
+        </w:rPr>
+        <w:t xml:space="preserve">#14  </w:t>
+      </w:r>
+      <w:r>
+        <w:rPr>
+          <w:b/>
+          <w:i w:val="0"/>
+        </w:rPr>
+        <w:t>25</w:t>
+      </w:r>
+    </w:p>
+    <w:p>
       <w:pPr>
         <w:pStyle w:val="Heading1"/>
       </w:pPr>
@@ -7549,6 +7949,22 @@
       </w:r>
     </w:p>
     <w:p>
+      <w:r>
+        <w:rPr>
+          <w:b/>
+          <w:color w:val="4A7FC1"/>
+        </w:rPr>
+        <w:t xml:space="preserve">#25  </w:t>
+      </w:r>
+      <w:r>
+        <w:rPr>
+          <w:b/>
+          <w:i w:val="0"/>
+        </w:rPr>
+        <w:t>26</w:t>
+      </w:r>
+    </w:p>
+    <w:p>
       <w:pPr>
         <w:pStyle w:val="Heading1"/>
       </w:pPr>
@@ -7818,6 +8234,22 @@
       </w:r>
     </w:p>
     <w:p>
+      <w:r>
+        <w:rPr>
+          <w:b/>
+          <w:color w:val="4A7FC1"/>
+        </w:rPr>
+        <w:t xml:space="preserve">#10  </w:t>
+      </w:r>
+      <w:r>
+        <w:rPr>
+          <w:b/>
+          <w:i w:val="0"/>
+        </w:rPr>
+        <w:t>27</w:t>
+      </w:r>
+    </w:p>
+    <w:p>
       <w:pPr>
         <w:pStyle w:val="Heading1"/>
       </w:pPr>
@@ -8198,6 +8630,22 @@
       </w:r>
     </w:p>
     <w:p>
+      <w:r>
+        <w:rPr>
+          <w:b/>
+          <w:color w:val="4A7FC1"/>
+        </w:rPr>
+        <w:t xml:space="preserve">#22  </w:t>
+      </w:r>
+      <w:r>
+        <w:rPr>
+          <w:b/>
+          <w:i w:val="0"/>
+        </w:rPr>
+        <w:t>28</w:t>
+      </w:r>
+    </w:p>
+    <w:p>
       <w:pPr>
         <w:pStyle w:val="Heading1"/>
       </w:pPr>
@@ -8350,6 +8798,22 @@
       </w:r>
     </w:p>
     <w:p>
+      <w:r>
+        <w:rPr>
+          <w:b/>
+          <w:color w:val="4A7FC1"/>
+        </w:rPr>
+        <w:t xml:space="preserve">#10  </w:t>
+      </w:r>
+      <w:r>
+        <w:rPr>
+          <w:b/>
+          <w:i w:val="0"/>
+        </w:rPr>
+        <w:t>29</w:t>
+      </w:r>
+    </w:p>
+    <w:p>
       <w:pPr>
         <w:pStyle w:val="Heading1"/>
       </w:pPr>
@@ -8552,6 +9016,22 @@
       </w:r>
     </w:p>
     <w:p>
+      <w:r>
+        <w:rPr>
+          <w:b/>
+          <w:color w:val="4A7FC1"/>
+        </w:rPr>
+        <w:t xml:space="preserve">#12  </w:t>
+      </w:r>
+      <w:r>
+        <w:rPr>
+          <w:b/>
+          <w:i w:val="0"/>
+        </w:rPr>
+        <w:t>30</w:t>
+      </w:r>
+    </w:p>
+    <w:p>
       <w:pPr>
         <w:pStyle w:val="Heading1"/>
       </w:pPr>
@@ -9141,6 +9621,22 @@
       </w:r>
     </w:p>
     <w:p>
+      <w:r>
+        <w:rPr>
+          <w:b/>
+          <w:color w:val="4A7FC1"/>
+        </w:rPr>
+        <w:t xml:space="preserve">#28  </w:t>
+      </w:r>
+      <w:r>
+        <w:rPr>
+          <w:b/>
+          <w:i w:val="0"/>
+        </w:rPr>
+        <w:t>31</w:t>
+      </w:r>
+    </w:p>
+    <w:p>
       <w:pPr>
         <w:pStyle w:val="Heading1"/>
       </w:pPr>
@@ -9598,7 +10094,7 @@
           <w:b w:val="0"/>
           <w:i/>
         </w:rPr>
-        <w:t>Please note: these are future concepts, not tested projects. Costs and returns still have to be worked out in a full business plan, and no return is guaranteed. The risks are on page 33.</w:t>
+        <w:t>Please note: these are future concepts, not tested projects. Costs and returns still have to be worked out in a full business plan, and no return is guaranteed. The risks are on page 31.</w:t>
       </w:r>
     </w:p>
     <w:p>
@@ -9621,7 +10117,23 @@
           <w:b w:val="0"/>
           <w:i w:val="0"/>
         </w:rPr>
-        <w:t>Visit the Aurora Green Finance Hall in the Financial District, or meet our team on page 5.</w:t>
+        <w:t>Visit the Aurora Green Finance Hall in the Financial District, or meet our team on page 3.</w:t>
+      </w:r>
+    </w:p>
+    <w:p>
+      <w:r>
+        <w:rPr>
+          <w:b/>
+          <w:color w:val="4A7FC1"/>
+        </w:rPr>
+        <w:t xml:space="preserve">#29  </w:t>
+      </w:r>
+      <w:r>
+        <w:rPr>
+          <w:b/>
+          <w:i w:val="0"/>
+        </w:rPr>
+        <w:t>32</w:t>
       </w:r>
     </w:p>
     <w:p>
@@ -10121,6 +10633,22 @@
       </w:r>
     </w:p>
     <w:p>
+      <w:r>
+        <w:rPr>
+          <w:b/>
+          <w:color w:val="4A7FC1"/>
+        </w:rPr>
+        <w:t xml:space="preserve">#27  </w:t>
+      </w:r>
+      <w:r>
+        <w:rPr>
+          <w:b/>
+          <w:i w:val="0"/>
+        </w:rPr>
+        <w:t>33</w:t>
+      </w:r>
+    </w:p>
+    <w:p>
       <w:pPr>
         <w:pStyle w:val="Heading1"/>
       </w:pPr>
@@ -10173,7 +10701,7 @@
           <w:b w:val="0"/>
           <w:i/>
         </w:rPr>
-        <w:t>The numbers match the markers on the city master plan on page 12.</w:t>
+        <w:t>The numbers match the markers on the city master plan on page 10.</w:t>
       </w:r>
     </w:p>
     <w:p>
@@ -11854,6 +12382,22 @@
           <w:i w:val="0"/>
         </w:rPr>
         <w:t>About 8,000 seats for snow sports, school sports days and the Midwinter Aurora Festival.</w:t>
+      </w:r>
+    </w:p>
+    <w:p>
+      <w:r>
+        <w:rPr>
+          <w:b/>
+          <w:color w:val="4A7FC1"/>
+        </w:rPr>
+        <w:t xml:space="preserve">#109  </w:t>
+      </w:r>
+      <w:r>
+        <w:rPr>
+          <w:b/>
+          <w:i w:val="0"/>
+        </w:rPr>
+        <w:t>34</w:t>
       </w:r>
     </w:p>
     <w:p>
@@ -12032,6 +12576,22 @@
       </w:r>
     </w:p>
     <w:p>
+      <w:r>
+        <w:rPr>
+          <w:b/>
+          <w:color w:val="4A7FC1"/>
+        </w:rPr>
+        <w:t xml:space="preserve">#7  </w:t>
+      </w:r>
+      <w:r>
+        <w:rPr>
+          <w:b/>
+          <w:i w:val="0"/>
+        </w:rPr>
+        <w:t>35</w:t>
+      </w:r>
+    </w:p>
+    <w:p>
       <w:pPr>
         <w:pStyle w:val="Heading1"/>
       </w:pPr>
@@ -12570,6 +13130,22 @@
           <w:i w:val="0"/>
         </w:rPr>
         <w:t>We used AI tools to help us build the 3D model of the city and make the pictures, plans and diagrams in this magazine, and to check our spelling and fix logic errors in the text.</w:t>
+      </w:r>
+    </w:p>
+    <w:p>
+      <w:r>
+        <w:rPr>
+          <w:b/>
+          <w:color w:val="4A7FC1"/>
+        </w:rPr>
+        <w:t xml:space="preserve">#14  </w:t>
+      </w:r>
+      <w:r>
+        <w:rPr>
+          <w:b/>
+          <w:i w:val="0"/>
+        </w:rPr>
+        <w:t>36</w:t>
       </w:r>
     </w:p>
     <w:p>

</xml_diff>

<commit_message>
Trang 5: làm nổi bật 3 tính năng đặc sắc nhất ngay từ đầu tạp chí
- Thay 4 con số khô (45,000 / −45 °C / 35 m / 10 min) bằng 3 thẻ "Three things only
  Aurora Haven has": ảnh nhỏ, số thứ tự theo màu từng đột phá, một câu giới thiệu, số trang
- Trang 4: thêm câu trích về vòng tuần hoàn để lấp khoảng trống cuối trang

Co-Authored-By: Claude Opus 5.5 <noreply@anthropic.com>
Claude-Session: https://claude.ai/code/session_01Hmv4YstQBq6NRkZ7ExoLKC
</commit_message>
<xml_diff>
--- a/output/Aurora_Haven_Magazine_text.docx
+++ b/output/Aurora_Haven_Magazine_text.docx
@@ -2145,6 +2145,22 @@
       <w:r>
         <w:rPr>
           <w:b/>
+          <w:i/>
+        </w:rPr>
+        <w:t>“Three ideas work as one closed loop that keeps the city powered, fed and happy in one of the harshest places on Earth.”</w:t>
+      </w:r>
+    </w:p>
+    <w:p>
+      <w:r>
+        <w:rPr>
+          <w:b/>
+          <w:color w:val="4A7FC1"/>
+        </w:rPr>
+        <w:t xml:space="preserve">#7  </w:t>
+      </w:r>
+      <w:r>
+        <w:rPr>
+          <w:b/>
           <w:i w:val="0"/>
         </w:rPr>
         <w:t>4</w:t>
@@ -2184,156 +2200,211 @@
       </w:r>
       <w:r>
         <w:rPr>
+          <w:b/>
+          <w:i w:val="0"/>
+        </w:rPr>
+        <w:t>THREE THINGS ONLY AURORA HAVEN HAS</w:t>
+      </w:r>
+    </w:p>
+    <w:p>
+      <w:r>
+        <w:rPr>
+          <w:b/>
+          <w:color w:val="4A7FC1"/>
+        </w:rPr>
+        <w:t xml:space="preserve">#3  </w:t>
+      </w:r>
+      <w:r>
+        <w:rPr>
+          <w:b/>
+          <w:i w:val="0"/>
+        </w:rPr>
+        <w:t>1</w:t>
+      </w:r>
+    </w:p>
+    <w:p>
+      <w:r>
+        <w:rPr>
+          <w:b/>
+          <w:color w:val="4A7FC1"/>
+        </w:rPr>
+        <w:t xml:space="preserve">#4  </w:t>
+      </w:r>
+      <w:r>
+        <w:rPr>
+          <w:b/>
+          <w:i w:val="0"/>
+        </w:rPr>
+        <w:t>The City’s Own Sun</w:t>
+      </w:r>
+    </w:p>
+    <w:p>
+      <w:r>
+        <w:rPr>
+          <w:b/>
+          <w:color w:val="4A7FC1"/>
+        </w:rPr>
+        <w:t xml:space="preserve">#5  </w:t>
+      </w:r>
+      <w:r>
+        <w:rPr>
           <w:b w:val="0"/>
           <w:i w:val="0"/>
         </w:rPr>
-        <w:t>What makes Aurora Haven special is its three signature districts. A fusion power station acts as the city’s own sun, giving steady power and heat even through the polar night. A Snow-to-Food &amp; Water Plant turns snow and air into clean drinking water and food, so the city can feed itself without farmland.</w:t>
-      </w:r>
-    </w:p>
-    <w:p>
+        <w:t>A compact fusion reactor inside the city lights every home, heats every street and melts the snow we drink.</w:t>
+      </w:r>
+    </w:p>
+    <w:p>
+      <w:r>
+        <w:rPr>
+          <w:b/>
+          <w:color w:val="4A7FC1"/>
+        </w:rPr>
+        <w:t xml:space="preserve">#6  </w:t>
+      </w:r>
+      <w:r>
+        <w:rPr>
+          <w:b/>
+          <w:i w:val="0"/>
+        </w:rPr>
+        <w:t>PAGE 12</w:t>
+      </w:r>
+    </w:p>
+    <w:p>
+      <w:r>
+        <w:rPr>
+          <w:b/>
+          <w:color w:val="4A7FC1"/>
+        </w:rPr>
+        <w:t xml:space="preserve">#7  </w:t>
+      </w:r>
+      <w:r>
+        <w:rPr>
+          <w:b/>
+          <w:i w:val="0"/>
+        </w:rPr>
+        <w:t>2</w:t>
+      </w:r>
+    </w:p>
+    <w:p>
+      <w:r>
+        <w:rPr>
+          <w:b/>
+          <w:color w:val="4A7FC1"/>
+        </w:rPr>
+        <w:t xml:space="preserve">#8  </w:t>
+      </w:r>
+      <w:r>
+        <w:rPr>
+          <w:b/>
+          <w:i w:val="0"/>
+        </w:rPr>
+        <w:t>Bread and Water from Snow and Air</w:t>
+      </w:r>
+    </w:p>
+    <w:p>
+      <w:r>
+        <w:rPr>
+          <w:b/>
+          <w:color w:val="4A7FC1"/>
+        </w:rPr>
+        <w:t xml:space="preserve">#9  </w:t>
+      </w:r>
       <w:r>
         <w:rPr>
           <w:b w:val="0"/>
           <w:i w:val="0"/>
         </w:rPr>
-        <w:t>And inside Mount Aurora, a geothermal spa resort offers warmth, rest and a view of the northern lights. Together they form one closed loop that keeps the city powered, fed and happy in one of the harshest places on Earth.</w:t>
-      </w:r>
-    </w:p>
-    <w:p>
-      <w:r>
-        <w:rPr>
-          <w:b/>
-          <w:color w:val="4A7FC1"/>
-        </w:rPr>
-        <w:t xml:space="preserve">#3  </w:t>
-      </w:r>
-      <w:r>
-        <w:rPr>
-          <w:b/>
-          <w:i w:val="0"/>
-        </w:rPr>
-        <w:t>45,000</w:t>
-      </w:r>
-    </w:p>
-    <w:p>
-      <w:r>
-        <w:rPr>
-          <w:b/>
-          <w:color w:val="4A7FC1"/>
-        </w:rPr>
-        <w:t xml:space="preserve">#4  </w:t>
+        <w:t>A factory turns snow and air into drinking water, bread and protein, so a city with no farmland can feed itself.</w:t>
+      </w:r>
+    </w:p>
+    <w:p>
+      <w:r>
+        <w:rPr>
+          <w:b/>
+          <w:color w:val="4A7FC1"/>
+        </w:rPr>
+        <w:t xml:space="preserve">#10  </w:t>
+      </w:r>
+      <w:r>
+        <w:rPr>
+          <w:b/>
+          <w:i w:val="0"/>
+        </w:rPr>
+        <w:t>PAGE 15</w:t>
+      </w:r>
+    </w:p>
+    <w:p>
+      <w:r>
+        <w:rPr>
+          <w:b/>
+          <w:color w:val="4A7FC1"/>
+        </w:rPr>
+        <w:t xml:space="preserve">#11  </w:t>
+      </w:r>
+      <w:r>
+        <w:rPr>
+          <w:b/>
+          <w:i w:val="0"/>
+        </w:rPr>
+        <w:t>3</w:t>
+      </w:r>
+    </w:p>
+    <w:p>
+      <w:r>
+        <w:rPr>
+          <w:b/>
+          <w:color w:val="4A7FC1"/>
+        </w:rPr>
+        <w:t xml:space="preserve">#12  </w:t>
+      </w:r>
+      <w:r>
+        <w:rPr>
+          <w:b/>
+          <w:i w:val="0"/>
+        </w:rPr>
+        <w:t>A Snow Mountain You Can Walk Inside</w:t>
+      </w:r>
+    </w:p>
+    <w:p>
+      <w:r>
+        <w:rPr>
+          <w:b/>
+          <w:color w:val="4A7FC1"/>
+        </w:rPr>
+        <w:t xml:space="preserve">#13  </w:t>
       </w:r>
       <w:r>
         <w:rPr>
           <w:b w:val="0"/>
           <w:i w:val="0"/>
         </w:rPr>
-        <w:t>residents</w:t>
-      </w:r>
-    </w:p>
-    <w:p>
-      <w:r>
-        <w:rPr>
-          <w:b/>
-          <w:color w:val="4A7FC1"/>
-        </w:rPr>
-        <w:t xml:space="preserve">#5  </w:t>
-      </w:r>
-      <w:r>
-        <w:rPr>
-          <w:b/>
-          <w:i w:val="0"/>
-        </w:rPr>
-        <w:t>−45 °C</w:t>
-      </w:r>
-    </w:p>
-    <w:p>
-      <w:r>
-        <w:rPr>
-          <w:b/>
-          <w:color w:val="4A7FC1"/>
-        </w:rPr>
-        <w:t xml:space="preserve">#6  </w:t>
-      </w:r>
-      <w:r>
-        <w:rPr>
-          <w:b w:val="0"/>
-          <w:i w:val="0"/>
-        </w:rPr>
-        <w:t>winter lows</w:t>
-      </w:r>
-    </w:p>
-    <w:p>
-      <w:r>
-        <w:rPr>
-          <w:b/>
-          <w:color w:val="4A7FC1"/>
-        </w:rPr>
-        <w:t xml:space="preserve">#7  </w:t>
-      </w:r>
-      <w:r>
-        <w:rPr>
-          <w:b/>
-          <w:i w:val="0"/>
-        </w:rPr>
-        <w:t>35 m</w:t>
-      </w:r>
-    </w:p>
-    <w:p>
-      <w:r>
-        <w:rPr>
-          <w:b/>
-          <w:color w:val="4A7FC1"/>
-        </w:rPr>
-        <w:t xml:space="preserve">#8  </w:t>
-      </w:r>
-      <w:r>
-        <w:rPr>
-          <w:b w:val="0"/>
-          <w:i w:val="0"/>
-        </w:rPr>
-        <w:t>Mount Aurora, the snow peak</w:t>
-      </w:r>
-    </w:p>
-    <w:p>
-      <w:r>
-        <w:rPr>
-          <w:b/>
-          <w:color w:val="4A7FC1"/>
-        </w:rPr>
-        <w:t xml:space="preserve">#9  </w:t>
-      </w:r>
-      <w:r>
-        <w:rPr>
-          <w:b/>
-          <w:i w:val="0"/>
-        </w:rPr>
-        <w:t>10 min</w:t>
-      </w:r>
-    </w:p>
-    <w:p>
-      <w:r>
-        <w:rPr>
-          <w:b/>
-          <w:color w:val="4A7FC1"/>
-        </w:rPr>
-        <w:t xml:space="preserve">#10  </w:t>
-      </w:r>
-      <w:r>
-        <w:rPr>
-          <w:b w:val="0"/>
-          <w:i w:val="0"/>
-        </w:rPr>
-        <w:t>walk to daily needs</w:t>
-      </w:r>
-    </w:p>
-    <w:p>
-      <w:r>
-        <w:rPr>
-          <w:b/>
-          <w:color w:val="4A7FC1"/>
-        </w:rPr>
-        <w:t xml:space="preserve">#11  </w:t>
+        <w:t>Mineral lakes, mud pools and saunas stay at 28 °C inside a 35-metre snow peak, all winter long.</w:t>
+      </w:r>
+    </w:p>
+    <w:p>
+      <w:r>
+        <w:rPr>
+          <w:b/>
+          <w:color w:val="4A7FC1"/>
+        </w:rPr>
+        <w:t xml:space="preserve">#14  </w:t>
+      </w:r>
+      <w:r>
+        <w:rPr>
+          <w:b/>
+          <w:i w:val="0"/>
+        </w:rPr>
+        <w:t>PAGE 17</w:t>
+      </w:r>
+    </w:p>
+    <w:p>
+      <w:r>
+        <w:rPr>
+          <w:b/>
+          <w:color w:val="4A7FC1"/>
+        </w:rPr>
+        <w:t xml:space="preserve">#15  </w:t>
       </w:r>
       <w:r>
         <w:rPr>

</xml_diff>

<commit_message>
Thiết kế lại theo kiểu tạp chí chuyên nghiệp: mục lục theo phần, chân trang có tên phần, "In brief" cho 3 đột phá
- Mục lục chia theo phần (Welcome, The city, The breakthroughs, Invest, Systems & life,
  The guide); số trang của 3 đột phá theo màu từng đột phá
- Chân trang ghi tên phần đang đọc (ví dụ THE BREAKTHROUGHS), thêm vào từng trang cùng số trang
- Trang mở đầu mỗi đột phá: khung "In brief" 2 × 2 (The problem · The idea · What's new ·
  The impact) thay cho đoạn văn dài
- Viết gọn trang hệ sinh thái và giao thông; bỏ hàng con số trùng lặp ở trang giao thông
- Trang nguồn: ghi rõ ảnh bìa được làm thật từ ảnh render bằng công cụ AI (Nano Banana Pro)
- Gỡ thư mục ảnh tạm dùng để làm ảnh AI

Co-Authored-By: Claude Opus 5.5 <noreply@anthropic.com>
Claude-Session: https://claude.ai/code/session_01Hmv4YstQBq6NRkZ7ExoLKC
</commit_message>
<xml_diff>
--- a/output/Aurora_Haven_Magazine_text.docx
+++ b/output/Aurora_Haven_Magazine_text.docx
@@ -39,7 +39,7 @@
           <w:b/>
           <w:i w:val="0"/>
         </w:rPr>
-        <w:t>ISSUE 01   ·   POLAR / ICE CITY   ·   A CITY BUILT IN 3D</w:t>
+        <w:t>THE IDEAL CITY OF THE FUTURE</w:t>
       </w:r>
     </w:p>
     <w:p>
@@ -55,6 +55,22 @@
           <w:b/>
           <w:i w:val="0"/>
         </w:rPr>
+        <w:t>ISSUE 01  ·  2026</w:t>
+      </w:r>
+    </w:p>
+    <w:p>
+      <w:r>
+        <w:rPr>
+          <w:b/>
+          <w:color w:val="4A7FC1"/>
+        </w:rPr>
+        <w:t xml:space="preserve">#3  </w:t>
+      </w:r>
+      <w:r>
+        <w:rPr>
+          <w:b/>
+          <w:i w:val="0"/>
+        </w:rPr>
         <w:t>AURORA HAVEN</w:t>
       </w:r>
     </w:p>
@@ -64,159 +80,217 @@
           <w:b/>
           <w:color w:val="4A7FC1"/>
         </w:rPr>
-        <w:t xml:space="preserve">#3  </w:t>
-      </w:r>
+        <w:t xml:space="preserve">#4  </w:t>
+      </w:r>
+      <w:r>
+        <w:rPr>
+          <w:b/>
+          <w:i w:val="0"/>
+        </w:rPr>
+        <w:t>A POLAR CITY THAT THRIVES</w:t>
+      </w:r>
+    </w:p>
+    <w:p>
+      <w:r>
+        <w:rPr>
+          <w:b/>
+          <w:color w:val="4A7FC1"/>
+        </w:rPr>
+        <w:t xml:space="preserve">#5  </w:t>
+      </w:r>
+      <w:r>
+        <w:rPr>
+          <w:b/>
+          <w:i w:val="0"/>
+        </w:rPr>
+        <w:t>1</w:t>
+      </w:r>
+    </w:p>
+    <w:p>
+      <w:r>
+        <w:rPr>
+          <w:b/>
+          <w:color w:val="4A7FC1"/>
+        </w:rPr>
+        <w:t xml:space="preserve">#6  </w:t>
+      </w:r>
+      <w:r>
+        <w:rPr>
+          <w:b/>
+          <w:i w:val="0"/>
+        </w:rPr>
+        <w:t>FUSION CORE</w:t>
+      </w:r>
+    </w:p>
+    <w:p>
       <w:r>
         <w:rPr>
           <w:b w:val="0"/>
           <w:i/>
         </w:rPr>
-        <w:t>A polar city that thrives</w:t>
-      </w:r>
-    </w:p>
-    <w:p>
-      <w:r>
-        <w:rPr>
-          <w:b/>
-          <w:color w:val="4A7FC1"/>
-        </w:rPr>
-        <w:t xml:space="preserve">#4  </w:t>
-      </w:r>
-      <w:r>
-        <w:rPr>
-          <w:b/>
-          <w:i w:val="0"/>
-        </w:rPr>
-        <w:t>The city's own sun</w:t>
+        <w:t>The city’s own sun  ·  P. 12</w:t>
+      </w:r>
+    </w:p>
+    <w:p>
+      <w:r>
+        <w:rPr>
+          <w:b/>
+          <w:color w:val="4A7FC1"/>
+        </w:rPr>
+        <w:t xml:space="preserve">#7  </w:t>
+      </w:r>
+      <w:r>
+        <w:rPr>
+          <w:b/>
+          <w:i w:val="0"/>
+        </w:rPr>
+        <w:t>2</w:t>
+      </w:r>
+    </w:p>
+    <w:p>
+      <w:r>
+        <w:rPr>
+          <w:b/>
+          <w:color w:val="4A7FC1"/>
+        </w:rPr>
+        <w:t xml:space="preserve">#8  </w:t>
+      </w:r>
+      <w:r>
+        <w:rPr>
+          <w:b/>
+          <w:i w:val="0"/>
+        </w:rPr>
+        <w:t>SNOW-TO-FOOD PLANT</w:t>
       </w:r>
     </w:p>
     <w:p>
       <w:r>
         <w:rPr>
           <w:b w:val="0"/>
-          <w:i w:val="0"/>
-        </w:rPr>
-        <w:t>A compact fusion station keeps 45,000 people warm through the polar night</w:t>
-      </w:r>
-    </w:p>
-    <w:p>
-      <w:r>
-        <w:rPr>
-          <w:b/>
-          <w:i w:val="0"/>
-        </w:rPr>
-        <w:t>PAGE 12</w:t>
-      </w:r>
-    </w:p>
-    <w:p>
-      <w:r>
-        <w:rPr>
-          <w:b/>
-          <w:color w:val="4A7FC1"/>
-        </w:rPr>
-        <w:t xml:space="preserve">#5  </w:t>
-      </w:r>
-      <w:r>
-        <w:rPr>
-          <w:b/>
-          <w:i w:val="0"/>
-        </w:rPr>
-        <w:t>A snow mountain</w:t>
-      </w:r>
-    </w:p>
-    <w:p>
-      <w:r>
-        <w:rPr>
-          <w:b/>
-          <w:i w:val="0"/>
-        </w:rPr>
-        <w:t>you can walk inside</w:t>
+          <w:i/>
+        </w:rPr>
+        <w:t>Bread and water from snow  ·  P. 15</w:t>
+      </w:r>
+    </w:p>
+    <w:p>
+      <w:r>
+        <w:rPr>
+          <w:b/>
+          <w:color w:val="4A7FC1"/>
+        </w:rPr>
+        <w:t xml:space="preserve">#9  </w:t>
+      </w:r>
+      <w:r>
+        <w:rPr>
+          <w:b/>
+          <w:i w:val="0"/>
+        </w:rPr>
+        <w:t>3</w:t>
+      </w:r>
+    </w:p>
+    <w:p>
+      <w:r>
+        <w:rPr>
+          <w:b/>
+          <w:color w:val="4A7FC1"/>
+        </w:rPr>
+        <w:t xml:space="preserve">#10  </w:t>
+      </w:r>
+      <w:r>
+        <w:rPr>
+          <w:b/>
+          <w:i w:val="0"/>
+        </w:rPr>
+        <w:t>MOUNT AURORA</w:t>
       </w:r>
     </w:p>
     <w:p>
       <w:r>
         <w:rPr>
           <w:b w:val="0"/>
-          <w:i w:val="0"/>
-        </w:rPr>
-        <w:t>A whole leisure world inside a 35-metre snow peak</w:t>
-      </w:r>
-    </w:p>
-    <w:p>
-      <w:r>
-        <w:rPr>
-          <w:b/>
-          <w:i w:val="0"/>
-        </w:rPr>
-        <w:t>PAGE 17</w:t>
-      </w:r>
-    </w:p>
-    <w:p>
-      <w:r>
-        <w:rPr>
-          <w:b/>
-          <w:color w:val="4A7FC1"/>
-        </w:rPr>
-        <w:t xml:space="preserve">#6  </w:t>
-      </w:r>
-      <w:r>
-        <w:rPr>
-          <w:b/>
-          <w:i w:val="0"/>
-        </w:rPr>
-        <w:t>Bread and water from snow and air</w:t>
-      </w:r>
-    </w:p>
-    <w:p>
+          <w:i/>
+        </w:rPr>
+        <w:t>A snow mountain you can walk inside  ·  P. 17</w:t>
+      </w:r>
+    </w:p>
+    <w:p>
+      <w:r>
+        <w:rPr>
+          <w:b/>
+          <w:color w:val="4A7FC1"/>
+        </w:rPr>
+        <w:t xml:space="preserve">#11  </w:t>
+      </w:r>
+      <w:r>
+        <w:rPr>
+          <w:b/>
+          <w:i w:val="0"/>
+        </w:rPr>
+        <w:t>Its own sun. Its own food.</w:t>
+      </w:r>
+    </w:p>
+    <w:p>
+      <w:r>
+        <w:rPr>
+          <w:b/>
+          <w:i w:val="0"/>
+        </w:rPr>
+        <w:t>A mountain you can walk inside.</w:t>
+      </w:r>
+    </w:p>
+    <w:p>
+      <w:r>
+        <w:rPr>
+          <w:b/>
+          <w:color w:val="4A7FC1"/>
+        </w:rPr>
+        <w:t xml:space="preserve">#12  </w:t>
+      </w:r>
+      <w:r>
+        <w:rPr>
+          <w:b/>
+          <w:i w:val="0"/>
+        </w:rPr>
+        <w:t xml:space="preserve">INSIDE   </w:t>
+      </w:r>
       <w:r>
         <w:rPr>
           <w:b w:val="0"/>
           <w:i w:val="0"/>
         </w:rPr>
-        <w:t>Inside the plant that feeds a city with no farmland</w:t>
-      </w:r>
-    </w:p>
-    <w:p>
-      <w:r>
-        <w:rPr>
-          <w:b/>
-          <w:i w:val="0"/>
-        </w:rPr>
-        <w:t>PAGE 15</w:t>
-      </w:r>
-    </w:p>
-    <w:p>
-      <w:r>
-        <w:rPr>
-          <w:b/>
-          <w:color w:val="4A7FC1"/>
-        </w:rPr>
-        <w:t xml:space="preserve">#7  </w:t>
-      </w:r>
-      <w:r>
-        <w:rPr>
-          <w:b/>
-          <w:i w:val="0"/>
-        </w:rPr>
-        <w:t>−45 °C. 120 km/h. No sun.</w:t>
-      </w:r>
-    </w:p>
-    <w:p>
-      <w:r>
-        <w:rPr>
-          <w:b w:val="0"/>
-          <w:i w:val="0"/>
-        </w:rPr>
-        <w:t>The polar challenge, and the five ideas that answer it</w:t>
-      </w:r>
-    </w:p>
-    <w:p>
-      <w:r>
-        <w:rPr>
-          <w:b/>
-          <w:i w:val="0"/>
-        </w:rPr>
-        <w:t>PAGE 6</w:t>
+        <w:t>−45 °C and no sun: the polar challenge  p. 6   ·   Explore our 3D city  p. 21   ·   Invest in Aurora Haven  p. 32</w:t>
+      </w:r>
+    </w:p>
+    <w:p>
+      <w:r>
+        <w:rPr>
+          <w:b/>
+          <w:color w:val="4A7FC1"/>
+        </w:rPr>
+        <w:t xml:space="preserve">#13  </w:t>
+      </w:r>
+      <w:r>
+        <w:rPr>
+          <w:b/>
+          <w:i w:val="0"/>
+        </w:rPr>
+        <w:t>POLAR CITY  ·  CLASS 11A4  ·  LÊ QUÝ ĐÔN HIGH SCHOOL</w:t>
+      </w:r>
+    </w:p>
+    <w:p>
+      <w:r>
+        <w:rPr>
+          <w:b/>
+          <w:color w:val="4A7FC1"/>
+        </w:rPr>
+        <w:t xml:space="preserve">#14  </w:t>
+      </w:r>
+      <w:r>
+        <w:rPr>
+          <w:b/>
+          <w:i w:val="0"/>
+        </w:rPr>
+        <w:t>A CONCEPT MAGAZINE</w:t>
       </w:r>
     </w:p>
     <w:p>
@@ -285,499 +359,611 @@
       </w:r>
       <w:r>
         <w:rPr>
+          <w:b/>
+          <w:i w:val="0"/>
+        </w:rPr>
+        <w:t>WELCOME</w:t>
+      </w:r>
+    </w:p>
+    <w:p>
+      <w:r>
+        <w:rPr>
+          <w:b/>
+          <w:color w:val="4A7FC1"/>
+        </w:rPr>
+        <w:t xml:space="preserve">#4  </w:t>
+      </w:r>
+      <w:r>
+        <w:rPr>
+          <w:b/>
+          <w:i w:val="0"/>
+        </w:rPr>
+        <w:t>2</w:t>
+      </w:r>
+    </w:p>
+    <w:p>
+      <w:r>
+        <w:rPr>
+          <w:b/>
+          <w:color w:val="4A7FC1"/>
+        </w:rPr>
+        <w:t xml:space="preserve">#5  </w:t>
+      </w:r>
+      <w:r>
+        <w:rPr>
+          <w:b/>
+          <w:i w:val="0"/>
+        </w:rPr>
+        <w:t>Letter from the Founders</w:t>
+      </w:r>
+    </w:p>
+    <w:p>
+      <w:r>
+        <w:rPr>
+          <w:b/>
+          <w:color w:val="4A7FC1"/>
+        </w:rPr>
+        <w:t xml:space="preserve">#6  </w:t>
+      </w:r>
+      <w:r>
+        <w:rPr>
           <w:b w:val="0"/>
-          <w:i/>
-        </w:rPr>
-        <w:t>Shops and cafés on a downtown street at dusk. The streets are warmed from below, so they stay clear of ice without salt.</w:t>
-      </w:r>
-    </w:p>
-    <w:p>
-      <w:r>
-        <w:rPr>
-          <w:b/>
-          <w:color w:val="4A7FC1"/>
-        </w:rPr>
-        <w:t xml:space="preserve">#4  </w:t>
-      </w:r>
-      <w:r>
-        <w:rPr>
-          <w:b/>
-          <w:i w:val="0"/>
-        </w:rPr>
-        <w:t>2</w:t>
-      </w:r>
-    </w:p>
-    <w:p>
-      <w:r>
-        <w:rPr>
-          <w:b/>
-          <w:color w:val="4A7FC1"/>
-        </w:rPr>
-        <w:t xml:space="preserve">#5  </w:t>
-      </w:r>
-      <w:r>
-        <w:rPr>
-          <w:b/>
-          <w:i w:val="0"/>
-        </w:rPr>
-        <w:t>Letter from the Founders</w:t>
-      </w:r>
-    </w:p>
-    <w:p>
-      <w:r>
-        <w:rPr>
-          <w:b/>
-          <w:color w:val="4A7FC1"/>
-        </w:rPr>
-        <w:t xml:space="preserve">#6  </w:t>
+          <w:i w:val="0"/>
+        </w:rPr>
+        <w:t>Who we are and why we built Aurora Haven</w:t>
+      </w:r>
+    </w:p>
+    <w:p>
+      <w:r>
+        <w:rPr>
+          <w:b/>
+          <w:color w:val="4A7FC1"/>
+        </w:rPr>
+        <w:t xml:space="preserve">#7  </w:t>
+      </w:r>
+      <w:r>
+        <w:rPr>
+          <w:b/>
+          <w:i w:val="0"/>
+        </w:rPr>
+        <w:t>4</w:t>
+      </w:r>
+    </w:p>
+    <w:p>
+      <w:r>
+        <w:rPr>
+          <w:b/>
+          <w:color w:val="4A7FC1"/>
+        </w:rPr>
+        <w:t xml:space="preserve">#8  </w:t>
+      </w:r>
+      <w:r>
+        <w:rPr>
+          <w:b/>
+          <w:i w:val="0"/>
+        </w:rPr>
+        <w:t>Welcome to Aurora Haven</w:t>
+      </w:r>
+    </w:p>
+    <w:p>
+      <w:r>
+        <w:rPr>
+          <w:b/>
+          <w:color w:val="4A7FC1"/>
+        </w:rPr>
+        <w:t xml:space="preserve">#9  </w:t>
       </w:r>
       <w:r>
         <w:rPr>
           <w:b w:val="0"/>
           <w:i w:val="0"/>
         </w:rPr>
-        <w:t>Who we are, our team and why we built Aurora Haven</w:t>
-      </w:r>
-    </w:p>
-    <w:p>
-      <w:r>
-        <w:rPr>
-          <w:b/>
-          <w:color w:val="4A7FC1"/>
-        </w:rPr>
-        <w:t xml:space="preserve">#7  </w:t>
-      </w:r>
-      <w:r>
-        <w:rPr>
-          <w:b/>
-          <w:i w:val="0"/>
-        </w:rPr>
-        <w:t>4</w:t>
-      </w:r>
-    </w:p>
-    <w:p>
-      <w:r>
-        <w:rPr>
-          <w:b/>
-          <w:color w:val="4A7FC1"/>
-        </w:rPr>
-        <w:t xml:space="preserve">#8  </w:t>
-      </w:r>
-      <w:r>
-        <w:rPr>
-          <w:b/>
-          <w:i w:val="0"/>
-        </w:rPr>
-        <w:t>Welcome to Aurora Haven</w:t>
-      </w:r>
-    </w:p>
-    <w:p>
-      <w:r>
-        <w:rPr>
-          <w:b/>
-          <w:color w:val="4A7FC1"/>
-        </w:rPr>
-        <w:t xml:space="preserve">#9  </w:t>
+        <w:t>A compact city of 45,000 under a snow peak</w:t>
+      </w:r>
+    </w:p>
+    <w:p>
+      <w:r>
+        <w:rPr>
+          <w:b/>
+          <w:color w:val="4A7FC1"/>
+        </w:rPr>
+        <w:t xml:space="preserve">#10  </w:t>
+      </w:r>
+      <w:r>
+        <w:rPr>
+          <w:b/>
+          <w:i w:val="0"/>
+        </w:rPr>
+        <w:t>6</w:t>
+      </w:r>
+    </w:p>
+    <w:p>
+      <w:r>
+        <w:rPr>
+          <w:b/>
+          <w:color w:val="4A7FC1"/>
+        </w:rPr>
+        <w:t xml:space="preserve">#11  </w:t>
+      </w:r>
+      <w:r>
+        <w:rPr>
+          <w:b/>
+          <w:i w:val="0"/>
+        </w:rPr>
+        <w:t>The Polar Challenge</w:t>
+      </w:r>
+    </w:p>
+    <w:p>
+      <w:r>
+        <w:rPr>
+          <w:b/>
+          <w:color w:val="4A7FC1"/>
+        </w:rPr>
+        <w:t xml:space="preserve">#12  </w:t>
       </w:r>
       <w:r>
         <w:rPr>
           <w:b w:val="0"/>
           <w:i w:val="0"/>
         </w:rPr>
-        <w:t>A compact city of 45,000 under a snow peak</w:t>
-      </w:r>
-    </w:p>
-    <w:p>
-      <w:r>
-        <w:rPr>
-          <w:b/>
-          <w:color w:val="4A7FC1"/>
-        </w:rPr>
-        <w:t xml:space="preserve">#10  </w:t>
-      </w:r>
-      <w:r>
-        <w:rPr>
-          <w:b/>
-          <w:i w:val="0"/>
-        </w:rPr>
-        <w:t>6</w:t>
-      </w:r>
-    </w:p>
-    <w:p>
-      <w:r>
-        <w:rPr>
-          <w:b/>
-          <w:color w:val="4A7FC1"/>
-        </w:rPr>
-        <w:t xml:space="preserve">#11  </w:t>
-      </w:r>
-      <w:r>
-        <w:rPr>
-          <w:b/>
-          <w:i w:val="0"/>
-        </w:rPr>
-        <w:t>The Polar Challenge</w:t>
-      </w:r>
-    </w:p>
-    <w:p>
-      <w:r>
-        <w:rPr>
-          <w:b/>
-          <w:color w:val="4A7FC1"/>
-        </w:rPr>
-        <w:t xml:space="preserve">#12  </w:t>
+        <w:t>Cold, darkness, wind and thawing ground</w:t>
+      </w:r>
+    </w:p>
+    <w:p>
+      <w:r>
+        <w:rPr>
+          <w:b/>
+          <w:color w:val="4A7FC1"/>
+        </w:rPr>
+        <w:t xml:space="preserve">#13  </w:t>
+      </w:r>
+      <w:r>
+        <w:rPr>
+          <w:b/>
+          <w:i w:val="0"/>
+        </w:rPr>
+        <w:t>7</w:t>
+      </w:r>
+    </w:p>
+    <w:p>
+      <w:r>
+        <w:rPr>
+          <w:b/>
+          <w:color w:val="4A7FC1"/>
+        </w:rPr>
+        <w:t xml:space="preserve">#14  </w:t>
+      </w:r>
+      <w:r>
+        <w:rPr>
+          <w:b/>
+          <w:i w:val="0"/>
+        </w:rPr>
+        <w:t>Our Vision &amp; Mission</w:t>
+      </w:r>
+    </w:p>
+    <w:p>
+      <w:r>
+        <w:rPr>
+          <w:b/>
+          <w:color w:val="4A7FC1"/>
+        </w:rPr>
+        <w:t xml:space="preserve">#15  </w:t>
       </w:r>
       <w:r>
         <w:rPr>
           <w:b w:val="0"/>
           <w:i w:val="0"/>
         </w:rPr>
-        <w:t>Cold, darkness, wind and thawing ground</w:t>
-      </w:r>
-    </w:p>
-    <w:p>
-      <w:r>
-        <w:rPr>
-          <w:b/>
-          <w:color w:val="4A7FC1"/>
-        </w:rPr>
-        <w:t xml:space="preserve">#13  </w:t>
-      </w:r>
-      <w:r>
-        <w:rPr>
-          <w:b/>
-          <w:i w:val="0"/>
-        </w:rPr>
-        <w:t>7</w:t>
-      </w:r>
-    </w:p>
-    <w:p>
-      <w:r>
-        <w:rPr>
-          <w:b/>
-          <w:color w:val="4A7FC1"/>
-        </w:rPr>
-        <w:t xml:space="preserve">#14  </w:t>
-      </w:r>
-      <w:r>
-        <w:rPr>
-          <w:b/>
-          <w:i w:val="0"/>
-        </w:rPr>
-        <w:t>Our Vision &amp; Mission</w:t>
-      </w:r>
-    </w:p>
-    <w:p>
-      <w:r>
-        <w:rPr>
-          <w:b/>
-          <w:color w:val="4A7FC1"/>
-        </w:rPr>
-        <w:t xml:space="preserve">#15  </w:t>
+        <w:t>Who is affected, and the five ideas that answer it</w:t>
+      </w:r>
+    </w:p>
+    <w:p>
+      <w:r>
+        <w:rPr>
+          <w:b/>
+          <w:color w:val="4A7FC1"/>
+        </w:rPr>
+        <w:t xml:space="preserve">#16  </w:t>
+      </w:r>
+      <w:r>
+        <w:rPr>
+          <w:b/>
+          <w:i w:val="0"/>
+        </w:rPr>
+        <w:t>THE CITY</w:t>
+      </w:r>
+    </w:p>
+    <w:p>
+      <w:r>
+        <w:rPr>
+          <w:b/>
+          <w:color w:val="4A7FC1"/>
+        </w:rPr>
+        <w:t xml:space="preserve">#17  </w:t>
+      </w:r>
+      <w:r>
+        <w:rPr>
+          <w:b/>
+          <w:i w:val="0"/>
+        </w:rPr>
+        <w:t>8</w:t>
+      </w:r>
+    </w:p>
+    <w:p>
+      <w:r>
+        <w:rPr>
+          <w:b/>
+          <w:color w:val="4A7FC1"/>
+        </w:rPr>
+        <w:t xml:space="preserve">#18  </w:t>
+      </w:r>
+      <w:r>
+        <w:rPr>
+          <w:b/>
+          <w:i w:val="0"/>
+        </w:rPr>
+        <w:t>Nine Blocks, One Short Walk</w:t>
+      </w:r>
+    </w:p>
+    <w:p>
+      <w:r>
+        <w:rPr>
+          <w:b/>
+          <w:color w:val="4A7FC1"/>
+        </w:rPr>
+        <w:t xml:space="preserve">#19  </w:t>
       </w:r>
       <w:r>
         <w:rPr>
           <w:b w:val="0"/>
           <w:i w:val="0"/>
         </w:rPr>
-        <w:t>Who is affected, and the five ideas that answer it</w:t>
-      </w:r>
-    </w:p>
-    <w:p>
-      <w:r>
-        <w:rPr>
-          <w:b/>
-          <w:color w:val="4A7FC1"/>
-        </w:rPr>
-        <w:t xml:space="preserve">#16  </w:t>
-      </w:r>
-      <w:r>
-        <w:rPr>
-          <w:b/>
-          <w:i w:val="0"/>
-        </w:rPr>
-        <w:t>8</w:t>
-      </w:r>
-    </w:p>
-    <w:p>
-      <w:r>
-        <w:rPr>
-          <w:b/>
-          <w:color w:val="4A7FC1"/>
-        </w:rPr>
-        <w:t xml:space="preserve">#17  </w:t>
-      </w:r>
-      <w:r>
-        <w:rPr>
-          <w:b/>
-          <w:i w:val="0"/>
-        </w:rPr>
-        <w:t>Nine Blocks, One Short Walk</w:t>
-      </w:r>
-    </w:p>
-    <w:p>
-      <w:r>
-        <w:rPr>
-          <w:b/>
-          <w:color w:val="4A7FC1"/>
-        </w:rPr>
-        <w:t xml:space="preserve">#18  </w:t>
+        <w:t>Downtown around the Aurora Roundabout</w:t>
+      </w:r>
+    </w:p>
+    <w:p>
+      <w:r>
+        <w:rPr>
+          <w:b/>
+          <w:color w:val="4A7FC1"/>
+        </w:rPr>
+        <w:t xml:space="preserve">#20  </w:t>
+      </w:r>
+      <w:r>
+        <w:rPr>
+          <w:b/>
+          <w:i w:val="0"/>
+        </w:rPr>
+        <w:t>10</w:t>
+      </w:r>
+    </w:p>
+    <w:p>
+      <w:r>
+        <w:rPr>
+          <w:b/>
+          <w:color w:val="4A7FC1"/>
+        </w:rPr>
+        <w:t xml:space="preserve">#21  </w:t>
+      </w:r>
+      <w:r>
+        <w:rPr>
+          <w:b/>
+          <w:i w:val="0"/>
+        </w:rPr>
+        <w:t>The Whole City Plan</w:t>
+      </w:r>
+    </w:p>
+    <w:p>
+      <w:r>
+        <w:rPr>
+          <w:b/>
+          <w:color w:val="4A7FC1"/>
+        </w:rPr>
+        <w:t xml:space="preserve">#22  </w:t>
       </w:r>
       <w:r>
         <w:rPr>
           <w:b w:val="0"/>
           <w:i w:val="0"/>
         </w:rPr>
-        <w:t>Downtown around the Aurora Roundabout</w:t>
-      </w:r>
-    </w:p>
-    <w:p>
-      <w:r>
-        <w:rPr>
-          <w:b/>
-          <w:color w:val="4A7FC1"/>
-        </w:rPr>
-        <w:t xml:space="preserve">#19  </w:t>
-      </w:r>
-      <w:r>
-        <w:rPr>
-          <w:b/>
-          <w:i w:val="0"/>
-        </w:rPr>
-        <w:t>10</w:t>
-      </w:r>
-    </w:p>
-    <w:p>
-      <w:r>
-        <w:rPr>
-          <w:b/>
-          <w:color w:val="4A7FC1"/>
-        </w:rPr>
-        <w:t xml:space="preserve">#20  </w:t>
-      </w:r>
-      <w:r>
-        <w:rPr>
-          <w:b/>
-          <w:i w:val="0"/>
-        </w:rPr>
-        <w:t>The Whole City Plan</w:t>
-      </w:r>
-    </w:p>
-    <w:p>
-      <w:r>
-        <w:rPr>
-          <w:b/>
-          <w:color w:val="4A7FC1"/>
-        </w:rPr>
-        <w:t xml:space="preserve">#21  </w:t>
+        <w:t>From the wind farm to Mount Aurora</w:t>
+      </w:r>
+    </w:p>
+    <w:p>
+      <w:r>
+        <w:rPr>
+          <w:b/>
+          <w:color w:val="4A7FC1"/>
+        </w:rPr>
+        <w:t xml:space="preserve">#23  </w:t>
+      </w:r>
+      <w:r>
+        <w:rPr>
+          <w:b/>
+          <w:i w:val="0"/>
+        </w:rPr>
+        <w:t>THE BREAKTHROUGHS</w:t>
+      </w:r>
+    </w:p>
+    <w:p>
+      <w:r>
+        <w:rPr>
+          <w:b/>
+          <w:color w:val="4A7FC1"/>
+        </w:rPr>
+        <w:t xml:space="preserve">#24  </w:t>
+      </w:r>
+      <w:r>
+        <w:rPr>
+          <w:b/>
+          <w:i w:val="0"/>
+        </w:rPr>
+        <w:t>12</w:t>
+      </w:r>
+    </w:p>
+    <w:p>
+      <w:r>
+        <w:rPr>
+          <w:b/>
+          <w:color w:val="4A7FC1"/>
+        </w:rPr>
+        <w:t xml:space="preserve">#25  </w:t>
+      </w:r>
+      <w:r>
+        <w:rPr>
+          <w:b/>
+          <w:i w:val="0"/>
+        </w:rPr>
+        <w:t>The City's Own Sun</w:t>
+      </w:r>
+    </w:p>
+    <w:p>
+      <w:r>
+        <w:rPr>
+          <w:b/>
+          <w:color w:val="4A7FC1"/>
+        </w:rPr>
+        <w:t xml:space="preserve">#26  </w:t>
       </w:r>
       <w:r>
         <w:rPr>
           <w:b w:val="0"/>
           <w:i w:val="0"/>
         </w:rPr>
-        <w:t>From the wind farm to Mount Aurora</w:t>
-      </w:r>
-    </w:p>
-    <w:p>
-      <w:r>
-        <w:rPr>
-          <w:b/>
-          <w:color w:val="4A7FC1"/>
-        </w:rPr>
-        <w:t xml:space="preserve">#22  </w:t>
-      </w:r>
-      <w:r>
-        <w:rPr>
-          <w:b/>
-          <w:i w:val="0"/>
-        </w:rPr>
-        <w:t>12</w:t>
-      </w:r>
-    </w:p>
-    <w:p>
-      <w:r>
-        <w:rPr>
-          <w:b/>
-          <w:color w:val="4A7FC1"/>
-        </w:rPr>
-        <w:t xml:space="preserve">#23  </w:t>
-      </w:r>
-      <w:r>
-        <w:rPr>
-          <w:b/>
-          <w:i w:val="0"/>
-        </w:rPr>
-        <w:t>The City's Own Sun</w:t>
-      </w:r>
-    </w:p>
-    <w:p>
-      <w:r>
-        <w:rPr>
-          <w:b/>
-          <w:color w:val="4A7FC1"/>
-        </w:rPr>
-        <w:t xml:space="preserve">#24  </w:t>
+        <w:t>Breakthrough 1 · Fusion Power Station</w:t>
+      </w:r>
+    </w:p>
+    <w:p>
+      <w:r>
+        <w:rPr>
+          <w:b/>
+          <w:color w:val="4A7FC1"/>
+        </w:rPr>
+        <w:t xml:space="preserve">#27  </w:t>
+      </w:r>
+      <w:r>
+        <w:rPr>
+          <w:b/>
+          <w:i w:val="0"/>
+        </w:rPr>
+        <w:t>15</w:t>
+      </w:r>
+    </w:p>
+    <w:p>
+      <w:r>
+        <w:rPr>
+          <w:b/>
+          <w:color w:val="4A7FC1"/>
+        </w:rPr>
+        <w:t xml:space="preserve">#28  </w:t>
+      </w:r>
+      <w:r>
+        <w:rPr>
+          <w:b/>
+          <w:i w:val="0"/>
+        </w:rPr>
+        <w:t>Bread and Water from Snow and Air</w:t>
+      </w:r>
+    </w:p>
+    <w:p>
+      <w:r>
+        <w:rPr>
+          <w:b/>
+          <w:color w:val="4A7FC1"/>
+        </w:rPr>
+        <w:t xml:space="preserve">#29  </w:t>
       </w:r>
       <w:r>
         <w:rPr>
           <w:b w:val="0"/>
           <w:i w:val="0"/>
         </w:rPr>
-        <w:t>Breakthrough 1 · Fusion Power Station</w:t>
-      </w:r>
-    </w:p>
-    <w:p>
-      <w:r>
-        <w:rPr>
-          <w:b/>
-          <w:color w:val="4A7FC1"/>
-        </w:rPr>
-        <w:t xml:space="preserve">#25  </w:t>
-      </w:r>
-      <w:r>
-        <w:rPr>
-          <w:b/>
-          <w:i w:val="0"/>
-        </w:rPr>
-        <w:t>15</w:t>
-      </w:r>
-    </w:p>
-    <w:p>
-      <w:r>
-        <w:rPr>
-          <w:b/>
-          <w:color w:val="4A7FC1"/>
-        </w:rPr>
-        <w:t xml:space="preserve">#26  </w:t>
-      </w:r>
-      <w:r>
-        <w:rPr>
-          <w:b/>
-          <w:i w:val="0"/>
-        </w:rPr>
-        <w:t>Bread and Water from Snow and Air</w:t>
-      </w:r>
-    </w:p>
-    <w:p>
-      <w:r>
-        <w:rPr>
-          <w:b/>
-          <w:color w:val="4A7FC1"/>
-        </w:rPr>
-        <w:t xml:space="preserve">#27  </w:t>
+        <w:t>Breakthrough 2 · Snow-to-Food &amp; Water Plant</w:t>
+      </w:r>
+    </w:p>
+    <w:p>
+      <w:r>
+        <w:rPr>
+          <w:b/>
+          <w:color w:val="4A7FC1"/>
+        </w:rPr>
+        <w:t xml:space="preserve">#30  </w:t>
+      </w:r>
+      <w:r>
+        <w:rPr>
+          <w:b/>
+          <w:i w:val="0"/>
+        </w:rPr>
+        <w:t>17</w:t>
+      </w:r>
+    </w:p>
+    <w:p>
+      <w:r>
+        <w:rPr>
+          <w:b/>
+          <w:color w:val="4A7FC1"/>
+        </w:rPr>
+        <w:t xml:space="preserve">#31  </w:t>
+      </w:r>
+      <w:r>
+        <w:rPr>
+          <w:b/>
+          <w:i w:val="0"/>
+        </w:rPr>
+        <w:t>A Snow Mountain You Can Walk Inside</w:t>
+      </w:r>
+    </w:p>
+    <w:p>
+      <w:r>
+        <w:rPr>
+          <w:b/>
+          <w:color w:val="4A7FC1"/>
+        </w:rPr>
+        <w:t xml:space="preserve">#32  </w:t>
       </w:r>
       <w:r>
         <w:rPr>
           <w:b w:val="0"/>
           <w:i w:val="0"/>
         </w:rPr>
-        <w:t>Breakthrough 2 · Snow-to-Food &amp; Water Plant</w:t>
-      </w:r>
-    </w:p>
-    <w:p>
-      <w:r>
-        <w:rPr>
-          <w:b/>
-          <w:color w:val="4A7FC1"/>
-        </w:rPr>
-        <w:t xml:space="preserve">#28  </w:t>
-      </w:r>
-      <w:r>
-        <w:rPr>
-          <w:b/>
-          <w:i w:val="0"/>
-        </w:rPr>
-        <w:t>17</w:t>
-      </w:r>
-    </w:p>
-    <w:p>
-      <w:r>
-        <w:rPr>
-          <w:b/>
-          <w:color w:val="4A7FC1"/>
-        </w:rPr>
-        <w:t xml:space="preserve">#29  </w:t>
-      </w:r>
-      <w:r>
-        <w:rPr>
-          <w:b/>
-          <w:i w:val="0"/>
-        </w:rPr>
-        <w:t>A Snow Mountain You Can Walk Inside</w:t>
-      </w:r>
-    </w:p>
-    <w:p>
-      <w:r>
-        <w:rPr>
-          <w:b/>
-          <w:color w:val="4A7FC1"/>
-        </w:rPr>
-        <w:t xml:space="preserve">#30  </w:t>
+        <w:t>Breakthrough 3 · Mount Aurora</w:t>
+      </w:r>
+    </w:p>
+    <w:p>
+      <w:r>
+        <w:rPr>
+          <w:b/>
+          <w:color w:val="4A7FC1"/>
+        </w:rPr>
+        <w:t xml:space="preserve">#33  </w:t>
+      </w:r>
+      <w:r>
+        <w:rPr>
+          <w:b/>
+          <w:i w:val="0"/>
+        </w:rPr>
+        <w:t>21</w:t>
+      </w:r>
+    </w:p>
+    <w:p>
+      <w:r>
+        <w:rPr>
+          <w:b/>
+          <w:color w:val="4A7FC1"/>
+        </w:rPr>
+        <w:t xml:space="preserve">#34  </w:t>
+      </w:r>
+      <w:r>
+        <w:rPr>
+          <w:b/>
+          <w:i w:val="0"/>
+        </w:rPr>
+        <w:t>Built by Us</w:t>
+      </w:r>
+    </w:p>
+    <w:p>
+      <w:r>
+        <w:rPr>
+          <w:b/>
+          <w:color w:val="4A7FC1"/>
+        </w:rPr>
+        <w:t xml:space="preserve">#35  </w:t>
       </w:r>
       <w:r>
         <w:rPr>
           <w:b w:val="0"/>
           <w:i w:val="0"/>
         </w:rPr>
-        <w:t>Breakthrough 3 · Mount Aurora</w:t>
-      </w:r>
-    </w:p>
-    <w:p>
-      <w:r>
-        <w:rPr>
-          <w:b/>
-          <w:color w:val="4A7FC1"/>
-        </w:rPr>
-        <w:t xml:space="preserve">#31  </w:t>
-      </w:r>
-      <w:r>
-        <w:rPr>
-          <w:b/>
-          <w:i w:val="0"/>
-        </w:rPr>
-        <w:t>21</w:t>
-      </w:r>
-    </w:p>
-    <w:p>
-      <w:r>
-        <w:rPr>
-          <w:b/>
-          <w:color w:val="4A7FC1"/>
-        </w:rPr>
-        <w:t xml:space="preserve">#32  </w:t>
-      </w:r>
-      <w:r>
-        <w:rPr>
-          <w:b/>
-          <w:i w:val="0"/>
-        </w:rPr>
-        <w:t>Built by Us</w:t>
-      </w:r>
-    </w:p>
-    <w:p>
-      <w:r>
-        <w:rPr>
-          <w:b/>
-          <w:color w:val="4A7FC1"/>
-        </w:rPr>
-        <w:t xml:space="preserve">#33  </w:t>
+        <w:t>Our Eco-Polis model, and how to explore it</w:t>
+      </w:r>
+    </w:p>
+    <w:p>
+      <w:r>
+        <w:rPr>
+          <w:b/>
+          <w:color w:val="4A7FC1"/>
+        </w:rPr>
+        <w:t xml:space="preserve">#36  </w:t>
+      </w:r>
+      <w:r>
+        <w:rPr>
+          <w:b/>
+          <w:i w:val="0"/>
+        </w:rPr>
+        <w:t>INVEST</w:t>
+      </w:r>
+    </w:p>
+    <w:p>
+      <w:r>
+        <w:rPr>
+          <w:b/>
+          <w:color w:val="4A7FC1"/>
+        </w:rPr>
+        <w:t xml:space="preserve">#37  </w:t>
+      </w:r>
+      <w:r>
+        <w:rPr>
+          <w:b/>
+          <w:i w:val="0"/>
+        </w:rPr>
+        <w:t>32</w:t>
+      </w:r>
+    </w:p>
+    <w:p>
+      <w:r>
+        <w:rPr>
+          <w:b/>
+          <w:color w:val="4A7FC1"/>
+        </w:rPr>
+        <w:t xml:space="preserve">#38  </w:t>
+      </w:r>
+      <w:r>
+        <w:rPr>
+          <w:b/>
+          <w:i w:val="0"/>
+        </w:rPr>
+        <w:t>Invest in Aurora Haven</w:t>
+      </w:r>
+    </w:p>
+    <w:p>
+      <w:r>
+        <w:rPr>
+          <w:b/>
+          <w:color w:val="4A7FC1"/>
+        </w:rPr>
+        <w:t xml:space="preserve">#39  </w:t>
       </w:r>
       <w:r>
         <w:rPr>
           <w:b w:val="0"/>
           <w:i w:val="0"/>
         </w:rPr>
-        <w:t>Our Eco-Polis model, and how to explore it</w:t>
-      </w:r>
-    </w:p>
-    <w:p>
-      <w:r>
-        <w:rPr>
-          <w:b/>
-          <w:color w:val="4A7FC1"/>
-        </w:rPr>
-        <w:t xml:space="preserve">#34  </w:t>
+        <w:t>Three ways to fund the city, stage by stage</w:t>
+      </w:r>
+    </w:p>
+    <w:p>
+      <w:r>
+        <w:rPr>
+          <w:b/>
+          <w:color w:val="4A7FC1"/>
+        </w:rPr>
+        <w:t xml:space="preserve">#40  </w:t>
+      </w:r>
+      <w:r>
+        <w:rPr>
+          <w:b/>
+          <w:i w:val="0"/>
+        </w:rPr>
+        <w:t>SYSTEMS &amp; LIFE</w:t>
+      </w:r>
+    </w:p>
+    <w:p>
+      <w:r>
+        <w:rPr>
+          <w:b/>
+          <w:color w:val="4A7FC1"/>
+        </w:rPr>
+        <w:t xml:space="preserve">#41  </w:t>
       </w:r>
       <w:r>
         <w:rPr>
@@ -793,7 +979,7 @@
           <w:b/>
           <w:color w:val="4A7FC1"/>
         </w:rPr>
-        <w:t xml:space="preserve">#35  </w:t>
+        <w:t xml:space="preserve">#42  </w:t>
       </w:r>
       <w:r>
         <w:rPr>
@@ -809,7 +995,7 @@
           <w:b/>
           <w:color w:val="4A7FC1"/>
         </w:rPr>
-        <w:t xml:space="preserve">#36  </w:t>
+        <w:t xml:space="preserve">#43  </w:t>
       </w:r>
       <w:r>
         <w:rPr>
@@ -825,7 +1011,7 @@
           <w:b/>
           <w:color w:val="4A7FC1"/>
         </w:rPr>
-        <w:t xml:space="preserve">#37  </w:t>
+        <w:t xml:space="preserve">#44  </w:t>
       </w:r>
       <w:r>
         <w:rPr>
@@ -841,7 +1027,7 @@
           <w:b/>
           <w:color w:val="4A7FC1"/>
         </w:rPr>
-        <w:t xml:space="preserve">#38  </w:t>
+        <w:t xml:space="preserve">#45  </w:t>
       </w:r>
       <w:r>
         <w:rPr>
@@ -857,7 +1043,7 @@
           <w:b/>
           <w:color w:val="4A7FC1"/>
         </w:rPr>
-        <w:t xml:space="preserve">#39  </w:t>
+        <w:t xml:space="preserve">#46  </w:t>
       </w:r>
       <w:r>
         <w:rPr>
@@ -873,7 +1059,7 @@
           <w:b/>
           <w:color w:val="4A7FC1"/>
         </w:rPr>
-        <w:t xml:space="preserve">#40  </w:t>
+        <w:t xml:space="preserve">#47  </w:t>
       </w:r>
       <w:r>
         <w:rPr>
@@ -889,7 +1075,7 @@
           <w:b/>
           <w:color w:val="4A7FC1"/>
         </w:rPr>
-        <w:t xml:space="preserve">#41  </w:t>
+        <w:t xml:space="preserve">#48  </w:t>
       </w:r>
       <w:r>
         <w:rPr>
@@ -905,7 +1091,7 @@
           <w:b/>
           <w:color w:val="4A7FC1"/>
         </w:rPr>
-        <w:t xml:space="preserve">#42  </w:t>
+        <w:t xml:space="preserve">#49  </w:t>
       </w:r>
       <w:r>
         <w:rPr>
@@ -921,7 +1107,7 @@
           <w:b/>
           <w:color w:val="4A7FC1"/>
         </w:rPr>
-        <w:t xml:space="preserve">#43  </w:t>
+        <w:t xml:space="preserve">#50  </w:t>
       </w:r>
       <w:r>
         <w:rPr>
@@ -937,7 +1123,7 @@
           <w:b/>
           <w:color w:val="4A7FC1"/>
         </w:rPr>
-        <w:t xml:space="preserve">#44  </w:t>
+        <w:t xml:space="preserve">#51  </w:t>
       </w:r>
       <w:r>
         <w:rPr>
@@ -953,7 +1139,7 @@
           <w:b/>
           <w:color w:val="4A7FC1"/>
         </w:rPr>
-        <w:t xml:space="preserve">#45  </w:t>
+        <w:t xml:space="preserve">#52  </w:t>
       </w:r>
       <w:r>
         <w:rPr>
@@ -969,7 +1155,7 @@
           <w:b/>
           <w:color w:val="4A7FC1"/>
         </w:rPr>
-        <w:t xml:space="preserve">#46  </w:t>
+        <w:t xml:space="preserve">#53  </w:t>
       </w:r>
       <w:r>
         <w:rPr>
@@ -985,7 +1171,7 @@
           <w:b/>
           <w:color w:val="4A7FC1"/>
         </w:rPr>
-        <w:t xml:space="preserve">#47  </w:t>
+        <w:t xml:space="preserve">#54  </w:t>
       </w:r>
       <w:r>
         <w:rPr>
@@ -1001,7 +1187,7 @@
           <w:b/>
           <w:color w:val="4A7FC1"/>
         </w:rPr>
-        <w:t xml:space="preserve">#48  </w:t>
+        <w:t xml:space="preserve">#55  </w:t>
       </w:r>
       <w:r>
         <w:rPr>
@@ -1017,7 +1203,7 @@
           <w:b/>
           <w:color w:val="4A7FC1"/>
         </w:rPr>
-        <w:t xml:space="preserve">#49  </w:t>
+        <w:t xml:space="preserve">#56  </w:t>
       </w:r>
       <w:r>
         <w:rPr>
@@ -1033,7 +1219,7 @@
           <w:b/>
           <w:color w:val="4A7FC1"/>
         </w:rPr>
-        <w:t xml:space="preserve">#50  </w:t>
+        <w:t xml:space="preserve">#57  </w:t>
       </w:r>
       <w:r>
         <w:rPr>
@@ -1049,7 +1235,7 @@
           <w:b/>
           <w:color w:val="4A7FC1"/>
         </w:rPr>
-        <w:t xml:space="preserve">#51  </w:t>
+        <w:t xml:space="preserve">#58  </w:t>
       </w:r>
       <w:r>
         <w:rPr>
@@ -1065,7 +1251,7 @@
           <w:b/>
           <w:color w:val="4A7FC1"/>
         </w:rPr>
-        <w:t xml:space="preserve">#52  </w:t>
+        <w:t xml:space="preserve">#59  </w:t>
       </w:r>
       <w:r>
         <w:rPr>
@@ -1081,7 +1267,7 @@
           <w:b/>
           <w:color w:val="4A7FC1"/>
         </w:rPr>
-        <w:t xml:space="preserve">#53  </w:t>
+        <w:t xml:space="preserve">#60  </w:t>
       </w:r>
       <w:r>
         <w:rPr>
@@ -1097,7 +1283,7 @@
           <w:b/>
           <w:color w:val="4A7FC1"/>
         </w:rPr>
-        <w:t xml:space="preserve">#54  </w:t>
+        <w:t xml:space="preserve">#61  </w:t>
       </w:r>
       <w:r>
         <w:rPr>
@@ -1113,7 +1299,7 @@
           <w:b/>
           <w:color w:val="4A7FC1"/>
         </w:rPr>
-        <w:t xml:space="preserve">#55  </w:t>
+        <w:t xml:space="preserve">#62  </w:t>
       </w:r>
       <w:r>
         <w:rPr>
@@ -1129,7 +1315,7 @@
           <w:b/>
           <w:color w:val="4A7FC1"/>
         </w:rPr>
-        <w:t xml:space="preserve">#56  </w:t>
+        <w:t xml:space="preserve">#63  </w:t>
       </w:r>
       <w:r>
         <w:rPr>
@@ -1145,7 +1331,7 @@
           <w:b/>
           <w:color w:val="4A7FC1"/>
         </w:rPr>
-        <w:t xml:space="preserve">#57  </w:t>
+        <w:t xml:space="preserve">#64  </w:t>
       </w:r>
       <w:r>
         <w:rPr>
@@ -1161,7 +1347,7 @@
           <w:b/>
           <w:color w:val="4A7FC1"/>
         </w:rPr>
-        <w:t xml:space="preserve">#58  </w:t>
+        <w:t xml:space="preserve">#65  </w:t>
       </w:r>
       <w:r>
         <w:rPr>
@@ -1177,7 +1363,7 @@
           <w:b/>
           <w:color w:val="4A7FC1"/>
         </w:rPr>
-        <w:t xml:space="preserve">#59  </w:t>
+        <w:t xml:space="preserve">#66  </w:t>
       </w:r>
       <w:r>
         <w:rPr>
@@ -1193,7 +1379,7 @@
           <w:b/>
           <w:color w:val="4A7FC1"/>
         </w:rPr>
-        <w:t xml:space="preserve">#60  </w:t>
+        <w:t xml:space="preserve">#67  </w:t>
       </w:r>
       <w:r>
         <w:rPr>
@@ -1209,7 +1395,7 @@
           <w:b/>
           <w:color w:val="4A7FC1"/>
         </w:rPr>
-        <w:t xml:space="preserve">#61  </w:t>
+        <w:t xml:space="preserve">#68  </w:t>
       </w:r>
       <w:r>
         <w:rPr>
@@ -1225,7 +1411,7 @@
           <w:b/>
           <w:color w:val="4A7FC1"/>
         </w:rPr>
-        <w:t xml:space="preserve">#62  </w:t>
+        <w:t xml:space="preserve">#69  </w:t>
       </w:r>
       <w:r>
         <w:rPr>
@@ -1241,7 +1427,7 @@
           <w:b/>
           <w:color w:val="4A7FC1"/>
         </w:rPr>
-        <w:t xml:space="preserve">#63  </w:t>
+        <w:t xml:space="preserve">#70  </w:t>
       </w:r>
       <w:r>
         <w:rPr>
@@ -1257,237 +1443,205 @@
           <w:b/>
           <w:color w:val="4A7FC1"/>
         </w:rPr>
-        <w:t xml:space="preserve">#64  </w:t>
-      </w:r>
-      <w:r>
-        <w:rPr>
-          <w:b/>
-          <w:i w:val="0"/>
-        </w:rPr>
-        <w:t>32</w:t>
-      </w:r>
-    </w:p>
-    <w:p>
-      <w:r>
-        <w:rPr>
-          <w:b/>
-          <w:color w:val="4A7FC1"/>
-        </w:rPr>
-        <w:t xml:space="preserve">#65  </w:t>
-      </w:r>
-      <w:r>
-        <w:rPr>
-          <w:b/>
-          <w:i w:val="0"/>
-        </w:rPr>
-        <w:t>Invest in Aurora Haven</w:t>
-      </w:r>
-    </w:p>
-    <w:p>
-      <w:r>
-        <w:rPr>
-          <w:b/>
-          <w:color w:val="4A7FC1"/>
-        </w:rPr>
-        <w:t xml:space="preserve">#66  </w:t>
+        <w:t xml:space="preserve">#71  </w:t>
+      </w:r>
+      <w:r>
+        <w:rPr>
+          <w:b/>
+          <w:i w:val="0"/>
+        </w:rPr>
+        <w:t>THE GUIDE</w:t>
+      </w:r>
+    </w:p>
+    <w:p>
+      <w:r>
+        <w:rPr>
+          <w:b/>
+          <w:color w:val="4A7FC1"/>
+        </w:rPr>
+        <w:t xml:space="preserve">#72  </w:t>
+      </w:r>
+      <w:r>
+        <w:rPr>
+          <w:b/>
+          <w:i w:val="0"/>
+        </w:rPr>
+        <w:t>33</w:t>
+      </w:r>
+    </w:p>
+    <w:p>
+      <w:r>
+        <w:rPr>
+          <w:b/>
+          <w:color w:val="4A7FC1"/>
+        </w:rPr>
+        <w:t xml:space="preserve">#73  </w:t>
+      </w:r>
+      <w:r>
+        <w:rPr>
+          <w:b/>
+          <w:i w:val="0"/>
+        </w:rPr>
+        <w:t>Take the Tour</w:t>
+      </w:r>
+    </w:p>
+    <w:p>
+      <w:r>
+        <w:rPr>
+          <w:b/>
+          <w:color w:val="4A7FC1"/>
+        </w:rPr>
+        <w:t xml:space="preserve">#74  </w:t>
       </w:r>
       <w:r>
         <w:rPr>
           <w:b w:val="0"/>
           <w:i w:val="0"/>
         </w:rPr>
-        <w:t>Three ways to fund the city, stage by stage</w:t>
-      </w:r>
-    </w:p>
-    <w:p>
-      <w:r>
-        <w:rPr>
-          <w:b/>
-          <w:color w:val="4A7FC1"/>
-        </w:rPr>
-        <w:t xml:space="preserve">#67  </w:t>
-      </w:r>
-      <w:r>
-        <w:rPr>
-          <w:b/>
-          <w:i w:val="0"/>
-        </w:rPr>
-        <w:t>33</w:t>
-      </w:r>
-    </w:p>
-    <w:p>
-      <w:r>
-        <w:rPr>
-          <w:b/>
-          <w:color w:val="4A7FC1"/>
-        </w:rPr>
-        <w:t xml:space="preserve">#68  </w:t>
-      </w:r>
-      <w:r>
-        <w:rPr>
-          <w:b/>
-          <w:i w:val="0"/>
-        </w:rPr>
-        <w:t>Take the Tour</w:t>
-      </w:r>
-    </w:p>
-    <w:p>
-      <w:r>
-        <w:rPr>
-          <w:b/>
-          <w:color w:val="4A7FC1"/>
-        </w:rPr>
-        <w:t xml:space="preserve">#69  </w:t>
+        <w:t>Eight stops around the city</w:t>
+      </w:r>
+    </w:p>
+    <w:p>
+      <w:r>
+        <w:rPr>
+          <w:b/>
+          <w:color w:val="4A7FC1"/>
+        </w:rPr>
+        <w:t xml:space="preserve">#75  </w:t>
+      </w:r>
+      <w:r>
+        <w:rPr>
+          <w:b/>
+          <w:i w:val="0"/>
+        </w:rPr>
+        <w:t>34</w:t>
+      </w:r>
+    </w:p>
+    <w:p>
+      <w:r>
+        <w:rPr>
+          <w:b/>
+          <w:color w:val="4A7FC1"/>
+        </w:rPr>
+        <w:t xml:space="preserve">#76  </w:t>
+      </w:r>
+      <w:r>
+        <w:rPr>
+          <w:b/>
+          <w:i w:val="0"/>
+        </w:rPr>
+        <w:t>Places to Visit</w:t>
+      </w:r>
+    </w:p>
+    <w:p>
+      <w:r>
+        <w:rPr>
+          <w:b/>
+          <w:color w:val="4A7FC1"/>
+        </w:rPr>
+        <w:t xml:space="preserve">#77  </w:t>
       </w:r>
       <w:r>
         <w:rPr>
           <w:b w:val="0"/>
           <w:i w:val="0"/>
         </w:rPr>
-        <w:t>Eight stops around the city</w:t>
-      </w:r>
-    </w:p>
-    <w:p>
-      <w:r>
-        <w:rPr>
-          <w:b/>
-          <w:color w:val="4A7FC1"/>
-        </w:rPr>
-        <w:t xml:space="preserve">#70  </w:t>
-      </w:r>
-      <w:r>
-        <w:rPr>
-          <w:b/>
-          <w:i w:val="0"/>
-        </w:rPr>
-        <w:t>34</w:t>
-      </w:r>
-    </w:p>
-    <w:p>
-      <w:r>
-        <w:rPr>
-          <w:b/>
-          <w:color w:val="4A7FC1"/>
-        </w:rPr>
-        <w:t xml:space="preserve">#71  </w:t>
-      </w:r>
-      <w:r>
-        <w:rPr>
-          <w:b/>
-          <w:i w:val="0"/>
-        </w:rPr>
-        <w:t>Places to Visit</w:t>
-      </w:r>
-    </w:p>
-    <w:p>
-      <w:r>
-        <w:rPr>
-          <w:b/>
-          <w:color w:val="4A7FC1"/>
-        </w:rPr>
-        <w:t xml:space="preserve">#72  </w:t>
+        <w:t>35 key places and what they do</w:t>
+      </w:r>
+    </w:p>
+    <w:p>
+      <w:r>
+        <w:rPr>
+          <w:b/>
+          <w:color w:val="4A7FC1"/>
+        </w:rPr>
+        <w:t xml:space="preserve">#78  </w:t>
+      </w:r>
+      <w:r>
+        <w:rPr>
+          <w:b/>
+          <w:i w:val="0"/>
+        </w:rPr>
+        <w:t>35</w:t>
+      </w:r>
+    </w:p>
+    <w:p>
+      <w:r>
+        <w:rPr>
+          <w:b/>
+          <w:color w:val="4A7FC1"/>
+        </w:rPr>
+        <w:t xml:space="preserve">#79  </w:t>
+      </w:r>
+      <w:r>
+        <w:rPr>
+          <w:b/>
+          <w:i w:val="0"/>
+        </w:rPr>
+        <w:t>Through a Resident’s Eyes</w:t>
+      </w:r>
+    </w:p>
+    <w:p>
+      <w:r>
+        <w:rPr>
+          <w:b/>
+          <w:color w:val="4A7FC1"/>
+        </w:rPr>
+        <w:t xml:space="preserve">#80  </w:t>
       </w:r>
       <w:r>
         <w:rPr>
           <w:b w:val="0"/>
           <w:i w:val="0"/>
         </w:rPr>
-        <w:t>35 key places and what they do</w:t>
-      </w:r>
-    </w:p>
-    <w:p>
-      <w:r>
-        <w:rPr>
-          <w:b/>
-          <w:color w:val="4A7FC1"/>
-        </w:rPr>
-        <w:t xml:space="preserve">#73  </w:t>
-      </w:r>
-      <w:r>
-        <w:rPr>
-          <w:b/>
-          <w:i w:val="0"/>
-        </w:rPr>
-        <w:t>35</w:t>
-      </w:r>
-    </w:p>
-    <w:p>
-      <w:r>
-        <w:rPr>
-          <w:b/>
-          <w:color w:val="4A7FC1"/>
-        </w:rPr>
-        <w:t xml:space="preserve">#74  </w:t>
-      </w:r>
-      <w:r>
-        <w:rPr>
-          <w:b/>
-          <w:i w:val="0"/>
-        </w:rPr>
-        <w:t>Through a Resident’s Eyes</w:t>
-      </w:r>
-    </w:p>
-    <w:p>
-      <w:r>
-        <w:rPr>
-          <w:b/>
-          <w:color w:val="4A7FC1"/>
-        </w:rPr>
-        <w:t xml:space="preserve">#75  </w:t>
+        <w:t>An imagined day in the polar night</w:t>
+      </w:r>
+    </w:p>
+    <w:p>
+      <w:r>
+        <w:rPr>
+          <w:b/>
+          <w:color w:val="4A7FC1"/>
+        </w:rPr>
+        <w:t xml:space="preserve">#81  </w:t>
+      </w:r>
+      <w:r>
+        <w:rPr>
+          <w:b/>
+          <w:i w:val="0"/>
+        </w:rPr>
+        <w:t>36</w:t>
+      </w:r>
+    </w:p>
+    <w:p>
+      <w:r>
+        <w:rPr>
+          <w:b/>
+          <w:color w:val="4A7FC1"/>
+        </w:rPr>
+        <w:t xml:space="preserve">#82  </w:t>
+      </w:r>
+      <w:r>
+        <w:rPr>
+          <w:b/>
+          <w:i w:val="0"/>
+        </w:rPr>
+        <w:t>Sources &amp; Assumptions</w:t>
+      </w:r>
+    </w:p>
+    <w:p>
+      <w:r>
+        <w:rPr>
+          <w:b/>
+          <w:color w:val="4A7FC1"/>
+        </w:rPr>
+        <w:t xml:space="preserve">#83  </w:t>
       </w:r>
       <w:r>
         <w:rPr>
           <w:b w:val="0"/>
           <w:i w:val="0"/>
         </w:rPr>
-        <w:t>An imagined day in the polar night</w:t>
-      </w:r>
-    </w:p>
-    <w:p>
-      <w:r>
-        <w:rPr>
-          <w:b/>
-          <w:color w:val="4A7FC1"/>
-        </w:rPr>
-        <w:t xml:space="preserve">#76  </w:t>
-      </w:r>
-      <w:r>
-        <w:rPr>
-          <w:b/>
-          <w:i w:val="0"/>
-        </w:rPr>
-        <w:t>36</w:t>
-      </w:r>
-    </w:p>
-    <w:p>
-      <w:r>
-        <w:rPr>
-          <w:b/>
-          <w:color w:val="4A7FC1"/>
-        </w:rPr>
-        <w:t xml:space="preserve">#77  </w:t>
-      </w:r>
-      <w:r>
-        <w:rPr>
-          <w:b/>
-          <w:i w:val="0"/>
-        </w:rPr>
-        <w:t>Sources &amp; Assumptions</w:t>
-      </w:r>
-    </w:p>
-    <w:p>
-      <w:r>
-        <w:rPr>
-          <w:b/>
-          <w:color w:val="4A7FC1"/>
-        </w:rPr>
-        <w:t xml:space="preserve">#78  </w:t>
-      </w:r>
-      <w:r>
-        <w:rPr>
-          <w:b w:val="0"/>
-          <w:i w:val="0"/>
-        </w:rPr>
         <w:t>Where our facts come from</w:t>
       </w:r>
     </w:p>
@@ -1497,7 +1651,7 @@
           <w:b/>
           <w:color w:val="4A7FC1"/>
         </w:rPr>
-        <w:t xml:space="preserve">#79  </w:t>
+        <w:t xml:space="preserve">#84  </w:t>
       </w:r>
       <w:r>
         <w:rPr>
@@ -1505,6 +1659,29 @@
           <w:i w:val="0"/>
         </w:rPr>
         <w:t>1</w:t>
+      </w:r>
+    </w:p>
+    <w:p>
+      <w:r>
+        <w:rPr>
+          <w:b/>
+          <w:color w:val="4A7FC1"/>
+        </w:rPr>
+        <w:t xml:space="preserve">#85  </w:t>
+      </w:r>
+      <w:r>
+        <w:rPr>
+          <w:b/>
+          <w:i w:val="0"/>
+        </w:rPr>
+        <w:t xml:space="preserve">AURORA HAVEN  ·  ISSUE 01  ·  </w:t>
+      </w:r>
+      <w:r>
+        <w:rPr>
+          <w:b/>
+          <w:i w:val="0"/>
+        </w:rPr>
+        <w:t>WELCOME</w:t>
       </w:r>
     </w:p>
     <w:p>
@@ -1683,6 +1860,29 @@
       </w:r>
     </w:p>
     <w:p>
+      <w:r>
+        <w:rPr>
+          <w:b/>
+          <w:color w:val="4A7FC1"/>
+        </w:rPr>
+        <w:t xml:space="preserve">#11  </w:t>
+      </w:r>
+      <w:r>
+        <w:rPr>
+          <w:b/>
+          <w:i w:val="0"/>
+        </w:rPr>
+        <w:t xml:space="preserve">AURORA HAVEN  ·  ISSUE 01  ·  </w:t>
+      </w:r>
+      <w:r>
+        <w:rPr>
+          <w:b/>
+          <w:i w:val="0"/>
+        </w:rPr>
+        <w:t>WELCOME</w:t>
+      </w:r>
+    </w:p>
+    <w:p>
       <w:pPr>
         <w:pStyle w:val="Heading1"/>
       </w:pPr>
@@ -2022,6 +2222,29 @@
       </w:r>
     </w:p>
     <w:p>
+      <w:r>
+        <w:rPr>
+          <w:b/>
+          <w:color w:val="4A7FC1"/>
+        </w:rPr>
+        <w:t xml:space="preserve">#20  </w:t>
+      </w:r>
+      <w:r>
+        <w:rPr>
+          <w:b/>
+          <w:i w:val="0"/>
+        </w:rPr>
+        <w:t xml:space="preserve">AURORA HAVEN  ·  ISSUE 01  ·  </w:t>
+      </w:r>
+      <w:r>
+        <w:rPr>
+          <w:b/>
+          <w:i w:val="0"/>
+        </w:rPr>
+        <w:t>WELCOME</w:t>
+      </w:r>
+    </w:p>
+    <w:p>
       <w:pPr>
         <w:pStyle w:val="Heading1"/>
       </w:pPr>
@@ -2167,6 +2390,29 @@
       </w:r>
     </w:p>
     <w:p>
+      <w:r>
+        <w:rPr>
+          <w:b/>
+          <w:color w:val="4A7FC1"/>
+        </w:rPr>
+        <w:t xml:space="preserve">#8  </w:t>
+      </w:r>
+      <w:r>
+        <w:rPr>
+          <w:b/>
+          <w:i w:val="0"/>
+        </w:rPr>
+        <w:t xml:space="preserve">AURORA HAVEN  ·  ISSUE 01  ·  </w:t>
+      </w:r>
+      <w:r>
+        <w:rPr>
+          <w:b/>
+          <w:i w:val="0"/>
+        </w:rPr>
+        <w:t>WELCOME</w:t>
+      </w:r>
+    </w:p>
+    <w:p>
       <w:pPr>
         <w:pStyle w:val="Heading1"/>
       </w:pPr>
@@ -2415,6 +2661,29 @@
       </w:r>
     </w:p>
     <w:p>
+      <w:r>
+        <w:rPr>
+          <w:b/>
+          <w:color w:val="4A7FC1"/>
+        </w:rPr>
+        <w:t xml:space="preserve">#16  </w:t>
+      </w:r>
+      <w:r>
+        <w:rPr>
+          <w:b/>
+          <w:i w:val="0"/>
+        </w:rPr>
+        <w:t xml:space="preserve">AURORA HAVEN  ·  ISSUE 01  ·  </w:t>
+      </w:r>
+      <w:r>
+        <w:rPr>
+          <w:b/>
+          <w:i w:val="0"/>
+        </w:rPr>
+        <w:t>WELCOME</w:t>
+      </w:r>
+    </w:p>
+    <w:p>
       <w:pPr>
         <w:pStyle w:val="Heading1"/>
       </w:pPr>
@@ -2681,6 +2950,29 @@
       </w:r>
     </w:p>
     <w:p>
+      <w:r>
+        <w:rPr>
+          <w:b/>
+          <w:color w:val="4A7FC1"/>
+        </w:rPr>
+        <w:t xml:space="preserve">#16  </w:t>
+      </w:r>
+      <w:r>
+        <w:rPr>
+          <w:b/>
+          <w:i w:val="0"/>
+        </w:rPr>
+        <w:t xml:space="preserve">AURORA HAVEN  ·  ISSUE 01  ·  </w:t>
+      </w:r>
+      <w:r>
+        <w:rPr>
+          <w:b/>
+          <w:i w:val="0"/>
+        </w:rPr>
+        <w:t>THE CITY</w:t>
+      </w:r>
+    </w:p>
+    <w:p>
       <w:pPr>
         <w:pStyle w:val="Heading1"/>
       </w:pPr>
@@ -3124,6 +3416,29 @@
       </w:r>
     </w:p>
     <w:p>
+      <w:r>
+        <w:rPr>
+          <w:b/>
+          <w:color w:val="4A7FC1"/>
+        </w:rPr>
+        <w:t xml:space="preserve">#26  </w:t>
+      </w:r>
+      <w:r>
+        <w:rPr>
+          <w:b/>
+          <w:i w:val="0"/>
+        </w:rPr>
+        <w:t xml:space="preserve">AURORA HAVEN  ·  ISSUE 01  ·  </w:t>
+      </w:r>
+      <w:r>
+        <w:rPr>
+          <w:b/>
+          <w:i w:val="0"/>
+        </w:rPr>
+        <w:t>THE CITY</w:t>
+      </w:r>
+    </w:p>
+    <w:p>
       <w:pPr>
         <w:pStyle w:val="Heading1"/>
       </w:pPr>
@@ -3221,6 +3536,29 @@
       </w:r>
     </w:p>
     <w:p>
+      <w:r>
+        <w:rPr>
+          <w:b/>
+          <w:color w:val="4A7FC1"/>
+        </w:rPr>
+        <w:t xml:space="preserve">#6  </w:t>
+      </w:r>
+      <w:r>
+        <w:rPr>
+          <w:b/>
+          <w:i w:val="0"/>
+        </w:rPr>
+        <w:t xml:space="preserve">AURORA HAVEN  ·  ISSUE 01  ·  </w:t>
+      </w:r>
+      <w:r>
+        <w:rPr>
+          <w:b/>
+          <w:i w:val="0"/>
+        </w:rPr>
+        <w:t>THE CITY</w:t>
+      </w:r>
+    </w:p>
+    <w:p>
       <w:pPr>
         <w:pStyle w:val="Heading1"/>
       </w:pPr>
@@ -3261,6 +3599,29 @@
       </w:r>
     </w:p>
     <w:p>
+      <w:r>
+        <w:rPr>
+          <w:b/>
+          <w:color w:val="4A7FC1"/>
+        </w:rPr>
+        <w:t xml:space="preserve">#3  </w:t>
+      </w:r>
+      <w:r>
+        <w:rPr>
+          <w:b/>
+          <w:i w:val="0"/>
+        </w:rPr>
+        <w:t xml:space="preserve">AURORA HAVEN  ·  ISSUE 01  ·  </w:t>
+      </w:r>
+      <w:r>
+        <w:rPr>
+          <w:b/>
+          <w:i w:val="0"/>
+        </w:rPr>
+        <w:t>THE CITY</w:t>
+      </w:r>
+    </w:p>
+    <w:p>
       <w:pPr>
         <w:pStyle w:val="Heading1"/>
       </w:pPr>
@@ -3493,6 +3854,29 @@
       </w:r>
     </w:p>
     <w:p>
+      <w:r>
+        <w:rPr>
+          <w:b/>
+          <w:color w:val="4A7FC1"/>
+        </w:rPr>
+        <w:t xml:space="preserve">#15  </w:t>
+      </w:r>
+      <w:r>
+        <w:rPr>
+          <w:b/>
+          <w:i w:val="0"/>
+        </w:rPr>
+        <w:t xml:space="preserve">AURORA HAVEN  ·  ISSUE 01  ·  </w:t>
+      </w:r>
+      <w:r>
+        <w:rPr>
+          <w:b/>
+          <w:i w:val="0"/>
+        </w:rPr>
+        <w:t>THE CITY</w:t>
+      </w:r>
+    </w:p>
+    <w:p>
       <w:pPr>
         <w:pStyle w:val="Heading1"/>
       </w:pPr>
@@ -3853,6 +4237,29 @@
       </w:r>
     </w:p>
     <w:p>
+      <w:r>
+        <w:rPr>
+          <w:b/>
+          <w:color w:val="4A7FC1"/>
+        </w:rPr>
+        <w:t xml:space="preserve">#23  </w:t>
+      </w:r>
+      <w:r>
+        <w:rPr>
+          <w:b/>
+          <w:i w:val="0"/>
+        </w:rPr>
+        <w:t xml:space="preserve">AURORA HAVEN  ·  ISSUE 01  ·  </w:t>
+      </w:r>
+      <w:r>
+        <w:rPr>
+          <w:b/>
+          <w:i w:val="0"/>
+        </w:rPr>
+        <w:t>THE CITY</w:t>
+      </w:r>
+    </w:p>
+    <w:p>
       <w:pPr>
         <w:pStyle w:val="Heading1"/>
       </w:pPr>
@@ -3934,37 +4341,147 @@
       </w:r>
       <w:r>
         <w:rPr>
+          <w:b/>
+          <w:i w:val="0"/>
+        </w:rPr>
+        <w:t>IN BRIEF</w:t>
+      </w:r>
+    </w:p>
+    <w:p>
+      <w:r>
+        <w:rPr>
+          <w:b/>
+          <w:color w:val="4A7FC1"/>
+        </w:rPr>
+        <w:t xml:space="preserve">#6  </w:t>
+      </w:r>
+      <w:r>
+        <w:rPr>
+          <w:b/>
+          <w:i w:val="0"/>
+        </w:rPr>
+        <w:t>THE PROBLEM</w:t>
+      </w:r>
+    </w:p>
+    <w:p>
+      <w:r>
+        <w:rPr>
+          <w:b/>
+          <w:color w:val="4A7FC1"/>
+        </w:rPr>
+        <w:t xml:space="preserve">#7  </w:t>
+      </w:r>
+      <w:r>
+        <w:rPr>
           <w:b w:val="0"/>
           <w:i w:val="0"/>
         </w:rPr>
-        <w:t>Our first signature district is the city’s own sun. Stage 1 takes deuterium from snowmelt water, so the fuel literally falls from the sky as snow. Stage 2 breeds tritium in a lithium blanket, so none is imported.</w:t>
-      </w:r>
-    </w:p>
-    <w:p>
+        <w:t>Two months of polar night at −45 °C. The city needs heat and power that never stop, even when supply flights cannot land.</w:t>
+      </w:r>
+    </w:p>
+    <w:p>
+      <w:r>
+        <w:rPr>
+          <w:b/>
+          <w:color w:val="4A7FC1"/>
+        </w:rPr>
+        <w:t xml:space="preserve">#8  </w:t>
+      </w:r>
+      <w:r>
+        <w:rPr>
+          <w:b/>
+          <w:i w:val="0"/>
+        </w:rPr>
+        <w:t>THE IDEA</w:t>
+      </w:r>
+    </w:p>
+    <w:p>
+      <w:r>
+        <w:rPr>
+          <w:b/>
+          <w:color w:val="4A7FC1"/>
+        </w:rPr>
+        <w:t xml:space="preserve">#9  </w:t>
+      </w:r>
       <w:r>
         <w:rPr>
           <w:b w:val="0"/>
           <w:i w:val="0"/>
         </w:rPr>
-        <w:t>Stage 3 is the tokamak, where superconducting magnets hold a 150-million-degree plasma that makes about 800 megawatts of heat. Stage 4 turns that heat into about 300 megawatts of electricity and sends 450 megawatts into the district-heating loop.</w:t>
-      </w:r>
-    </w:p>
-    <w:p>
+        <w:t>A compact tokamak inside the city burns about 170 g of fuel a day and gives 300 MW of electricity and 450 MW of heat.</w:t>
+      </w:r>
+    </w:p>
+    <w:p>
+      <w:r>
+        <w:rPr>
+          <w:b/>
+          <w:color w:val="4A7FC1"/>
+        </w:rPr>
+        <w:t xml:space="preserve">#10  </w:t>
+      </w:r>
+      <w:r>
+        <w:rPr>
+          <w:b/>
+          <w:i w:val="0"/>
+        </w:rPr>
+        <w:t>WHAT’S NEW</w:t>
+      </w:r>
+    </w:p>
+    <w:p>
+      <w:r>
+        <w:rPr>
+          <w:b/>
+          <w:color w:val="4A7FC1"/>
+        </w:rPr>
+        <w:t xml:space="preserve">#11  </w:t>
+      </w:r>
       <w:r>
         <w:rPr>
           <w:b w:val="0"/>
           <w:i w:val="0"/>
         </w:rPr>
-        <w:t>The reactor runs on about 170 grams of fuel a day. If anything fails, the plasma simply goes out in a split second, so it cannot melt down or run away.</w:t>
-      </w:r>
-    </w:p>
-    <w:p>
-      <w:r>
-        <w:rPr>
-          <w:b/>
-          <w:color w:val="4A7FC1"/>
-        </w:rPr>
-        <w:t xml:space="preserve">#6  </w:t>
+        <w:t>No fusion plant sells power yet (page 13). We build a whole city around one, with fuel from snowmelt and tritium bred on site.</w:t>
+      </w:r>
+    </w:p>
+    <w:p>
+      <w:r>
+        <w:rPr>
+          <w:b/>
+          <w:color w:val="4A7FC1"/>
+        </w:rPr>
+        <w:t xml:space="preserve">#12  </w:t>
+      </w:r>
+      <w:r>
+        <w:rPr>
+          <w:b/>
+          <w:i w:val="0"/>
+        </w:rPr>
+        <w:t>THE IMPACT</w:t>
+      </w:r>
+    </w:p>
+    <w:p>
+      <w:r>
+        <w:rPr>
+          <w:b/>
+          <w:color w:val="4A7FC1"/>
+        </w:rPr>
+        <w:t xml:space="preserve">#13  </w:t>
+      </w:r>
+      <w:r>
+        <w:rPr>
+          <w:b w:val="0"/>
+          <w:i w:val="0"/>
+        </w:rPr>
+        <w:t>No fuel to ship in and no CO₂. If anything fails, the plasma simply goes out, so it cannot melt down.</w:t>
+      </w:r>
+    </w:p>
+    <w:p>
+      <w:r>
+        <w:rPr>
+          <w:b/>
+          <w:color w:val="4A7FC1"/>
+        </w:rPr>
+        <w:t xml:space="preserve">#14  </w:t>
       </w:r>
       <w:r>
         <w:rPr>
@@ -3972,6 +4489,29 @@
           <w:i w:val="0"/>
         </w:rPr>
         <w:t>12</w:t>
+      </w:r>
+    </w:p>
+    <w:p>
+      <w:r>
+        <w:rPr>
+          <w:b/>
+          <w:color w:val="4A7FC1"/>
+        </w:rPr>
+        <w:t xml:space="preserve">#15  </w:t>
+      </w:r>
+      <w:r>
+        <w:rPr>
+          <w:b/>
+          <w:i w:val="0"/>
+        </w:rPr>
+        <w:t xml:space="preserve">AURORA HAVEN  ·  ISSUE 01  ·  </w:t>
+      </w:r>
+      <w:r>
+        <w:rPr>
+          <w:b/>
+          <w:i w:val="0"/>
+        </w:rPr>
+        <w:t>THE BREAKTHROUGHS</w:t>
       </w:r>
     </w:p>
     <w:p>
@@ -4095,6 +4635,29 @@
       </w:r>
     </w:p>
     <w:p>
+      <w:r>
+        <w:rPr>
+          <w:b/>
+          <w:color w:val="4A7FC1"/>
+        </w:rPr>
+        <w:t xml:space="preserve">#8  </w:t>
+      </w:r>
+      <w:r>
+        <w:rPr>
+          <w:b/>
+          <w:i w:val="0"/>
+        </w:rPr>
+        <w:t xml:space="preserve">AURORA HAVEN  ·  ISSUE 01  ·  </w:t>
+      </w:r>
+      <w:r>
+        <w:rPr>
+          <w:b/>
+          <w:i w:val="0"/>
+        </w:rPr>
+        <w:t>THE BREAKTHROUGHS</w:t>
+      </w:r>
+    </w:p>
+    <w:p>
       <w:pPr>
         <w:pStyle w:val="Heading1"/>
       </w:pPr>
@@ -4558,6 +5121,29 @@
       </w:r>
     </w:p>
     <w:p>
+      <w:r>
+        <w:rPr>
+          <w:b/>
+          <w:color w:val="4A7FC1"/>
+        </w:rPr>
+        <w:t xml:space="preserve">#25  </w:t>
+      </w:r>
+      <w:r>
+        <w:rPr>
+          <w:b/>
+          <w:i w:val="0"/>
+        </w:rPr>
+        <w:t xml:space="preserve">AURORA HAVEN  ·  ISSUE 01  ·  </w:t>
+      </w:r>
+      <w:r>
+        <w:rPr>
+          <w:b/>
+          <w:i w:val="0"/>
+        </w:rPr>
+        <w:t>THE BREAKTHROUGHS</w:t>
+      </w:r>
+    </w:p>
+    <w:p>
       <w:pPr>
         <w:pStyle w:val="Heading1"/>
       </w:pPr>
@@ -4640,9 +5226,9 @@
       <w:r>
         <w:rPr>
           <w:b w:val="0"/>
-          <w:i w:val="0"/>
-        </w:rPr>
-        <w:t>What do you eat where nothing grows? Stage 1 melts about 3,000 tonnes of clean tundra snow a day with spare heat from the fusion station, so the snow does the job of a cooling tower. Stage 2 turns the meltwater into all the city’s drinking water.</w:t>
+          <w:i/>
+        </w:rPr>
+        <w:t>The six Bioreactor Silos in the low sun.</w:t>
       </w:r>
     </w:p>
     <w:p>
@@ -4655,35 +5241,147 @@
       </w:r>
       <w:r>
         <w:rPr>
+          <w:b/>
+          <w:i w:val="0"/>
+        </w:rPr>
+        <w:t>IN BRIEF</w:t>
+      </w:r>
+    </w:p>
+    <w:p>
+      <w:r>
+        <w:rPr>
+          <w:b/>
+          <w:color w:val="4A7FC1"/>
+        </w:rPr>
+        <w:t xml:space="preserve">#7  </w:t>
+      </w:r>
+      <w:r>
+        <w:rPr>
+          <w:b/>
+          <w:i w:val="0"/>
+        </w:rPr>
+        <w:t>THE PROBLEM</w:t>
+      </w:r>
+    </w:p>
+    <w:p>
+      <w:r>
+        <w:rPr>
+          <w:b/>
+          <w:color w:val="4A7FC1"/>
+        </w:rPr>
+        <w:t xml:space="preserve">#8  </w:t>
+      </w:r>
+      <w:r>
+        <w:rPr>
           <w:b w:val="0"/>
           <w:i w:val="0"/>
         </w:rPr>
-        <w:t>Stage 3 splits water into hydrogen and oxygen and captures CO₂ from the air; Stage 4 turns them into starch and fats. In Stage 5, microbes in six silos make about 2.5 tonnes of protein flour a day. Stage 6 cooks bread, noodles and drinks for the city.</w:t>
-      </w:r>
-    </w:p>
-    <w:p>
-      <w:r>
-        <w:rPr>
-          <w:b/>
-          <w:color w:val="4A7FC1"/>
-        </w:rPr>
-        <w:t xml:space="preserve">#7  </w:t>
+        <w:t>Almost nothing grows at −45 °C, and in deep winter food can only arrive by air.</w:t>
+      </w:r>
+    </w:p>
+    <w:p>
+      <w:r>
+        <w:rPr>
+          <w:b/>
+          <w:color w:val="4A7FC1"/>
+        </w:rPr>
+        <w:t xml:space="preserve">#9  </w:t>
+      </w:r>
+      <w:r>
+        <w:rPr>
+          <w:b/>
+          <w:i w:val="0"/>
+        </w:rPr>
+        <w:t>THE IDEA</w:t>
+      </w:r>
+    </w:p>
+    <w:p>
+      <w:r>
+        <w:rPr>
+          <w:b/>
+          <w:color w:val="4A7FC1"/>
+        </w:rPr>
+        <w:t xml:space="preserve">#10  </w:t>
       </w:r>
       <w:r>
         <w:rPr>
           <w:b w:val="0"/>
-          <w:i/>
-        </w:rPr>
-        <w:t>The six Bioreactor Silos in the low sun.</w:t>
-      </w:r>
-    </w:p>
-    <w:p>
-      <w:r>
-        <w:rPr>
-          <w:b/>
-          <w:color w:val="4A7FC1"/>
-        </w:rPr>
-        <w:t xml:space="preserve">#8  </w:t>
+          <w:i w:val="0"/>
+        </w:rPr>
+        <w:t>Spare fusion heat melts 3,000 tonnes of snow a day for drinking water; microbes turn water and CO₂ into about 2.5 tonnes of protein a day.</w:t>
+      </w:r>
+    </w:p>
+    <w:p>
+      <w:r>
+        <w:rPr>
+          <w:b/>
+          <w:color w:val="4A7FC1"/>
+        </w:rPr>
+        <w:t xml:space="preserve">#11  </w:t>
+      </w:r>
+      <w:r>
+        <w:rPr>
+          <w:b/>
+          <w:i w:val="0"/>
+        </w:rPr>
+        <w:t>WHAT’S NEW</w:t>
+      </w:r>
+    </w:p>
+    <w:p>
+      <w:r>
+        <w:rPr>
+          <w:b/>
+          <w:color w:val="4A7FC1"/>
+        </w:rPr>
+        <w:t xml:space="preserve">#12  </w:t>
+      </w:r>
+      <w:r>
+        <w:rPr>
+          <w:b w:val="0"/>
+          <w:i w:val="0"/>
+        </w:rPr>
+        <w:t>Each step exists today, but apart (page 16). We link them in one plant that also cools the fusion station.</w:t>
+      </w:r>
+    </w:p>
+    <w:p>
+      <w:r>
+        <w:rPr>
+          <w:b/>
+          <w:color w:val="4A7FC1"/>
+        </w:rPr>
+        <w:t xml:space="preserve">#13  </w:t>
+      </w:r>
+      <w:r>
+        <w:rPr>
+          <w:b/>
+          <w:i w:val="0"/>
+        </w:rPr>
+        <w:t>THE IMPACT</w:t>
+      </w:r>
+    </w:p>
+    <w:p>
+      <w:r>
+        <w:rPr>
+          <w:b/>
+          <w:color w:val="4A7FC1"/>
+        </w:rPr>
+        <w:t xml:space="preserve">#14  </w:t>
+      </w:r>
+      <w:r>
+        <w:rPr>
+          <w:b w:val="0"/>
+          <w:i w:val="0"/>
+        </w:rPr>
+        <w:t>Bread, noodles and drinks made in the city all year, with no farmland and fewer supply flights.</w:t>
+      </w:r>
+    </w:p>
+    <w:p>
+      <w:r>
+        <w:rPr>
+          <w:b/>
+          <w:color w:val="4A7FC1"/>
+        </w:rPr>
+        <w:t xml:space="preserve">#15  </w:t>
       </w:r>
       <w:r>
         <w:rPr>
@@ -4691,6 +5389,29 @@
           <w:i w:val="0"/>
         </w:rPr>
         <w:t>15</w:t>
+      </w:r>
+    </w:p>
+    <w:p>
+      <w:r>
+        <w:rPr>
+          <w:b/>
+          <w:color w:val="4A7FC1"/>
+        </w:rPr>
+        <w:t xml:space="preserve">#16  </w:t>
+      </w:r>
+      <w:r>
+        <w:rPr>
+          <w:b/>
+          <w:i w:val="0"/>
+        </w:rPr>
+        <w:t xml:space="preserve">AURORA HAVEN  ·  ISSUE 01  ·  </w:t>
+      </w:r>
+      <w:r>
+        <w:rPr>
+          <w:b/>
+          <w:i w:val="0"/>
+        </w:rPr>
+        <w:t>THE BREAKTHROUGHS</w:t>
       </w:r>
     </w:p>
     <w:p>
@@ -5134,6 +5855,29 @@
       </w:r>
     </w:p>
     <w:p>
+      <w:r>
+        <w:rPr>
+          <w:b/>
+          <w:color w:val="4A7FC1"/>
+        </w:rPr>
+        <w:t xml:space="preserve">#28  </w:t>
+      </w:r>
+      <w:r>
+        <w:rPr>
+          <w:b/>
+          <w:i w:val="0"/>
+        </w:rPr>
+        <w:t xml:space="preserve">AURORA HAVEN  ·  ISSUE 01  ·  </w:t>
+      </w:r>
+      <w:r>
+        <w:rPr>
+          <w:b/>
+          <w:i w:val="0"/>
+        </w:rPr>
+        <w:t>THE BREAKTHROUGHS</w:t>
+      </w:r>
+    </w:p>
+    <w:p>
       <w:pPr>
         <w:pStyle w:val="Heading1"/>
       </w:pPr>
@@ -5225,9 +5969,9 @@
       <w:r>
         <w:rPr>
           <w:b w:val="0"/>
-          <w:i w:val="0"/>
-        </w:rPr>
-        <w:t>Guests enter through the North Portal, where a thermal revolving door and an air curtain keep the −45 °C air out. The peak’s deep snow works as a blanket that holds in the geothermal heat, and sensors release the snow load safely before an avalanche can build.</w:t>
+          <w:i/>
+        </w:rPr>
+        <w:t>The four spa levels step out of the north face, crowned by the glass Aurora Eye.</w:t>
       </w:r>
     </w:p>
     <w:p>
@@ -5240,35 +5984,147 @@
       </w:r>
       <w:r>
         <w:rPr>
+          <w:b/>
+          <w:i w:val="0"/>
+        </w:rPr>
+        <w:t>IN BRIEF</w:t>
+      </w:r>
+    </w:p>
+    <w:p>
+      <w:r>
+        <w:rPr>
+          <w:b/>
+          <w:color w:val="4A7FC1"/>
+        </w:rPr>
+        <w:t xml:space="preserve">#7  </w:t>
+      </w:r>
+      <w:r>
+        <w:rPr>
+          <w:b/>
+          <w:i w:val="0"/>
+        </w:rPr>
+        <w:t>THE PROBLEM</w:t>
+      </w:r>
+    </w:p>
+    <w:p>
+      <w:r>
+        <w:rPr>
+          <w:b/>
+          <w:color w:val="4A7FC1"/>
+        </w:rPr>
+        <w:t xml:space="preserve">#8  </w:t>
+      </w:r>
+      <w:r>
+        <w:rPr>
           <w:b w:val="0"/>
           <w:i w:val="0"/>
         </w:rPr>
-        <w:t>Outside is the Aurora Lagoon, a 38-degree mineral pool for bathing under the northern lights. The spa fights the winter blues, brings tourists and income, and in an emergency can shelter up to 1,000 people.</w:t>
-      </w:r>
-    </w:p>
-    <w:p>
-      <w:r>
-        <w:rPr>
-          <w:b/>
-          <w:color w:val="4A7FC1"/>
-        </w:rPr>
-        <w:t xml:space="preserve">#7  </w:t>
+        <w:t>Months of darkness bring winter blues, and the city needs a warm place to meet and to shelter in a disaster.</w:t>
+      </w:r>
+    </w:p>
+    <w:p>
+      <w:r>
+        <w:rPr>
+          <w:b/>
+          <w:color w:val="4A7FC1"/>
+        </w:rPr>
+        <w:t xml:space="preserve">#9  </w:t>
+      </w:r>
+      <w:r>
+        <w:rPr>
+          <w:b/>
+          <w:i w:val="0"/>
+        </w:rPr>
+        <w:t>THE IDEA</w:t>
+      </w:r>
+    </w:p>
+    <w:p>
+      <w:r>
+        <w:rPr>
+          <w:b/>
+          <w:color w:val="4A7FC1"/>
+        </w:rPr>
+        <w:t xml:space="preserve">#10  </w:t>
       </w:r>
       <w:r>
         <w:rPr>
           <w:b w:val="0"/>
-          <w:i/>
-        </w:rPr>
-        <w:t>The four spa levels step out of the north face; the forecourt is warmed by the spa’s used hot water, so guests walk ice-free from the shuttle to the door.</w:t>
-      </w:r>
-    </w:p>
-    <w:p>
-      <w:r>
-        <w:rPr>
-          <w:b/>
-          <w:color w:val="4A7FC1"/>
-        </w:rPr>
-        <w:t xml:space="preserve">#8  </w:t>
+          <w:i w:val="0"/>
+        </w:rPr>
+        <w:t>The mountain is the building: a 35-metre snow peak wraps four spa levels, kept at 28 °C by a geothermal spring.</w:t>
+      </w:r>
+    </w:p>
+    <w:p>
+      <w:r>
+        <w:rPr>
+          <w:b/>
+          <w:color w:val="4A7FC1"/>
+        </w:rPr>
+        <w:t xml:space="preserve">#11  </w:t>
+      </w:r>
+      <w:r>
+        <w:rPr>
+          <w:b/>
+          <w:i w:val="0"/>
+        </w:rPr>
+        <w:t>WHAT’S NEW</w:t>
+      </w:r>
+    </w:p>
+    <w:p>
+      <w:r>
+        <w:rPr>
+          <w:b/>
+          <w:color w:val="4A7FC1"/>
+        </w:rPr>
+        <w:t xml:space="preserve">#12  </w:t>
+      </w:r>
+      <w:r>
+        <w:rPr>
+          <w:b w:val="0"/>
+          <w:i w:val="0"/>
+        </w:rPr>
+        <w:t>Spas like Iceland’s Blue Lagoon use geothermal water (page 19). We turn a whole snow peak into an insulated leisure world.</w:t>
+      </w:r>
+    </w:p>
+    <w:p>
+      <w:r>
+        <w:rPr>
+          <w:b/>
+          <w:color w:val="4A7FC1"/>
+        </w:rPr>
+        <w:t xml:space="preserve">#13  </w:t>
+      </w:r>
+      <w:r>
+        <w:rPr>
+          <w:b/>
+          <w:i w:val="0"/>
+        </w:rPr>
+        <w:t>THE IMPACT</w:t>
+      </w:r>
+    </w:p>
+    <w:p>
+      <w:r>
+        <w:rPr>
+          <w:b/>
+          <w:color w:val="4A7FC1"/>
+        </w:rPr>
+        <w:t xml:space="preserve">#14  </w:t>
+      </w:r>
+      <w:r>
+        <w:rPr>
+          <w:b w:val="0"/>
+          <w:i w:val="0"/>
+        </w:rPr>
+        <w:t>Rest and health for residents, tourists and income for the city, and shelter for up to 1,000 people.</w:t>
+      </w:r>
+    </w:p>
+    <w:p>
+      <w:r>
+        <w:rPr>
+          <w:b/>
+          <w:color w:val="4A7FC1"/>
+        </w:rPr>
+        <w:t xml:space="preserve">#15  </w:t>
       </w:r>
       <w:r>
         <w:rPr>
@@ -5276,6 +6132,29 @@
           <w:i w:val="0"/>
         </w:rPr>
         <w:t>17</w:t>
+      </w:r>
+    </w:p>
+    <w:p>
+      <w:r>
+        <w:rPr>
+          <w:b/>
+          <w:color w:val="4A7FC1"/>
+        </w:rPr>
+        <w:t xml:space="preserve">#16  </w:t>
+      </w:r>
+      <w:r>
+        <w:rPr>
+          <w:b/>
+          <w:i w:val="0"/>
+        </w:rPr>
+        <w:t xml:space="preserve">AURORA HAVEN  ·  ISSUE 01  ·  </w:t>
+      </w:r>
+      <w:r>
+        <w:rPr>
+          <w:b/>
+          <w:i w:val="0"/>
+        </w:rPr>
+        <w:t>THE BREAKTHROUGHS</w:t>
       </w:r>
     </w:p>
     <w:p>
@@ -5367,6 +6246,29 @@
       </w:r>
     </w:p>
     <w:p>
+      <w:r>
+        <w:rPr>
+          <w:b/>
+          <w:color w:val="4A7FC1"/>
+        </w:rPr>
+        <w:t xml:space="preserve">#6  </w:t>
+      </w:r>
+      <w:r>
+        <w:rPr>
+          <w:b/>
+          <w:i w:val="0"/>
+        </w:rPr>
+        <w:t xml:space="preserve">AURORA HAVEN  ·  ISSUE 01  ·  </w:t>
+      </w:r>
+      <w:r>
+        <w:rPr>
+          <w:b/>
+          <w:i w:val="0"/>
+        </w:rPr>
+        <w:t>THE BREAKTHROUGHS</w:t>
+      </w:r>
+    </w:p>
+    <w:p>
       <w:pPr>
         <w:pStyle w:val="Heading1"/>
       </w:pPr>
@@ -5487,6 +6389,29 @@
       </w:r>
     </w:p>
     <w:p>
+      <w:r>
+        <w:rPr>
+          <w:b/>
+          <w:color w:val="4A7FC1"/>
+        </w:rPr>
+        <w:t xml:space="preserve">#8  </w:t>
+      </w:r>
+      <w:r>
+        <w:rPr>
+          <w:b/>
+          <w:i w:val="0"/>
+        </w:rPr>
+        <w:t xml:space="preserve">AURORA HAVEN  ·  ISSUE 01  ·  </w:t>
+      </w:r>
+      <w:r>
+        <w:rPr>
+          <w:b/>
+          <w:i w:val="0"/>
+        </w:rPr>
+        <w:t>THE BREAKTHROUGHS</w:t>
+      </w:r>
+    </w:p>
+    <w:p>
       <w:pPr>
         <w:pStyle w:val="Heading1"/>
       </w:pPr>
@@ -5762,6 +6687,29 @@
       </w:r>
     </w:p>
     <w:p>
+      <w:r>
+        <w:rPr>
+          <w:b/>
+          <w:color w:val="4A7FC1"/>
+        </w:rPr>
+        <w:t xml:space="preserve">#15  </w:t>
+      </w:r>
+      <w:r>
+        <w:rPr>
+          <w:b/>
+          <w:i w:val="0"/>
+        </w:rPr>
+        <w:t xml:space="preserve">AURORA HAVEN  ·  ISSUE 01  ·  </w:t>
+      </w:r>
+      <w:r>
+        <w:rPr>
+          <w:b/>
+          <w:i w:val="0"/>
+        </w:rPr>
+        <w:t>THE BREAKTHROUGHS</w:t>
+      </w:r>
+    </w:p>
+    <w:p>
       <w:pPr>
         <w:pStyle w:val="Heading1"/>
       </w:pPr>
@@ -6081,6 +7029,29 @@
       </w:r>
     </w:p>
     <w:p>
+      <w:r>
+        <w:rPr>
+          <w:b/>
+          <w:color w:val="4A7FC1"/>
+        </w:rPr>
+        <w:t xml:space="preserve">#16  </w:t>
+      </w:r>
+      <w:r>
+        <w:rPr>
+          <w:b/>
+          <w:i w:val="0"/>
+        </w:rPr>
+        <w:t xml:space="preserve">AURORA HAVEN  ·  ISSUE 01  ·  </w:t>
+      </w:r>
+      <w:r>
+        <w:rPr>
+          <w:b/>
+          <w:i w:val="0"/>
+        </w:rPr>
+        <w:t>THE BREAKTHROUGHS</w:t>
+      </w:r>
+    </w:p>
+    <w:p>
       <w:pPr>
         <w:pStyle w:val="Heading1"/>
       </w:pPr>
@@ -6578,6 +7549,29 @@
       </w:r>
     </w:p>
     <w:p>
+      <w:r>
+        <w:rPr>
+          <w:b/>
+          <w:color w:val="4A7FC1"/>
+        </w:rPr>
+        <w:t xml:space="preserve">#31  </w:t>
+      </w:r>
+      <w:r>
+        <w:rPr>
+          <w:b/>
+          <w:i w:val="0"/>
+        </w:rPr>
+        <w:t xml:space="preserve">AURORA HAVEN  ·  ISSUE 01  ·  </w:t>
+      </w:r>
+      <w:r>
+        <w:rPr>
+          <w:b/>
+          <w:i w:val="0"/>
+        </w:rPr>
+        <w:t>THE BREAKTHROUGHS</w:t>
+      </w:r>
+    </w:p>
+    <w:p>
       <w:pPr>
         <w:pStyle w:val="Heading1"/>
       </w:pPr>
@@ -6890,6 +7884,29 @@
       </w:r>
     </w:p>
     <w:p>
+      <w:r>
+        <w:rPr>
+          <w:b/>
+          <w:color w:val="4A7FC1"/>
+        </w:rPr>
+        <w:t xml:space="preserve">#20  </w:t>
+      </w:r>
+      <w:r>
+        <w:rPr>
+          <w:b/>
+          <w:i w:val="0"/>
+        </w:rPr>
+        <w:t xml:space="preserve">AURORA HAVEN  ·  ISSUE 01  ·  </w:t>
+      </w:r>
+      <w:r>
+        <w:rPr>
+          <w:b/>
+          <w:i w:val="0"/>
+        </w:rPr>
+        <w:t>SYSTEMS &amp; LIFE</w:t>
+      </w:r>
+    </w:p>
+    <w:p>
       <w:pPr>
         <w:pStyle w:val="Heading1"/>
       </w:pPr>
@@ -7378,6 +8395,29 @@
       </w:r>
     </w:p>
     <w:p>
+      <w:r>
+        <w:rPr>
+          <w:b/>
+          <w:color w:val="4A7FC1"/>
+        </w:rPr>
+        <w:t xml:space="preserve">#31  </w:t>
+      </w:r>
+      <w:r>
+        <w:rPr>
+          <w:b/>
+          <w:i w:val="0"/>
+        </w:rPr>
+        <w:t xml:space="preserve">AURORA HAVEN  ·  ISSUE 01  ·  </w:t>
+      </w:r>
+      <w:r>
+        <w:rPr>
+          <w:b/>
+          <w:i w:val="0"/>
+        </w:rPr>
+        <w:t>SYSTEMS &amp; LIFE</w:t>
+      </w:r>
+    </w:p>
+    <w:p>
       <w:pPr>
         <w:pStyle w:val="Heading1"/>
       </w:pPr>
@@ -7610,6 +8650,29 @@
       </w:r>
     </w:p>
     <w:p>
+      <w:r>
+        <w:rPr>
+          <w:b/>
+          <w:color w:val="4A7FC1"/>
+        </w:rPr>
+        <w:t xml:space="preserve">#15  </w:t>
+      </w:r>
+      <w:r>
+        <w:rPr>
+          <w:b/>
+          <w:i w:val="0"/>
+        </w:rPr>
+        <w:t xml:space="preserve">AURORA HAVEN  ·  ISSUE 01  ·  </w:t>
+      </w:r>
+      <w:r>
+        <w:rPr>
+          <w:b/>
+          <w:i w:val="0"/>
+        </w:rPr>
+        <w:t>SYSTEMS &amp; LIFE</w:t>
+      </w:r>
+    </w:p>
+    <w:p>
       <w:pPr>
         <w:pStyle w:val="Heading1"/>
       </w:pPr>
@@ -8036,6 +9099,29 @@
       </w:r>
     </w:p>
     <w:p>
+      <w:r>
+        <w:rPr>
+          <w:b/>
+          <w:color w:val="4A7FC1"/>
+        </w:rPr>
+        <w:t xml:space="preserve">#26  </w:t>
+      </w:r>
+      <w:r>
+        <w:rPr>
+          <w:b/>
+          <w:i w:val="0"/>
+        </w:rPr>
+        <w:t xml:space="preserve">AURORA HAVEN  ·  ISSUE 01  ·  </w:t>
+      </w:r>
+      <w:r>
+        <w:rPr>
+          <w:b/>
+          <w:i w:val="0"/>
+        </w:rPr>
+        <w:t>SYSTEMS &amp; LIFE</w:t>
+      </w:r>
+    </w:p>
+    <w:p>
       <w:pPr>
         <w:pStyle w:val="Heading1"/>
       </w:pPr>
@@ -8143,7 +9229,7 @@
           <w:b w:val="0"/>
           <w:i w:val="0"/>
         </w:rPr>
-        <w:t>Snow-laden trees on the eastern and western edges give snow buntings, ptarmigans, arctic foxes and hares cover between the open tundra and the parks. Roads beside them have dimmed lights and wildlife underpasses.</w:t>
+        <w:t>Snowy tree belts on the east and west edges link the tundra to the parks for foxes, hares and ptarmigans; the roads beside them have dim lights and underpasses.</w:t>
       </w:r>
     </w:p>
     <w:p>
@@ -8159,7 +9245,7 @@
           <w:b w:val="0"/>
           <w:i w:val="0"/>
         </w:rPr>
-        <w:t>Park fences have open rails, so drifting snow blows through, and gaps at ground level, so foxes and hares pass freely.</w:t>
+        <w:t>Open rails let drifting snow blow through, and gaps at ground level let foxes and hares pass.</w:t>
       </w:r>
     </w:p>
     <w:p>
@@ -8175,7 +9261,7 @@
           <w:b w:val="0"/>
           <w:i w:val="0"/>
         </w:rPr>
-        <w:t>The eco-tour herd is cared for by herders who follow Sámi traditions. Rides last only a few hours a day, and GPS collars help find animals grazing on the tundra.</w:t>
+        <w:t>Herders who follow Sámi traditions care for the eco-tour herd; rides are short, and GPS collars track the animals on the tundra.</w:t>
       </w:r>
     </w:p>
     <w:p>
@@ -8191,7 +9277,7 @@
           <w:b w:val="0"/>
           <w:i w:val="0"/>
         </w:rPr>
-        <w:t>Fibre-optic sensors in the air base fence alert a wildlife team when a bear comes close, so people and bears stay apart safely.</w:t>
+        <w:t>Fibre-optic sensors in the air base fence call a wildlife team when a bear comes close.</w:t>
       </w:r>
     </w:p>
     <w:p>
@@ -8230,7 +9316,7 @@
           <w:b w:val="0"/>
           <w:i w:val="0"/>
         </w:rPr>
-        <w:t>Belts of snow spruces and arctic pines trap drifting snow before it reaches the streets; the clean snow is collected for the food plant.</w:t>
+        <w:t>Belts of spruce and pine trap drifting snow before it reaches the streets; the clean snow goes to the food plant.</w:t>
       </w:r>
     </w:p>
     <w:p>
@@ -8246,7 +9332,7 @@
           <w:b w:val="0"/>
           <w:i w:val="0"/>
         </w:rPr>
-        <w:t>Snow lindens line Liberty Mall, and dwarf pines in heated planters on the Aurora 81 Sky Garden give birds a stepping stone across the city.</w:t>
+        <w:t>Snow lindens on Liberty Mall and heated planters on the Aurora 81 Sky Garden give birds stepping stones across the city.</w:t>
       </w:r>
     </w:p>
     <w:p>
@@ -8262,7 +9348,7 @@
           <w:b w:val="0"/>
           <w:i w:val="0"/>
         </w:rPr>
-        <w:t>In the Evergreen Aquaponics Dome, Arctic char and rainbow trout feed beds of lettuce, herbs and strawberries; the loop loses under 2% of its water a day.</w:t>
+        <w:t>In the Evergreen Aquaponics Dome, Arctic char and trout feed lettuce, herbs and strawberries; the loop loses under 2% of its water a day.</w:t>
       </w:r>
     </w:p>
     <w:p>
@@ -8278,7 +9364,7 @@
           <w:b w:val="0"/>
           <w:i w:val="0"/>
         </w:rPr>
-        <w:t>Rock gardens and boulders shelter ptarmigans and hares; nest boxes and a camera let schoolchildren count visitors with the Polar Climate &amp; Ice Research Institute.</w:t>
+        <w:t>Rock gardens shelter ptarmigans and hares, and nest-box cameras let schoolchildren count them.</w:t>
       </w:r>
     </w:p>
     <w:p>
@@ -8318,6 +9404,29 @@
           <w:i w:val="0"/>
         </w:rPr>
         <w:t>27</w:t>
+      </w:r>
+    </w:p>
+    <w:p>
+      <w:r>
+        <w:rPr>
+          <w:b/>
+          <w:color w:val="4A7FC1"/>
+        </w:rPr>
+        <w:t xml:space="preserve">#11  </w:t>
+      </w:r>
+      <w:r>
+        <w:rPr>
+          <w:b/>
+          <w:i w:val="0"/>
+        </w:rPr>
+        <w:t xml:space="preserve">AURORA HAVEN  ·  ISSUE 01  ·  </w:t>
+      </w:r>
+      <w:r>
+        <w:rPr>
+          <w:b/>
+          <w:i w:val="0"/>
+        </w:rPr>
+        <w:t>SYSTEMS &amp; LIFE</w:t>
       </w:r>
     </w:p>
     <w:p>
@@ -8389,7 +9498,7 @@
           <w:b w:val="0"/>
           <w:i w:val="0"/>
         </w:rPr>
-        <w:t>Transport in Aurora Haven is electric and built for the cold. The heart of it is the metro: the north–south Aurora Line and the deep east–west Glacier Line meet at the Central Interchange Station under Liberty Mall. The driverless four-car trains run underground, so blizzards never stop them.</w:t>
+        <w:t>Everything that moves in Aurora Haven is electric and built for the cold. Two driverless metro lines, the north–south Aurora Line and the east–west Glacier Line, run deep underground and meet under Liberty Mall, so blizzards never stop them.</w:t>
       </w:r>
     </w:p>
     <w:p>
@@ -8398,7 +9507,7 @@
           <w:b w:val="0"/>
           <w:i w:val="0"/>
         </w:rPr>
-        <w:t>On the streets there are electric trams, buses and shared robotaxis, and people wait in heated bus shelters. The roads are warmed from below, so no salt is needed, as in Reykjavík, where water returning from home heating melts the snow under streets [18].</w:t>
+        <w:t>Above ground, electric trams, buses and shared robotaxis stop at heated shelters. Streets are warmed from below, as in Reykjavík, where water returning from home heating melts the snow [18].</w:t>
       </w:r>
     </w:p>
     <w:p>
@@ -8617,7 +9726,7 @@
           <w:b/>
           <w:i w:val="0"/>
         </w:rPr>
-        <w:t>3 min</w:t>
+        <w:t>28</w:t>
       </w:r>
     </w:p>
     <w:p>
@@ -8630,90 +9739,17 @@
       </w:r>
       <w:r>
         <w:rPr>
-          <w:b w:val="0"/>
-          <w:i w:val="0"/>
-        </w:rPr>
-        <w:t>between trains at rush hour</w:t>
-      </w:r>
-    </w:p>
-    <w:p>
-      <w:r>
-        <w:rPr>
-          <w:b/>
-          <w:color w:val="4A7FC1"/>
-        </w:rPr>
-        <w:t xml:space="preserve">#18  </w:t>
-      </w:r>
-      <w:r>
-        <w:rPr>
-          <w:b/>
-          <w:i w:val="0"/>
-        </w:rPr>
-        <w:t>30%</w:t>
-      </w:r>
-    </w:p>
-    <w:p>
-      <w:r>
-        <w:rPr>
-          <w:b/>
-          <w:color w:val="4A7FC1"/>
-        </w:rPr>
-        <w:t xml:space="preserve">#19  </w:t>
-      </w:r>
-      <w:r>
-        <w:rPr>
-          <w:b w:val="0"/>
-          <w:i w:val="0"/>
-        </w:rPr>
-        <w:t>of train energy returned by braking</w:t>
-      </w:r>
-    </w:p>
-    <w:p>
-      <w:r>
-        <w:rPr>
-          <w:b/>
-          <w:color w:val="4A7FC1"/>
-        </w:rPr>
-        <w:t xml:space="preserve">#20  </w:t>
-      </w:r>
-      <w:r>
-        <w:rPr>
-          <w:b/>
-          <w:i w:val="0"/>
-        </w:rPr>
-        <w:t>2,800 m</w:t>
-      </w:r>
-    </w:p>
-    <w:p>
-      <w:r>
-        <w:rPr>
-          <w:b/>
-          <w:color w:val="4A7FC1"/>
-        </w:rPr>
-        <w:t xml:space="preserve">#21  </w:t>
-      </w:r>
-      <w:r>
-        <w:rPr>
-          <w:b w:val="0"/>
-          <w:i w:val="0"/>
-        </w:rPr>
-        <w:t>heated airport runway</w:t>
-      </w:r>
-    </w:p>
-    <w:p>
-      <w:r>
-        <w:rPr>
-          <w:b/>
-          <w:color w:val="4A7FC1"/>
-        </w:rPr>
-        <w:t xml:space="preserve">#22  </w:t>
-      </w:r>
-      <w:r>
-        <w:rPr>
-          <w:b/>
-          <w:i w:val="0"/>
-        </w:rPr>
-        <w:t>28</w:t>
+          <w:b/>
+          <w:i w:val="0"/>
+        </w:rPr>
+        <w:t xml:space="preserve">AURORA HAVEN  ·  ISSUE 01  ·  </w:t>
+      </w:r>
+      <w:r>
+        <w:rPr>
+          <w:b/>
+          <w:i w:val="0"/>
+        </w:rPr>
+        <w:t>SYSTEMS &amp; LIFE</w:t>
       </w:r>
     </w:p>
     <w:p>
@@ -8885,6 +9921,29 @@
       </w:r>
     </w:p>
     <w:p>
+      <w:r>
+        <w:rPr>
+          <w:b/>
+          <w:color w:val="4A7FC1"/>
+        </w:rPr>
+        <w:t xml:space="preserve">#11  </w:t>
+      </w:r>
+      <w:r>
+        <w:rPr>
+          <w:b/>
+          <w:i w:val="0"/>
+        </w:rPr>
+        <w:t xml:space="preserve">AURORA HAVEN  ·  ISSUE 01  ·  </w:t>
+      </w:r>
+      <w:r>
+        <w:rPr>
+          <w:b/>
+          <w:i w:val="0"/>
+        </w:rPr>
+        <w:t>SYSTEMS &amp; LIFE</w:t>
+      </w:r>
+    </w:p>
+    <w:p>
       <w:pPr>
         <w:pStyle w:val="Heading1"/>
       </w:pPr>
@@ -9103,6 +10162,29 @@
       </w:r>
     </w:p>
     <w:p>
+      <w:r>
+        <w:rPr>
+          <w:b/>
+          <w:color w:val="4A7FC1"/>
+        </w:rPr>
+        <w:t xml:space="preserve">#13  </w:t>
+      </w:r>
+      <w:r>
+        <w:rPr>
+          <w:b/>
+          <w:i w:val="0"/>
+        </w:rPr>
+        <w:t xml:space="preserve">AURORA HAVEN  ·  ISSUE 01  ·  </w:t>
+      </w:r>
+      <w:r>
+        <w:rPr>
+          <w:b/>
+          <w:i w:val="0"/>
+        </w:rPr>
+        <w:t>SYSTEMS &amp; LIFE</w:t>
+      </w:r>
+    </w:p>
+    <w:p>
       <w:pPr>
         <w:pStyle w:val="Heading1"/>
       </w:pPr>
@@ -9708,6 +10790,29 @@
       </w:r>
     </w:p>
     <w:p>
+      <w:r>
+        <w:rPr>
+          <w:b/>
+          <w:color w:val="4A7FC1"/>
+        </w:rPr>
+        <w:t xml:space="preserve">#29  </w:t>
+      </w:r>
+      <w:r>
+        <w:rPr>
+          <w:b/>
+          <w:i w:val="0"/>
+        </w:rPr>
+        <w:t xml:space="preserve">AURORA HAVEN  ·  ISSUE 01  ·  </w:t>
+      </w:r>
+      <w:r>
+        <w:rPr>
+          <w:b/>
+          <w:i w:val="0"/>
+        </w:rPr>
+        <w:t>SYSTEMS &amp; LIFE</w:t>
+      </w:r>
+    </w:p>
+    <w:p>
       <w:pPr>
         <w:pStyle w:val="Heading1"/>
       </w:pPr>
@@ -10208,6 +11313,29 @@
       </w:r>
     </w:p>
     <w:p>
+      <w:r>
+        <w:rPr>
+          <w:b/>
+          <w:color w:val="4A7FC1"/>
+        </w:rPr>
+        <w:t xml:space="preserve">#30  </w:t>
+      </w:r>
+      <w:r>
+        <w:rPr>
+          <w:b/>
+          <w:i w:val="0"/>
+        </w:rPr>
+        <w:t xml:space="preserve">AURORA HAVEN  ·  ISSUE 01  ·  </w:t>
+      </w:r>
+      <w:r>
+        <w:rPr>
+          <w:b/>
+          <w:i w:val="0"/>
+        </w:rPr>
+        <w:t>INVEST</w:t>
+      </w:r>
+    </w:p>
+    <w:p>
       <w:pPr>
         <w:pStyle w:val="Heading1"/>
       </w:pPr>
@@ -10720,6 +11848,29 @@
       </w:r>
     </w:p>
     <w:p>
+      <w:r>
+        <w:rPr>
+          <w:b/>
+          <w:color w:val="4A7FC1"/>
+        </w:rPr>
+        <w:t xml:space="preserve">#28  </w:t>
+      </w:r>
+      <w:r>
+        <w:rPr>
+          <w:b/>
+          <w:i w:val="0"/>
+        </w:rPr>
+        <w:t xml:space="preserve">AURORA HAVEN  ·  ISSUE 01  ·  </w:t>
+      </w:r>
+      <w:r>
+        <w:rPr>
+          <w:b/>
+          <w:i w:val="0"/>
+        </w:rPr>
+        <w:t>THE GUIDE</w:t>
+      </w:r>
+    </w:p>
+    <w:p>
       <w:pPr>
         <w:pStyle w:val="Heading1"/>
       </w:pPr>
@@ -12472,6 +13623,29 @@
       </w:r>
     </w:p>
     <w:p>
+      <w:r>
+        <w:rPr>
+          <w:b/>
+          <w:color w:val="4A7FC1"/>
+        </w:rPr>
+        <w:t xml:space="preserve">#110  </w:t>
+      </w:r>
+      <w:r>
+        <w:rPr>
+          <w:b/>
+          <w:i w:val="0"/>
+        </w:rPr>
+        <w:t xml:space="preserve">AURORA HAVEN  ·  ISSUE 01  ·  </w:t>
+      </w:r>
+      <w:r>
+        <w:rPr>
+          <w:b/>
+          <w:i w:val="0"/>
+        </w:rPr>
+        <w:t>THE GUIDE</w:t>
+      </w:r>
+    </w:p>
+    <w:p>
       <w:pPr>
         <w:pStyle w:val="Heading1"/>
       </w:pPr>
@@ -12663,6 +13837,29 @@
       </w:r>
     </w:p>
     <w:p>
+      <w:r>
+        <w:rPr>
+          <w:b/>
+          <w:color w:val="4A7FC1"/>
+        </w:rPr>
+        <w:t xml:space="preserve">#8  </w:t>
+      </w:r>
+      <w:r>
+        <w:rPr>
+          <w:b/>
+          <w:i w:val="0"/>
+        </w:rPr>
+        <w:t xml:space="preserve">AURORA HAVEN  ·  ISSUE 01  ·  </w:t>
+      </w:r>
+      <w:r>
+        <w:rPr>
+          <w:b/>
+          <w:i w:val="0"/>
+        </w:rPr>
+        <w:t>THE GUIDE</w:t>
+      </w:r>
+    </w:p>
+    <w:p>
       <w:pPr>
         <w:pStyle w:val="Heading1"/>
       </w:pPr>
@@ -13184,7 +14381,7 @@
           <w:b w:val="0"/>
           <w:i w:val="0"/>
         </w:rPr>
-        <w:t>Every picture, plan and diagram in this magazine was made from our own 3D model of Aurora Haven (built with three.js). Text facts about the city come from our city plan and its place cards.</w:t>
+        <w:t>Every picture, plan and diagram in this magazine was made from our own 3D model of Aurora Haven (built with three.js). The cover photo is a render of that model made photo-realistic with an AI image tool (Nano Banana Pro), keeping its layout. Text facts about the city come from our city plan and its place cards.</w:t>
       </w:r>
     </w:p>
     <w:p>
@@ -13217,6 +14414,29 @@
           <w:i w:val="0"/>
         </w:rPr>
         <w:t>36</w:t>
+      </w:r>
+    </w:p>
+    <w:p>
+      <w:r>
+        <w:rPr>
+          <w:b/>
+          <w:color w:val="4A7FC1"/>
+        </w:rPr>
+        <w:t xml:space="preserve">#15  </w:t>
+      </w:r>
+      <w:r>
+        <w:rPr>
+          <w:b/>
+          <w:i w:val="0"/>
+        </w:rPr>
+        <w:t xml:space="preserve">AURORA HAVEN  ·  ISSUE 01  ·  </w:t>
+      </w:r>
+      <w:r>
+        <w:rPr>
+          <w:b/>
+          <w:i w:val="0"/>
+        </w:rPr>
+        <w:t>THE GUIDE</w:t>
       </w:r>
     </w:p>
     <w:p>

</xml_diff>